<commit_message>
docs: v34 editada pelo autor e rodada v35 - inicio do uso de IA em 13/09 e Quadro 20 na largura da pagina
Co-Authored-By: Claude Opus 5.5 <noreply@anthropic.com>
</commit_message>
<xml_diff>
--- a/Transicao_pre-projeto-para-TCC-Completo_TCC_Iluminacao_SP_v34.docx
+++ b/Transicao_pre-projeto-para-TCC-Completo_TCC_Iluminacao_SP_v34.docx
@@ -320,6 +320,7 @@
         <w:rPr>
           <w:lang w:val="pt-BR"/>
         </w:rPr>
+        <w:lastRenderedPageBreak/>
         <w:t>BRUNO BONAVIGO DACAL – N309EC4</w:t>
       </w:r>
     </w:p>
@@ -594,6 +595,7 @@
           <w:bCs/>
           <w:lang w:val="pt-BR"/>
         </w:rPr>
+        <w:lastRenderedPageBreak/>
         <w:t>RESUMO</w:t>
       </w:r>
     </w:p>
@@ -665,6 +667,7 @@
           <w:bCs/>
           <w:lang w:val="pt-BR"/>
         </w:rPr>
+        <w:lastRenderedPageBreak/>
         <w:t>ABSTRACT</w:t>
       </w:r>
     </w:p>
@@ -721,6 +724,7 @@
           <w:bCs/>
           <w:lang w:val="pt-BR"/>
         </w:rPr>
+        <w:lastRenderedPageBreak/>
         <w:t>LISTA DE QUADROS</w:t>
       </w:r>
     </w:p>
@@ -1149,13 +1153,7 @@
         <w:rPr>
           <w:lang w:val="pt-BR"/>
         </w:rPr>
-        <w:t xml:space="preserve">Quadro 19</w:t>
-      </w:r>
-      <w:r>
-        <w:rPr>
-          <w:lang w:val="pt-BR"/>
-        </w:rPr>
-        <w:t xml:space="preserve"> – Matriz de emprego técnico de inteligência artificial</w:t>
+        <w:t>Quadro 19 – Matriz de emprego técnico de inteligência artificial</w:t>
       </w:r>
       <w:r>
         <w:rPr>
@@ -1179,13 +1177,7 @@
         <w:rPr>
           <w:lang w:val="pt-BR"/>
         </w:rPr>
-        <w:t xml:space="preserve">Quadro 20</w:t>
-      </w:r>
-      <w:r>
-        <w:rPr>
-          <w:lang w:val="pt-BR"/>
-        </w:rPr>
-        <w:t xml:space="preserve"> – Programas, dados e versões que reproduzem os resultados</w:t>
+        <w:t>Quadro 20 – Programas, dados e versões que reproduzem os resultados</w:t>
       </w:r>
     </w:p>
     <w:p>
@@ -1217,6 +1209,7 @@
           <w:bCs/>
           <w:lang w:val="pt-BR"/>
         </w:rPr>
+        <w:lastRenderedPageBreak/>
         <w:t>LISTA DE FIGURAS</w:t>
       </w:r>
     </w:p>
@@ -1302,6 +1295,9 @@
       <w:pPr>
         <w:spacing w:after="480"/>
         <w:jc w:val="center"/>
+        <w:rPr>
+          <w:lang w:val="pt-BR"/>
+        </w:rPr>
       </w:pPr>
       <w:r>
         <w:rPr>
@@ -1309,7 +1305,8 @@
           <w:bCs/>
           <w:lang w:val="pt-BR"/>
         </w:rPr>
-        <w:t xml:space="preserve">LISTA DE TABELAS</w:t>
+        <w:lastRenderedPageBreak/>
+        <w:t>LISTA DE TABELAS</w:t>
       </w:r>
     </w:p>
     <w:p>
@@ -1318,12 +1315,15 @@
           <w:tab w:val="right" w:leader="dot" w:pos="9071"/>
         </w:tabs>
         <w:spacing w:after="100"/>
-      </w:pPr>
-      <w:r>
-        <w:rPr>
-          <w:lang w:val="pt-BR"/>
-        </w:rPr>
-        <w:t xml:space="preserve">Tabela 1 – Envelope esperado e aderência por cenário</w:t>
+        <w:rPr>
+          <w:lang w:val="pt-BR"/>
+        </w:rPr>
+      </w:pPr>
+      <w:r>
+        <w:rPr>
+          <w:lang w:val="pt-BR"/>
+        </w:rPr>
+        <w:t>Tabela 1 – Envelope esperado e aderência por cenário</w:t>
       </w:r>
     </w:p>
     <w:p>
@@ -1332,12 +1332,15 @@
           <w:tab w:val="right" w:leader="dot" w:pos="9071"/>
         </w:tabs>
         <w:spacing w:after="100"/>
-      </w:pPr>
-      <w:r>
-        <w:rPr>
-          <w:lang w:val="pt-BR"/>
-        </w:rPr>
-        <w:t xml:space="preserve">Tabela 2 – Energia estimada na luminária de referência e aderência ao envelope, por regime</w:t>
+        <w:rPr>
+          <w:lang w:val="pt-BR"/>
+        </w:rPr>
+      </w:pPr>
+      <w:r>
+        <w:rPr>
+          <w:lang w:val="pt-BR"/>
+        </w:rPr>
+        <w:t>Tabela 2 – Energia estimada na luminária de referência e aderência ao envelope, por regime</w:t>
       </w:r>
     </w:p>
     <w:p>
@@ -1346,12 +1349,15 @@
           <w:tab w:val="right" w:leader="dot" w:pos="9071"/>
         </w:tabs>
         <w:spacing w:after="100"/>
-      </w:pPr>
-      <w:r>
-        <w:rPr>
-          <w:lang w:val="pt-BR"/>
-        </w:rPr>
-        <w:t xml:space="preserve">Tabela 3 – Retirada e substituição dos componentes de inteligência artificial no sistema</w:t>
+        <w:rPr>
+          <w:lang w:val="pt-BR"/>
+        </w:rPr>
+      </w:pPr>
+      <w:r>
+        <w:rPr>
+          <w:lang w:val="pt-BR"/>
+        </w:rPr>
+        <w:t>Tabela 3 – Retirada e substituição dos componentes de inteligência artificial no sistema</w:t>
       </w:r>
     </w:p>
     <w:p>
@@ -1360,22 +1366,23 @@
           <w:tab w:val="right" w:leader="dot" w:pos="9071"/>
         </w:tabs>
         <w:spacing w:after="100"/>
-      </w:pPr>
-      <w:r>
-        <w:rPr>
-          <w:lang w:val="pt-BR"/>
-        </w:rPr>
-        <w:t xml:space="preserve">Tabela 4 – Previsão com série de 15 min e com a mesma série somada por hora (Zurique, período noturno)</w:t>
-      </w:r>
-    </w:p>
-    <w:p>
-      <w:pPr/>
-      <w:r>
-        <w:rPr>
-          <w:lang w:val="pt-BR"/>
-        </w:rPr>
-        <w:t xml:space="preserve"/>
-      </w:r>
+        <w:rPr>
+          <w:lang w:val="pt-BR"/>
+        </w:rPr>
+      </w:pPr>
+      <w:r>
+        <w:rPr>
+          <w:lang w:val="pt-BR"/>
+        </w:rPr>
+        <w:t>Tabela 4 – Previsão com série de 15 min e com a mesma série somada por hora (Zurique, período noturno)</w:t>
+      </w:r>
+    </w:p>
+    <w:p>
+      <w:pPr>
+        <w:rPr>
+          <w:lang w:val="pt-BR"/>
+        </w:rPr>
+      </w:pPr>
     </w:p>
     <w:p>
       <w:pPr>
@@ -7098,6 +7105,7 @@
         <w:rPr>
           <w:lang w:val="pt-BR"/>
         </w:rPr>
+        <w:lastRenderedPageBreak/>
         <w:t>1 INTRODUÇÃO</w:t>
       </w:r>
       <w:bookmarkEnd w:id="0"/>
@@ -7246,6 +7254,7 @@
         <w:rPr>
           <w:lang w:val="pt-BR"/>
         </w:rPr>
+        <w:lastRenderedPageBreak/>
         <w:t>O estágio atual dessas iniciativas em São Paulo tem um traço que interessa diretamente a este trabalho: a instrumentação da cidade deixou de ser proposta e passou a ser infraestrutura instalada e contratada. Não se trata, portanto, de propor que a cidade passe a coletar dados ou a controlar remotamente suas luminárias — ambas as coisas já estão contratadas. Trata-se de propor um uso para o que já existe.</w:t>
       </w:r>
     </w:p>
@@ -7366,6 +7375,7 @@
         <w:rPr>
           <w:lang w:val="pt-BR"/>
         </w:rPr>
+        <w:lastRenderedPageBreak/>
         <w:t>incide sobre um fenômeno mensurável, e não sobre o julgamento de qual seria o nível correto de iluminação — julgamento que não dispõe de referência externa e cuja rotulação pelos próprios autores tornaria a avaliação circular.</w:t>
       </w:r>
     </w:p>
@@ -7480,6 +7490,7 @@
         <w:rPr>
           <w:lang w:val="pt-BR"/>
         </w:rPr>
+        <w:lastRenderedPageBreak/>
         <w:t>A iluminação pública não se adapta às variações das condições e da movimentação urbana. Operada em fluxo pleno durante toda a noite, oferece iluminação desnecessariamente elevada em situações de menor demanda. Atenuada por horário fixo, a forma mais simples de reduzir o consumo, pode oferecer iluminação insuficiente quando a via continua ocupada ou quando ocorre um evento que exigiria mais luz.</w:t>
       </w:r>
     </w:p>
@@ -7618,6 +7629,7 @@
         <w:rPr>
           <w:lang w:val="pt-BR"/>
         </w:rPr>
+        <w:lastRenderedPageBreak/>
         <w:t>intensidade de um nó de iluminação pública de forma consistente com as condições observadas, dentro de limite de latência especificado, e sem violar em nenhuma decisão os limites estabelecidos pela ABNT NBR 5101.</w:t>
       </w:r>
     </w:p>
@@ -7815,6 +7827,7 @@
         <w:rPr>
           <w:lang w:val="pt-BR"/>
         </w:rPr>
+        <w:lastRenderedPageBreak/>
         <w:t>Estimar o consumo de energia sob o regime adaptativo — no nó de bancada, a partir da trajetória de ciclo de trabalho registrada, e em luminária de referência derivada dos parâmetros contratuais do parque municipal, a partir do registro de decisões — e compará-lo ao do regime de fluxo pleno constante e ao de um regime de atenuação por horário fixo, sobre a mesma suíte de cenários.</w:t>
       </w:r>
     </w:p>
@@ -7918,6 +7931,7 @@
         <w:rPr>
           <w:lang w:val="pt-BR"/>
         </w:rPr>
+        <w:lastRenderedPageBreak/>
         <w:t>conflito, e precisam ser compostas numa saída única. O trabalho implementa essa composição por inferência nebulosa e a confronta com uma tabela de decisão com as mesmas regras (4.6).</w:t>
       </w:r>
     </w:p>
@@ -7999,6 +8013,7 @@
         <w:rPr>
           <w:lang w:val="pt-BR"/>
         </w:rPr>
+        <w:lastRenderedPageBreak/>
         <w:t>Quanto à forma de execução, o trabalho combina pesquisa documental sobre a infraestrutura instalada e sobre os dados abertos municipais, desenvolvimento de protótipo e experimentação em bancada, nos termos de 3.1. O método está descrito no Capítulo 3, e a documentação de engenharia de software que orienta a implementação e o banco de dados, ao final dele, em 3.12 e 3.13.</w:t>
       </w:r>
     </w:p>
@@ -8016,6 +8031,7 @@
         <w:rPr>
           <w:lang w:val="pt-BR"/>
         </w:rPr>
+        <w:lastRenderedPageBreak/>
         <w:t>2 REVISÃO BIBLIOGRÁFICA</w:t>
       </w:r>
       <w:bookmarkEnd w:id="13"/>
@@ -8120,6 +8136,7 @@
         <w:rPr>
           <w:lang w:val="pt-BR"/>
         </w:rPr>
+        <w:lastRenderedPageBreak/>
         <w:t>de publicação, e sim pela vigência, e a edição citada é a que permanece em vigor. Dela não se extrai afirmação sobre o estado da arte da técnica. Fica também fora do recorte o estudo de Shikakura, Morikawa e Nakamura (2003), empregado em 3.9 por ser a fonte localizada pelos autores com valor medido de limiar de percepção de variação de iluminância; dele se extrai apenas esse valor. Normas e especificações técnicas — da ABNT, da ISO/IEC, da ANSI, da OASIS e do consórcio TALQ — e a folha de dados do fabricante do microcontrolador comparecem como fonte do que especificam; os documentos da associação setorial de concessionárias, como fonte de dados do setor; e o relato jornalístico de Perry (2020), apenas como registro do caso descrito em 3.10. De nenhuma dessas fontes se extrai afirmação de desempenho.</w:t>
       </w:r>
     </w:p>
@@ -8201,6 +8218,7 @@
         <w:rPr>
           <w:lang w:val="pt-BR"/>
         </w:rPr>
+        <w:lastRenderedPageBreak/>
         <w:t>Anthony Jnr (2024) conduz revisão sistemática sobre o emprego de interfaces de programação de aplicações na interoperabilidade entre sistemas digitais municipais e aponta os sistemas isolados, sem padronização de interfaces, como obstáculo à integração, e a especificação da interface como o instrumento pelo qual esse isolamento se resolve.</w:t>
       </w:r>
     </w:p>
@@ -8217,19 +8235,7 @@
         <w:rPr>
           <w:lang w:val="pt-BR"/>
         </w:rPr>
-        <w:t xml:space="preserve">Um caso brasileiro recente ilustra o mesmo ponto em escala menor e sob condições favoráveis. Em janeiro de 2026, a Universidade Estadual de Campinas recebeu os dispositivos de telegestão de um projeto que instala 2.615 sensores junto a luminárias de estado sólido em seu campus, executado por operadora de telecomunicações com financiamento vinculado ao Programa Nacional de Iluminação Pública Eficiente (RIBEIRO, 2026). A descrição oficial do sistema informa que a plataforma permite ajustar níveis de iluminação conforme horários, condições ambientais ou demandas específicas, além de identificar falhas em tempo real </w:t>
-      </w:r>
-      <w:r>
-        <w:rPr>
-          <w:lang w:val="pt-BR"/>
-        </w:rPr>
-        <w:t xml:space="preserve">(UNIVERSIDADE ESTADUAL DE CAMPINAS, 2026)</w:t>
-      </w:r>
-      <w:r>
-        <w:rPr>
-          <w:lang w:val="pt-BR"/>
-        </w:rPr>
-        <w:t xml:space="preserve">.</w:t>
+        <w:t>Um caso brasileiro recente ilustra o mesmo ponto em escala menor e sob condições favoráveis. Em janeiro de 2026, a Universidade Estadual de Campinas recebeu os dispositivos de telegestão de um projeto que instala 2.615 sensores junto a luminárias de estado sólido em seu campus, executado por operadora de telecomunicações com financiamento vinculado ao Programa Nacional de Iluminação Pública Eficiente (RIBEIRO, 2026). A descrição oficial do sistema informa que a plataforma permite ajustar níveis de iluminação conforme horários, condições ambientais ou demandas específicas, além de identificar falhas em tempo real (UNIVERSIDADE ESTADUAL DE CAMPINAS, 2026).</w:t>
       </w:r>
     </w:p>
     <w:p>
@@ -8277,6 +8283,7 @@
         <w:rPr>
           <w:lang w:val="pt-BR"/>
         </w:rPr>
+        <w:lastRenderedPageBreak/>
         <w:t>2.3 A infraestrutura instalada no município de São Paulo</w:t>
       </w:r>
       <w:bookmarkEnd w:id="16"/>
@@ -8729,15 +8736,7 @@
                 <w:szCs w:val="20"/>
                 <w:lang w:val="pt-BR"/>
               </w:rPr>
-              <w:t xml:space="preserve">Destina-se à segurança pública. O termo de referência prevê integração com outros sistemas municipais, entre eles o de iluminação pública, </w:t>
-            </w:r>
-            <w:r>
-              <w:rPr>
-                <w:sz w:val="20"/>
-                <w:szCs w:val="20"/>
-                <w:lang w:val="pt-BR"/>
-              </w:rPr>
-              <w:t xml:space="preserve">mas não há registro público de que ela opere, e o termo trata o acesso por interface de programação caso a caso</w:t>
+              <w:t>Destina-se à segurança pública. O termo de referência prevê integração com outros sistemas municipais, entre eles o de iluminação pública, mas não há registro público de que ela opere, e o termo trata o acesso por interface de programação caso a caso</w:t>
             </w:r>
           </w:p>
         </w:tc>
@@ -8809,6 +8808,7 @@
                 <w:szCs w:val="20"/>
                 <w:lang w:val="pt-BR"/>
               </w:rPr>
+              <w:lastRenderedPageBreak/>
               <w:t>substituindo o tempo presumido pela medição</w:t>
             </w:r>
           </w:p>
@@ -8835,6 +8835,7 @@
                 <w:szCs w:val="20"/>
                 <w:lang w:val="pt-BR"/>
               </w:rPr>
+              <w:lastRenderedPageBreak/>
               <w:t>Nenhum ato vincula a operação da iluminação a dados de outras plataformas municipais</w:t>
             </w:r>
           </w:p>
@@ -9007,6 +9008,7 @@
         <w:rPr>
           <w:lang w:val="pt-BR"/>
         </w:rPr>
+        <w:lastRenderedPageBreak/>
         <w:t>já é produzido — o que desloca a integração do terreno do desenvolvimento para o da especificação de interface.</w:t>
       </w:r>
     </w:p>
@@ -9103,6 +9105,7 @@
         <w:rPr>
           <w:lang w:val="pt-BR"/>
         </w:rPr>
+        <w:lastRenderedPageBreak/>
         <w:t>2.4 Internet das Coisas e nós embarcados</w:t>
       </w:r>
       <w:bookmarkEnd w:id="17"/>
@@ -9184,6 +9187,7 @@
         <w:rPr>
           <w:lang w:val="pt-BR"/>
         </w:rPr>
+        <w:lastRenderedPageBreak/>
         <w:t>2.5 Requisitos normativos</w:t>
       </w:r>
       <w:bookmarkEnd w:id="18"/>
@@ -9271,6 +9275,7 @@
         <w:rPr>
           <w:lang w:val="pt-BR"/>
         </w:rPr>
+        <w:lastRenderedPageBreak/>
         <w:t>iluminação adaptativa. O emprego de dados do ambiente urbano como entrada da decisão segue, portanto, essa recomendação.</w:t>
       </w:r>
     </w:p>
@@ -9358,6 +9363,7 @@
         <w:rPr>
           <w:lang w:val="pt-BR"/>
         </w:rPr>
+        <w:lastRenderedPageBreak/>
         <w:t>representação sintetiza controladores a partir de conhecimento expresso em linguagem natural, dispensando modelo matemático do processo controlado. Estas duas obras comparecem como atribuição de origem, nos termos da subseção 2.1.</w:t>
       </w:r>
     </w:p>
@@ -9428,6 +9434,7 @@
         <w:rPr>
           <w:lang w:val="pt-BR"/>
         </w:rPr>
+        <w:lastRenderedPageBreak/>
         <w:t>de ser produzidos pelos próprios autores, o que introduziria circularidade: o sistema aprenderia a reproduzir o julgamento de quem o avalia. A inferência nebulosa, derivando suas regras da norma técnica e de critérios de projeto declarados, mantém a base de decisão auditável e livre dessa circularidade.</w:t>
       </w:r>
     </w:p>
@@ -9493,25 +9500,14 @@
         <w:rPr>
           <w:lang w:val="pt-BR"/>
         </w:rPr>
-        <w:t xml:space="preserve">A tarefa é de regressão sobre dados tabulares: a grandeza a prever é o nível de movimentação na próxima janela, e os preditores são as contagens observadas em janelas anteriores somadas a atributos de calendário: hora do dia, dia da semana e feriado. Para esse formato de dado, Grinsztajn, Oyallon e Varoquaux (2022) demonstram, </w:t>
-      </w:r>
-      <w:r>
-        <w:rPr>
-          <w:lang w:val="pt-BR"/>
-        </w:rPr>
-        <w:t xml:space="preserve">em avaliação sistemática sobre 45 conjuntos, que modelos baseados em árvores de decisão — como o reforço de gradiente e as florestas aleatórias — continuam superando arquiteturas de aprendizado profundo em dados de porte médio,</w:t>
-      </w:r>
-      <w:r>
-        <w:rPr>
-          <w:lang w:val="pt-BR"/>
-        </w:rPr>
-        <w:t xml:space="preserve"> e o fazem com custo computacional e esforço de ajuste substancialmente menores. Adota-se, por essa razão, o reforço de gradiente na formulação de Chen e Guestrin (2016), e não uma rede neural recorrente. A escolha é de adequação ao dado, não de conveniência, e está respaldada em fonte revisada por pares. A referência estabelece a vantagem dos modelos de árvores sobre </w:t>
-      </w:r>
-      <w:r>
-        <w:rPr>
-          <w:lang w:val="pt-BR"/>
-        </w:rPr>
-        <w:t>as redes neurais, mas não ordena os modelos de árvores entre si; essa comparação foi feita sobre os próprios dados do trabalho (3.6 e 4.1).</w:t>
+        <w:t xml:space="preserve">A tarefa é de regressão sobre dados tabulares: a grandeza a prever é o nível de movimentação na próxima janela, e os preditores são as contagens observadas em janelas anteriores somadas a atributos de calendário: hora do dia, dia da semana e feriado. Para esse formato de dado, Grinsztajn, Oyallon e Varoquaux (2022) demonstram, em avaliação sistemática sobre 45 conjuntos, que modelos baseados em árvores de decisão — como o reforço de gradiente e as florestas aleatórias — continuam superando arquiteturas de aprendizado profundo em dados de porte médio, e o fazem com custo computacional e esforço de ajuste substancialmente menores. Adota-se, por essa razão, o reforço de gradiente na formulação de Chen e Guestrin (2016), e não uma rede neural recorrente. A escolha é de adequação ao dado, não de conveniência, e está respaldada em fonte revisada por pares. A referência estabelece a vantagem dos modelos de árvores sobre as redes neurais, mas não ordena os </w:t>
+      </w:r>
+      <w:r>
+        <w:rPr>
+          <w:lang w:val="pt-BR"/>
+        </w:rPr>
+        <w:lastRenderedPageBreak/>
+        <w:t>modelos de árvores entre si; essa comparação foi feita sobre os próprios dados do trabalho (3.6 e 4.1).</w:t>
       </w:r>
     </w:p>
     <w:p>
@@ -9614,6 +9610,7 @@
         <w:rPr>
           <w:lang w:val="pt-BR"/>
         </w:rPr>
+        <w:lastRenderedPageBreak/>
         <w:t>da iluminação urbana como problema de otimização distribuída de restrições e o resolve por algoritmos executados em rede de luminárias, com cada ponto negociando seu nível com os vizinhos a partir de variáveis ambientais. A proximidade de finalidade é grande e a diferença é de premissa. Naquele trabalho, cada poste dispõe de sensoriamento local, e a avaliação é conduzida em ambiente simulado: a camada de percepção é uma infraestrutura a implantar. Aqui, a percepção é uma infraestrutura já contratada e em operação, produzida por outro sistema municipal para outra finalidade, e o problema desloca-se do sensoriamento para a integração e a decisão.</w:t>
       </w:r>
     </w:p>
@@ -9638,12 +9635,15 @@
         <w:spacing w:after="120" w:line="360" w:lineRule="auto"/>
         <w:ind w:firstLine="709"/>
         <w:jc w:val="both"/>
-      </w:pPr>
-      <w:r>
-        <w:rPr>
-          <w:lang w:val="pt-BR"/>
-        </w:rPr>
-        <w:t xml:space="preserve">Em escala de implantação, Pasolini et al. (2024) mediram, por até um ano, o consumo de parques reais em Tan An, no Vietnã, com 3.815 luminárias, e em Meda e Cesena, na Itália. Ali, a norma italiana UNI 11248 admite dois modos: no adaptativo ao tráfego, a classe desce um ou dois degraus quando a contagem de veículos fica abaixo de limiares fixados sobre o volume nominal da via em duas amostras consecutivas, e sobe na primeira amostra que pede classe maior; no modo completo, a atenuação é contínua entre as classes e considera também a luminância medida na via e as condições meteorológicas. As regras são fixas e de origem normativa, sem inferência nebulosa nem aprendizado de máquina, e a decisão é tomada junto aos postes, a partir de sensores instalados para esse fim. É a confirmação de campo de que a comutação entre classes por regras simples funciona em escala, convergente com o resultado de 4.6, em que a tabela em degraus substitui a inferência nebulosa. O que separa esta proposta é a fonte do dado, que vem de plataforma municipal já existente, e não de sensor instalado para a iluminação, e o objeto, que é o pedestre, e não o veículo.</w:t>
+        <w:rPr>
+          <w:lang w:val="pt-BR"/>
+        </w:rPr>
+      </w:pPr>
+      <w:r>
+        <w:rPr>
+          <w:lang w:val="pt-BR"/>
+        </w:rPr>
+        <w:t>Em escala de implantação, Pasolini et al. (2024) mediram, por até um ano, o consumo de parques reais em Tan An, no Vietnã, com 3.815 luminárias, e em Meda e Cesena, na Itália. Ali, a norma italiana UNI 11248 admite dois modos: no adaptativo ao tráfego, a classe desce um ou dois degraus quando a contagem de veículos fica abaixo de limiares fixados sobre o volume nominal da via em duas amostras consecutivas, e sobe na primeira amostra que pede classe maior; no modo completo, a atenuação é contínua entre as classes e considera também a luminância medida na via e as condições meteorológicas. As regras são fixas e de origem normativa, sem inferência nebulosa nem aprendizado de máquina, e a decisão é tomada junto aos postes, a partir de sensores instalados para esse fim. É a confirmação de campo de que a comutação entre classes por regras simples funciona em escala, convergente com o resultado de 4.6, em que a tabela em degraus substitui a inferência nebulosa. O que separa esta proposta é a fonte do dado, que vem de plataforma municipal já existente, e não de sensor instalado para a iluminação, e o objeto, que é o pedestre, e não o veículo.</w:t>
       </w:r>
     </w:p>
     <w:p>
@@ -9659,19 +9659,8 @@
         <w:rPr>
           <w:lang w:val="pt-BR"/>
         </w:rPr>
-        <w:t xml:space="preserve">No plano das implantações, a referência é a rua Stratumseind, em Eindhoven, onde dados de câmeras e de sensores acústicos </w:t>
-      </w:r>
-      <w:r>
-        <w:rPr>
-          <w:lang w:val="pt-BR"/>
-        </w:rPr>
-        <w:t xml:space="preserve">alimentaram perfis que acionavam cenários</w:t>
-      </w:r>
-      <w:r>
-        <w:rPr>
-          <w:lang w:val="pt-BR"/>
-        </w:rPr>
-        <w:t xml:space="preserve"> dinâmicos de iluminação (GALIC; GELLERT, 2021). Este último é o precedente mais próximo de um laço fechado entre plataforma urbana e iluminação, e três diferenças o separam desta proposta: sua finalidade é comportamental, e não fotométrica; a decisão não é confrontada com classe de iluminação alguma; e a literatura revisada por pares que o documenta é de proteção de dados, e não de arquitetura de sistemas — é precisamente a ausência de garantias que ela critica.</w:t>
+        <w:lastRenderedPageBreak/>
+        <w:t>No plano das implantações, a referência é a rua Stratumseind, em Eindhoven, onde dados de câmeras e de sensores acústicos alimentaram perfis que acionavam cenários dinâmicos de iluminação (GALIC; GELLERT, 2021). Este último é o precedente mais próximo de um laço fechado entre plataforma urbana e iluminação, e três diferenças o separam desta proposta: sua finalidade é comportamental, e não fotométrica; a decisão não é confrontada com classe de iluminação alguma; e a literatura revisada por pares que o documenta é de proteção de dados, e não de arquitetura de sistemas — é precisamente a ausência de garantias que ela critica.</w:t>
       </w:r>
     </w:p>
     <w:p>
@@ -9784,7 +9773,14 @@
         <w:rPr>
           <w:lang w:val="pt-BR"/>
         </w:rPr>
-        <w:t>A quarta, que decorre das anteriores, delimita o objeto: a camada de decisão que recebe a descrição do ambiente urbano, compõe suas variáveis e produz um nível de iluminação, sujeita a restrições normativas verificadas antes da atuação. É esse mecanismo, e a interface que o integraria à infraestrutura existente, que o trabalho constrói e avalia.</w:t>
+        <w:t xml:space="preserve">A quarta, que decorre das anteriores, delimita o objeto: a camada de decisão que recebe a descrição do ambiente urbano, compõe suas variáveis e produz um nível de iluminação, sujeita a restrições normativas verificadas antes da atuação. É esse </w:t>
+      </w:r>
+      <w:r>
+        <w:rPr>
+          <w:lang w:val="pt-BR"/>
+        </w:rPr>
+        <w:lastRenderedPageBreak/>
+        <w:t>mecanismo, e a interface que o integraria à infraestrutura existente, que o trabalho constrói e avalia.</w:t>
       </w:r>
     </w:p>
     <w:p>
@@ -9800,13 +9796,7 @@
         <w:rPr>
           <w:lang w:val="pt-BR"/>
         </w:rPr>
-        <w:t xml:space="preserve">Convém declarar, com precisão, a natureza da contribuição pretendida. Ela é arquitetural e integrativa, e não algorítmica. Nenhum componente isolado deste trabalho é inédito: a inferência nebulosa é técnica de mais de cinquenta anos, a dimerização por tráfego está publicada e implantada, e o transporte de mensagens é padrão de mercado. O que a revisão não localizou foi o arranjo: a camada de decisão que consome a saída já existente e já custeada de uma plataforma municipal concebida para outra finalidade, seguida de um componente de software separável que verifica cada nível decidido contra a norma técnica antes de permitir a atuação. Os trabalhos que decidem o nível pressupõem sensoriamento próprio a implantar; os que consomem dado urbano de terceiros param no planejamento; os que fecham o laço perseguem finalidade comportamental e não confrontam a decisão com classe de iluminação alguma; e os que tratam da infraestrutura instalada ocupam-se de sua </w:t>
-      </w:r>
-      <w:r>
-        <w:rPr>
-          <w:lang w:val="pt-BR"/>
-        </w:rPr>
-        <w:t>confiabilidade. A contribuição está na composição, e é nessa medida que deve ser avaliada.</w:t>
+        <w:t>Convém declarar, com precisão, a natureza da contribuição pretendida. Ela é arquitetural e integrativa, e não algorítmica. Nenhum componente isolado deste trabalho é inédito: a inferência nebulosa é técnica de mais de cinquenta anos, a dimerização por tráfego está publicada e implantada, e o transporte de mensagens é padrão de mercado. O que a revisão não localizou foi o arranjo: a camada de decisão que consome a saída já existente e já custeada de uma plataforma municipal concebida para outra finalidade, seguida de um componente de software separável que verifica cada nível decidido contra a norma técnica antes de permitir a atuação. Os trabalhos que decidem o nível pressupõem sensoriamento próprio a implantar; os que consomem dado urbano de terceiros param no planejamento; os que fecham o laço perseguem finalidade comportamental e não confrontam a decisão com classe de iluminação alguma; e os que tratam da infraestrutura instalada ocupam-se de sua confiabilidade. A contribuição está na composição, e é nessa medida que deve ser avaliada.</w:t>
       </w:r>
     </w:p>
     <w:p>
@@ -9911,7 +9901,14 @@
         <w:rPr>
           <w:lang w:val="pt-BR"/>
         </w:rPr>
-        <w:t>A antecipação da demanda por modelo treinado sobre série histórica permite iniciar a atenuação dentro do limite de taxa fixado pela norma, reduzindo a fração da janela de baixa demanda consumida em transição quando comparada ao acionamento puramente reativo.</w:t>
+        <w:t xml:space="preserve">A antecipação da demanda por modelo treinado sobre série histórica permite iniciar a atenuação dentro do limite de taxa fixado pela norma, </w:t>
+      </w:r>
+      <w:r>
+        <w:rPr>
+          <w:lang w:val="pt-BR"/>
+        </w:rPr>
+        <w:lastRenderedPageBreak/>
+        <w:t>reduzindo a fração da janela de baixa demanda consumida em transição quando comparada ao acionamento puramente reativo.</w:t>
       </w:r>
     </w:p>
     <w:p>
@@ -9928,6 +9925,7 @@
         <w:rPr>
           <w:lang w:val="pt-BR"/>
         </w:rPr>
+        <w:lastRenderedPageBreak/>
         <w:t>3 METODOLOGIA</w:t>
       </w:r>
       <w:bookmarkEnd w:id="24"/>
@@ -10111,6 +10109,7 @@
         <w:rPr>
           <w:lang w:val="pt-BR"/>
         </w:rPr>
+        <w:lastRenderedPageBreak/>
         <w:t>Camada de verificação normativa. Interposta entre a decisão e a atuação, confronta o nível pretendido com o piso extraído da ABNT NBR 5101 e corrige a decisão antes de emiti-la, registrando a correção; a taxa máxima de decréscimo segue com o comando e é aplicada pelo nó (3.7).</w:t>
       </w:r>
     </w:p>
@@ -10211,6 +10210,7 @@
         <w:rPr>
           <w:lang w:val="pt-BR"/>
         </w:rPr>
+        <w:lastRenderedPageBreak/>
         <w:t>A terceira é de governança. Anthony Jnr (2024) aponta os sistemas isolados como obstáculo à integração e identifica na especificação da interface o instrumento pelo qual esse isolamento se resolve. Alojar a lógica de iluminação no contrato de uma plataforma de segurança produziria mais um sistema desse tipo. Acresce que a camada de verificação normativa, para permanecer auditável, precisa ser inspecionável por quem responde pela iluminação pública, condição que não se satisfaz dentro de sistema operado por terceiro sob outro contrato.</w:t>
       </w:r>
     </w:p>
@@ -11015,6 +11015,7 @@
                 <w:szCs w:val="20"/>
                 <w:lang w:val="pt-BR"/>
               </w:rPr>
+              <w:lastRenderedPageBreak/>
               <w:t>Segmento de fita de LED e módulo de acionamento</w:t>
             </w:r>
           </w:p>
@@ -11439,6 +11440,7 @@
         <w:rPr>
           <w:lang w:val="pt-BR"/>
         </w:rPr>
+        <w:lastRenderedPageBreak/>
         <w:t>tabela de calibração levantada por medição, com interpolação linear entre pontos medidos; no parque, por controlador em tomada normalizada acionando o driver por controle analógico de 0 V a 10 V, com a iluminância resultante conhecida da certificação do produto. Mesma entrada, atuador diferente. É por isso que o que a bancada estabelece a respeito da decisão transpõe-se ao parque sem depender de que o equipamento seja o mesmo.</w:t>
       </w:r>
     </w:p>
@@ -12657,18 +12659,27 @@
             </w:tcMar>
           </w:tcPr>
           <w:p>
-            <w:proofErr w:type="spellStart"/>
-            <w:proofErr w:type="spellEnd"/>
-            <w:proofErr w:type="spellStart"/>
-            <w:proofErr w:type="spellEnd"/>
-            <w:proofErr w:type="spellStart"/>
-            <w:proofErr w:type="spellEnd"/>
-            <w:r>
-              <w:rPr>
-                <w:sz w:val="20"/>
-                <w:szCs w:val="20"/>
-              </w:rPr>
-              <w:t xml:space="preserve">Certificação compulsória instituída em 2017, com prazos de adequação a partir de 2019, e consolidada em 2022</w:t>
+            <w:pPr>
+              <w:rPr>
+                <w:lang w:val="pt-BR"/>
+              </w:rPr>
+            </w:pPr>
+            <w:r>
+              <w:rPr>
+                <w:sz w:val="20"/>
+                <w:szCs w:val="20"/>
+                <w:lang w:val="pt-BR"/>
+              </w:rPr>
+              <w:t xml:space="preserve">Certificação compulsória instituída em 2017, com prazos de adequação a partir </w:t>
+            </w:r>
+            <w:r>
+              <w:rPr>
+                <w:sz w:val="20"/>
+                <w:szCs w:val="20"/>
+                <w:lang w:val="pt-BR"/>
+              </w:rPr>
+              <w:lastRenderedPageBreak/>
+              <w:t>de 2019, e consolidada em 2022</w:t>
             </w:r>
           </w:p>
         </w:tc>
@@ -12696,6 +12707,7 @@
                 <w:szCs w:val="20"/>
                 <w:lang w:val="pt-BR"/>
               </w:rPr>
+              <w:lastRenderedPageBreak/>
               <w:t>Verificação da execução e diagnóstico do ativo</w:t>
             </w:r>
           </w:p>
@@ -12793,23 +12805,7 @@
           <w:szCs w:val="20"/>
           <w:lang w:val="pt-BR"/>
         </w:rPr>
-        <w:t xml:space="preserve">Fonte: Elaborado pelos autores (2026) a partir de São Paulo (2015, 2022), Associação Brasileira de Normas Técnicas (2016), American National Standards Institute (2013) e Instituto Nacional de Metrologia, </w:t>
-      </w:r>
-      <w:r>
-        <w:rPr>
-          <w:sz w:val="20"/>
-          <w:szCs w:val="20"/>
-          <w:lang w:val="pt-BR"/>
-        </w:rPr>
-        <w:t xml:space="preserve">Qualidade e Tecnologia (2017, 2022a, 2022b)</w:t>
-      </w:r>
-      <w:r>
-        <w:rPr>
-          <w:sz w:val="20"/>
-          <w:szCs w:val="20"/>
-          <w:lang w:val="pt-BR"/>
-        </w:rPr>
-        <w:t xml:space="preserve">.</w:t>
+        <w:t>Fonte: Elaborado pelos autores (2026) a partir de São Paulo (2015, 2022), Associação Brasileira de Normas Técnicas (2016), American National Standards Institute (2013) e Instituto Nacional de Metrologia, Qualidade e Tecnologia (2017, 2022a, 2022b).</w:t>
       </w:r>
     </w:p>
     <w:p>
@@ -12841,19 +12837,7 @@
         <w:rPr>
           <w:lang w:val="pt-BR"/>
         </w:rPr>
-        <w:t xml:space="preserve">Duas delimitações fecham a subseção. A primeira é que a correspondência aqui estabelecida é funcional e topológica — um serviço central decide, o ponto de luz executa e reporta —, e não de escala, de potência, de geometria fotométrica, de instrumentação nem de enlace; essas divergências figuram entre as limitações e nenhuma delas incide sobre a camada avaliada. A segunda é que os autores não tiveram acesso ao equipamento efetivamente instalado pela concessionária: a cadeia descrita apoia-se no que o contrato exige desse equipamento e no que a normalização brasileira impõe a ele — a tomada da luminária, de sete contatos no padrão ANSI C136.41 (AMERICAN NATIONAL STANDARDS INSTITUTE, 2013), que acrescenta contatos de dimerização à tomada do relé fotocontrolador normalizada pela ABNT NBR 5123 (ASSOCIAÇÃO BRASILEIRA DE NORMAS TÉCNICAS, 2016), </w:t>
-      </w:r>
-      <w:r>
-        <w:rPr>
-          <w:lang w:val="pt-BR"/>
-        </w:rPr>
-        <w:t xml:space="preserve">a certificação compulsória da luminária viária (INSTITUTO NACIONAL DE METROLOGIA, QUALIDADE E TECNOLOGIA, 2017, 2022a)</w:t>
-      </w:r>
-      <w:r>
-        <w:rPr>
-          <w:lang w:val="pt-BR"/>
-        </w:rPr>
-        <w:t xml:space="preserve"> e a regulamentação metrológica da medição de energia no ponto de luz (INSTITUTO NACIONAL DE METROLOGIA, QUALIDADE E TECNOLOGIA, 2022b) —, todos documentos públicos, e não em sua inspeção. O modelo do controlador instalado no município não é informação divulgada.</w:t>
+        <w:t>Duas delimitações fecham a subseção. A primeira é que a correspondência aqui estabelecida é funcional e topológica — um serviço central decide, o ponto de luz executa e reporta —, e não de escala, de potência, de geometria fotométrica, de instrumentação nem de enlace; essas divergências figuram entre as limitações e nenhuma delas incide sobre a camada avaliada. A segunda é que os autores não tiveram acesso ao equipamento efetivamente instalado pela concessionária: a cadeia descrita apoia-se no que o contrato exige desse equipamento e no que a normalização brasileira impõe a ele — a tomada da luminária, de sete contatos no padrão ANSI C136.41 (AMERICAN NATIONAL STANDARDS INSTITUTE, 2013), que acrescenta contatos de dimerização à tomada do relé fotocontrolador normalizada pela ABNT NBR 5123 (ASSOCIAÇÃO BRASILEIRA DE NORMAS TÉCNICAS, 2016), a certificação compulsória da luminária viária (INSTITUTO NACIONAL DE METROLOGIA, QUALIDADE E TECNOLOGIA, 2017, 2022a) e a regulamentação metrológica da medição de energia no ponto de luz (INSTITUTO NACIONAL DE METROLOGIA, QUALIDADE E TECNOLOGIA, 2022b) —, todos documentos públicos, e não em sua inspeção. O modelo do controlador instalado no município não é informação divulgada.</w:t>
       </w:r>
     </w:p>
     <w:p>
@@ -12869,6 +12853,7 @@
         <w:rPr>
           <w:lang w:val="pt-BR"/>
         </w:rPr>
+        <w:lastRenderedPageBreak/>
         <w:t>3.4 O nó de demonstração</w:t>
       </w:r>
       <w:bookmarkEnd w:id="28"/>
@@ -13616,7 +13601,14 @@
         <w:rPr>
           <w:lang w:val="pt-BR"/>
         </w:rPr>
-        <w:t>Todos os elementos são componentes de prateleira, de custo desprezível diante de qualquer ativo urbano, e esse fato integra o argumento: demonstrar o vínculo entre observação urbana e atuação luminosa não requer investimento significativo, o que é coerente com a tese de que o que falta ao município não é equipamento.</w:t>
+        <w:t xml:space="preserve">Todos os elementos são componentes de prateleira, de custo desprezível diante de qualquer ativo urbano, e esse fato integra o argumento: demonstrar o vínculo </w:t>
+      </w:r>
+      <w:r>
+        <w:rPr>
+          <w:lang w:val="pt-BR"/>
+        </w:rPr>
+        <w:lastRenderedPageBreak/>
+        <w:t>entre observação urbana e atuação luminosa não requer investimento significativo, o que é coerente com a tese de que o que falta ao município não é equipamento.</w:t>
       </w:r>
     </w:p>
     <w:p>
@@ -14048,6 +14040,7 @@
                 <w:szCs w:val="20"/>
                 <w:lang w:val="pt-BR"/>
               </w:rPr>
+              <w:lastRenderedPageBreak/>
               <w:t>Acionamento do módulo de luz</w:t>
             </w:r>
           </w:p>
@@ -14074,15 +14067,7 @@
                 <w:szCs w:val="20"/>
                 <w:lang w:val="pt-BR"/>
               </w:rPr>
-              <w:t xml:space="preserve">Módulo com transistor de efeito de campo e entrada de modulação, declarado para </w:t>
-            </w:r>
-            <w:r>
-              <w:rPr>
-                <w:sz w:val="20"/>
-                <w:szCs w:val="20"/>
-                <w:lang w:val="pt-BR"/>
-              </w:rPr>
-              <w:t>nível lógico a partir de 3,3 V</w:t>
+              <w:t>Módulo com transistor de efeito de campo e entrada de modulação, declarado para nível lógico a partir de 3,3 V</w:t>
             </w:r>
           </w:p>
         </w:tc>
@@ -14108,15 +14093,7 @@
                 <w:szCs w:val="20"/>
                 <w:lang w:val="pt-BR"/>
               </w:rPr>
-              <w:t xml:space="preserve">Módulo baseado no IRF520; transistor discreto montado com resistores de porta; regulador de corrente constante; </w:t>
-            </w:r>
-            <w:r>
-              <w:rPr>
-                <w:sz w:val="20"/>
-                <w:szCs w:val="20"/>
-                <w:lang w:val="pt-BR"/>
-              </w:rPr>
-              <w:t>dimerização por ângulo de condução em tensão de rede</w:t>
+              <w:t>Módulo baseado no IRF520; transistor discreto montado com resistores de porta; regulador de corrente constante; dimerização por ângulo de condução em tensão de rede</w:t>
             </w:r>
           </w:p>
         </w:tc>
@@ -14142,15 +14119,7 @@
                 <w:szCs w:val="20"/>
                 <w:lang w:val="pt-BR"/>
               </w:rPr>
-              <w:t xml:space="preserve">O módulo adotado traz resistor de porta, polarização e proteção já integrados, com bornes a parafuso, e sua faixa de nível lógico declarada abrange os 3,3 V do microcontrolador. A dimerização em </w:t>
-            </w:r>
-            <w:r>
-              <w:rPr>
-                <w:sz w:val="20"/>
-                <w:szCs w:val="20"/>
-                <w:lang w:val="pt-BR"/>
-              </w:rPr>
-              <w:t>tensão de rede expõe a bancada a 127 V sem ganho</w:t>
+              <w:t>O módulo adotado traz resistor de porta, polarização e proteção já integrados, com bornes a parafuso, e sua faixa de nível lógico declarada abrange os 3,3 V do microcontrolador. A dimerização em tensão de rede expõe a bancada a 127 V sem ganho</w:t>
             </w:r>
           </w:p>
         </w:tc>
@@ -14515,13 +14484,14 @@
         <w:rPr>
           <w:lang w:val="pt-BR"/>
         </w:rPr>
-        <w:t xml:space="preserve">Duas dessas decisões merecem registro. A primeira é a rejeição do computador de placa única, que não decorre de insuficiência — um computador desse porte executaria com folga tudo o que o nó faz —, e sim de a arquitetura descrita em 3.2 manter a decisão fora do dispositivo: o microcontrolador de recurso restrito é a escolha que torna essa separação verificável, porque o nó não decide por não ter como decidir. Acrescem-se o tempo de inicialização, a suscetibilidade do sistema de arquivos à </w:t>
-      </w:r>
-      <w:r>
-        <w:rPr>
-          <w:lang w:val="pt-BR"/>
-        </w:rPr>
-        <w:t>queda de energia e o custo unitário, relevantes em ativo que se replicaria por centenas de milhares de unidades.</w:t>
+        <w:t xml:space="preserve">Duas dessas decisões merecem registro. A primeira é a rejeição do computador de placa única, que não decorre de insuficiência — um computador desse porte executaria com folga tudo o que o nó faz —, e sim de a arquitetura descrita em 3.2 </w:t>
+      </w:r>
+      <w:r>
+        <w:rPr>
+          <w:lang w:val="pt-BR"/>
+        </w:rPr>
+        <w:lastRenderedPageBreak/>
+        <w:t>manter a decisão fora do dispositivo: o microcontrolador de recurso restrito é a escolha que torna essa separação verificável, porque o nó não decide por não ter como decidir. Acrescem-se o tempo de inicialização, a suscetibilidade do sistema de arquivos à queda de energia e o custo unitário, relevantes em ativo que se replicaria por centenas de milhares de unidades.</w:t>
       </w:r>
     </w:p>
     <w:p>
@@ -14622,7 +14592,14 @@
         <w:rPr>
           <w:lang w:val="pt-BR"/>
         </w:rPr>
-        <w:t xml:space="preserve"> o ângulo sólido correspondente ao ângulo de abertura declarado pelo fabricante e h a distância ao plano de medição. Fixada a distância, o comprimento do segmento é a variável de projeto.</w:t>
+        <w:t xml:space="preserve"> o ângulo sólido correspondente ao ângulo de abertura declarado </w:t>
+      </w:r>
+      <w:r>
+        <w:rPr>
+          <w:lang w:val="pt-BR"/>
+        </w:rPr>
+        <w:lastRenderedPageBreak/>
+        <w:t>pelo fabricante e h a distância ao plano de medição. Fixada a distância, o comprimento do segmento é a variável de projeto.</w:t>
       </w:r>
     </w:p>
     <w:p>
@@ -14638,13 +14615,7 @@
         <w:rPr>
           <w:lang w:val="pt-BR"/>
         </w:rPr>
-        <w:t xml:space="preserve">Aqui se impõe uma cautela. A especificação elétrica dessas fitas é consistente entre fornecedores — sessenta emissores por metro, 14,4 W/m —, mas a fotométrica </w:t>
-      </w:r>
-      <w:r>
-        <w:rPr>
-          <w:lang w:val="pt-BR"/>
-        </w:rPr>
-        <w:t>não: anúncios de produtos nominalmente idênticos declaram fluxos divergentes entre si. Nenhum desses valores é verificável pelos autores. O comprimento do segmento é, por isso, determinado por medição, e não por catálogo: parte-se de um trecho e ajusta-se o comprimento, em múltiplos do intervalo de seccionamento, até que a leitura a ciclo de trabalho pleno se situe entre uma vez e meia e duas vezes a iluminância média mantida da classe adotada. Quando o menor segmento admitido pelo seccionamento já excede o critério, interpõe-se um difusor entre o segmento e o plano de medição, e é a atenuação do difusor, e não o comprimento, que se ajusta. Foi o que ocorreu na bancada: na primeira montagem, três emissores a 0,44 m produziram 42,6 lux sem difusor, mais de quatro vezes o valor da classe. Na caixa atual, que substituiu a primeira em 10 de outubro de 2026, a primeira leitura com o difusor deu 2,05 vezes o valor da classe; ajustado o difusor, a leitura a ciclo de trabalho pleno ficou em 1,57 vez.</w:t>
+        <w:t>Aqui se impõe uma cautela. A especificação elétrica dessas fitas é consistente entre fornecedores — sessenta emissores por metro, 14,4 W/m —, mas a fotométrica não: anúncios de produtos nominalmente idênticos declaram fluxos divergentes entre si. Nenhum desses valores é verificável pelos autores. O comprimento do segmento é, por isso, determinado por medição, e não por catálogo: parte-se de um trecho e ajusta-se o comprimento, em múltiplos do intervalo de seccionamento, até que a leitura a ciclo de trabalho pleno se situe entre uma vez e meia e duas vezes a iluminância média mantida da classe adotada. Quando o menor segmento admitido pelo seccionamento já excede o critério, interpõe-se um difusor entre o segmento e o plano de medição, e é a atenuação do difusor, e não o comprimento, que se ajusta. Foi o que ocorreu na bancada: na primeira montagem, três emissores a 0,44 m produziram 42,6 lux sem difusor, mais de quatro vezes o valor da classe. Na caixa atual, que substituiu a primeira em 10 de outubro de 2026, a primeira leitura com o difusor deu 2,05 vezes o valor da classe; ajustado o difusor, a leitura a ciclo de trabalho pleno ficou em 1,57 vez.</w:t>
       </w:r>
     </w:p>
     <w:p>
@@ -14692,13 +14663,8 @@
         <w:rPr>
           <w:lang w:val="pt-BR"/>
         </w:rPr>
-        <w:t xml:space="preserve">A modulação opera a 5 kHz com resolução de 12 bits, o que fornece 4.096 degraus de ciclo de trabalho. A frequência é suficientemente alta para que o período do sinal seja desprezível diante dos cerca de 440 ms de integração do sensor, com o registrador de tempo de medição no valor máximo, de modo que a leitura corresponde </w:t>
-      </w:r>
-      <w:r>
-        <w:rPr>
-          <w:lang w:val="pt-BR"/>
-        </w:rPr>
-        <w:t>ao valor médio do fluxo e não a uma amostra da portadora. O Quadro 6 reúne o dimensionamento e sua correspondência com a norma.</w:t>
+        <w:lastRenderedPageBreak/>
+        <w:t>A modulação opera a 5 kHz com resolução de 12 bits, o que fornece 4.096 degraus de ciclo de trabalho. A frequência é suficientemente alta para que o período do sinal seja desprezível diante dos cerca de 440 ms de integração do sensor, com o registrador de tempo de medição no valor máximo, de modo que a leitura corresponde ao valor médio do fluxo e não a uma amostra da portadora. O Quadro 6 reúne o dimensionamento e sua correspondência com a norma.</w:t>
       </w:r>
     </w:p>
     <w:p>
@@ -15539,13 +15505,7 @@
         <w:rPr>
           <w:lang w:val="pt-BR"/>
         </w:rPr>
-        <w:t xml:space="preserve">A taxa máxima de decréscimo tem consequência direta sobre a demonstração, e é preferível declará-la a ser surpreendido por ela. Uma redução de 10 lux para 5 lux consome, no mínimo, cinco minutos. A norma, contudo, limita apenas o decréscimo: a elevação do fluxo não está sujeita a essa restrição, e o trabalho a mantém livre, por elevar o nível na direção do valor pleno da classe e jamais reduzir a segurança. A demonstração explora essa assimetria — diante de um evento reportado, a elevação é imediata e visível; </w:t>
-      </w:r>
-      <w:r>
-        <w:rPr>
-          <w:lang w:val="pt-BR"/>
-        </w:rPr>
-        <w:t xml:space="preserve">a atenuação subsequente ocorre em rampa conduzida pelo próprio nó, visível na bancada, enquanto o painel exibe o nível-alvo de cada decisão e a iluminância medida. O que a plateia observa não é apenas a luz mudando, mas o limite de taxa da norma impondo o ritmo dessa mudança.</w:t>
+        <w:t>A taxa máxima de decréscimo tem consequência direta sobre a demonstração, e é preferível declará-la a ser surpreendido por ela. Uma redução de 10 lux para 5 lux consome, no mínimo, cinco minutos. A norma, contudo, limita apenas o decréscimo: a elevação do fluxo não está sujeita a essa restrição, e o trabalho a mantém livre, por elevar o nível na direção do valor pleno da classe e jamais reduzir a segurança. A demonstração explora essa assimetria — diante de um evento reportado, a elevação é imediata e visível; a atenuação subsequente ocorre em rampa conduzida pelo próprio nó, visível na bancada, enquanto o painel exibe o nível-alvo de cada decisão e a iluminância medida. O que a plateia observa não é apenas a luz mudando, mas o limite de taxa da norma impondo o ritmo dessa mudança.</w:t>
       </w:r>
     </w:p>
     <w:p>
@@ -15578,13 +15538,8 @@
         <w:rPr>
           <w:lang w:val="pt-BR"/>
         </w:rPr>
-        <w:t xml:space="preserve">Medir 10 lux sob a iluminação de um recinto interno não produz resultado interpretável. O plano de medição é, por isso, alojado em anteparo opaco de face interna fosca, com a luminária em uma extremidade e o sensor na outra. A providência </w:t>
-      </w:r>
-      <w:r>
-        <w:rPr>
-          <w:lang w:val="pt-BR"/>
-        </w:rPr>
-        <w:t>não é expediente de conveniência: é condição para que a grandeza medida seja a iluminância produzida pelo nó.</w:t>
+        <w:lastRenderedPageBreak/>
+        <w:t>Medir 10 lux sob a iluminação de um recinto interno não produz resultado interpretável. O plano de medição é, por isso, alojado em anteparo opaco de face interna fosca, com a luminária em uma extremidade e o sensor na outra. A providência não é expediente de conveniência: é condição para que a grandeza medida seja a iluminância produzida pelo nó.</w:t>
       </w:r>
     </w:p>
     <w:p>
@@ -15681,7 +15636,14 @@
         <w:rPr>
           <w:lang w:val="pt-BR"/>
         </w:rPr>
-        <w:t>Ela também não compromete as duas grandezas que a bancada efetivamente estabelece. A primeira é a latência entre a publicação do dado e a estabilização da iluminância, que é medida em tempo e não em lux. A segunda é a trajetória normalizada do fluxo, isto é, a razão entre a iluminância corrente e a iluminância plena — e é precisamente nessa forma relativa que a norma expressa a restrição de taxa. Um erro sistemático de escala cancela-se na razão.</w:t>
+        <w:t xml:space="preserve">Ela também não compromete as duas grandezas que a bancada efetivamente estabelece. A primeira é a latência entre a publicação do dado e a estabilização da iluminância, que é medida em tempo e não em lux. A segunda é a trajetória normalizada do fluxo, isto é, a razão entre a iluminância corrente e a iluminância plena </w:t>
+      </w:r>
+      <w:r>
+        <w:rPr>
+          <w:lang w:val="pt-BR"/>
+        </w:rPr>
+        <w:lastRenderedPageBreak/>
+        <w:t>— e é precisamente nessa forma relativa que a norma expressa a restrição de taxa. Um erro sistemático de escala cancela-se na razão.</w:t>
       </w:r>
     </w:p>
     <w:p>
@@ -15729,7 +15691,14 @@
         <w:rPr>
           <w:lang w:val="pt-BR"/>
         </w:rPr>
-        <w:t>O procedimento de calibração estabelece essas propriedades em uma única sessão. Medida a residual, o ciclo de trabalho é varrido em 33 degraus, em três séries independentes, e cada ponto é a média de três leituras. Os ciclos de trabalho correspondentes a 10 lux e a 5 lux são então localizados por bisseção sobre o próprio hardware — cada passo da busca é uma medição, e nenhum valor decorre de conta sobre o teto — e cada um é repetido três vezes, com apagamento entre as repetições. A tabela que converte nível em ciclo de trabalho, gravada no banco e na memória do nó, contém apenas pontos medidos, com o fluxo pleno e o piso exatamente nos ciclos localizados; entre pontos medidos, o nó interpola linearmente. Na sessão adotada, feita na caixa atual, 10 lux correspondem a 65,6 % do ciclo de trabalho e 5 lux a 34,0 %, e a maior dispersão entre séries na faixa de operação foi de 0,86 %; as três repetições do pleno deram a mesma leitura, e as do piso diferiram em 0,73 %. Em ensaio de estabilidade de dez minutos a ciclo pleno, feito na primeira caixa, o desvio-padrão das leituras foi de 0,2 %, no limite da resolução do sensor.</w:t>
+        <w:t xml:space="preserve">O procedimento de calibração estabelece essas propriedades em uma única sessão. Medida a residual, o ciclo de trabalho é varrido em 33 degraus, em três séries independentes, e cada ponto é a média de três leituras. Os ciclos de trabalho correspondentes a 10 lux e a 5 lux são então localizados por bisseção sobre o próprio hardware — cada passo da busca é uma medição, e nenhum valor decorre de conta sobre o teto — e cada um é repetido três vezes, com apagamento entre as repetições. A tabela que converte nível em ciclo de trabalho, gravada no banco e na memória do nó, contém apenas pontos medidos, com o fluxo pleno e o piso exatamente nos ciclos localizados; entre pontos medidos, o nó interpola linearmente. Na sessão adotada, feita na caixa atual, 10 lux correspondem a 65,6 % do ciclo de trabalho e 5 lux a 34,0 %, e a maior dispersão entre séries na faixa de operação foi de 0,86 %; as três repetições do pleno deram a mesma leitura, e as do piso diferiram em 0,73 %. Em </w:t>
+      </w:r>
+      <w:r>
+        <w:rPr>
+          <w:lang w:val="pt-BR"/>
+        </w:rPr>
+        <w:lastRenderedPageBreak/>
+        <w:t>ensaio de estabilidade de dez minutos a ciclo pleno, feito na primeira caixa, o desvio-padrão das leituras foi de 0,2 %, no limite da resolução do sensor.</w:t>
       </w:r>
     </w:p>
     <w:p>
@@ -15826,37 +15795,14 @@
         <w:rPr>
           <w:lang w:val="pt-BR"/>
         </w:rPr>
-        <w:t xml:space="preserve">Três diagnósticos derivam dessa comparação e são avaliados sobre a bancada. O primeiro é a falha total: comando de nível não nulo acompanhado de leitura equivalente à iluminância residual registrada em 3.4.3 caracteriza luminária apagada, e a condição é induzida deliberadamente, por interrupção do ramo de potência, para que a detecção seja verificada e não apenas afirmada. O segundo é a </w:t>
-      </w:r>
-      <w:r>
-        <w:rPr>
-          <w:lang w:val="pt-BR"/>
-        </w:rPr>
-        <w:t xml:space="preserve">divergência entre o nível emitido e o nível entregue, </w:t>
-      </w:r>
-      <w:r>
-        <w:rPr>
-          <w:lang w:val="pt-BR"/>
-        </w:rPr>
-        <w:t xml:space="preserve">apurada a cada leitura recebida sobre</w:t>
-      </w:r>
-      <w:r>
-        <w:rPr>
-          <w:lang w:val="pt-BR"/>
-        </w:rPr>
-        <w:t xml:space="preserve"> a razão entre a iluminância medida e a correspondente ao comando. O terceiro é o alerta de perda de controle, emitido quando a divergência persiste acima de tolerância declarada </w:t>
-      </w:r>
-      <w:r>
-        <w:rPr>
-          <w:lang w:val="pt-BR"/>
-        </w:rPr>
-        <w:t xml:space="preserve">por número de leituras consecutivas</w:t>
-      </w:r>
-      <w:r>
-        <w:rPr>
-          <w:lang w:val="pt-BR"/>
-        </w:rPr>
-        <w:t xml:space="preserve">.</w:t>
+        <w:t xml:space="preserve">Três diagnósticos derivam dessa comparação e são avaliados sobre a bancada. O primeiro é a falha total: comando de nível não nulo acompanhado de </w:t>
+      </w:r>
+      <w:r>
+        <w:rPr>
+          <w:lang w:val="pt-BR"/>
+        </w:rPr>
+        <w:lastRenderedPageBreak/>
+        <w:t>leitura equivalente à iluminância residual registrada em 3.4.3 caracteriza luminária apagada, e a condição é induzida deliberadamente, por interrupção do ramo de potência, para que a detecção seja verificada e não apenas afirmada. O segundo é a divergência entre o nível emitido e o nível entregue, apurada a cada leitura recebida sobre a razão entre a iluminância medida e a correspondente ao comando. O terceiro é o alerta de perda de controle, emitido quando a divergência persiste acima de tolerância declarada por número de leituras consecutivas.</w:t>
       </w:r>
     </w:p>
     <w:p>
@@ -15904,13 +15850,14 @@
         <w:rPr>
           <w:lang w:val="pt-BR"/>
         </w:rPr>
-        <w:t xml:space="preserve">No parque, o ponto de luz não dispõe de sensor de iluminância (Quadro 2), e a grandeza de retorno é outra: o controlador de telegestão reporta as grandezas elétricas do ponto de luz (Quadro 3). A comparação conserva a forma — o medido contra o esperado para o nível comandado —, com a potência no lugar da iluminância: sob a hipótese de proporcionalidade de 3.11, a potência esperada é a nominal multiplicada pelo nível, corrigida pela curva do regulador de corrente quando esta for conhecida. Os três diagnósticos transpõem-se: a falha total, como comando de nível não nulo acompanhado de potência próxima de zero; a divergência, como razão entre a potência medida e a esperada; e a perda de controle, como divergência persistente. O que não se transpõe é o alcance. A grandeza elétrica atesta que o comando foi </w:t>
-      </w:r>
-      <w:r>
-        <w:rPr>
-          <w:lang w:val="pt-BR"/>
-        </w:rPr>
-        <w:t>executado pelo regulador, e não que a luz chegou à via: a sujeira do refrator, a obstrução por vegetação e a depreciação do fluxo a potência constante passam despercebidas por ela.</w:t>
+        <w:t xml:space="preserve">No parque, o ponto de luz não dispõe de sensor de iluminância (Quadro 2), e a grandeza de retorno é outra: o controlador de telegestão reporta as grandezas elétricas do ponto de luz (Quadro 3). A comparação conserva a forma — o medido contra o esperado para o nível comandado —, com a potência no lugar da iluminância: sob a hipótese de proporcionalidade de 3.11, a potência esperada é a nominal multiplicada pelo nível, corrigida pela curva do regulador de corrente quando esta for conhecida. Os três diagnósticos transpõem-se: a falha total, como comando de nível </w:t>
+      </w:r>
+      <w:r>
+        <w:rPr>
+          <w:lang w:val="pt-BR"/>
+        </w:rPr>
+        <w:lastRenderedPageBreak/>
+        <w:t>não nulo acompanhado de potência próxima de zero; a divergência, como razão entre a potência medida e a esperada; e a perda de controle, como divergência persistente. O que não se transpõe é o alcance. A grandeza elétrica atesta que o comando foi executado pelo regulador, e não que a luz chegou à via: a sujeira do refrator, a obstrução por vegetação e a depreciação do fluxo a potência constante passam despercebidas por ela.</w:t>
       </w:r>
     </w:p>
     <w:p>
@@ -16024,6 +15971,7 @@
         <w:rPr>
           <w:lang w:val="pt-BR"/>
         </w:rPr>
+        <w:lastRenderedPageBreak/>
         <w:t>Do exposto decorre a delimitação já enunciada em 1.3: demonstra-se o preparo para a integração e especifica-se a interface que a tornaria possível, por meio de interface equivalente, e não a interoperabilidade com a plataforma municipal em operação.</w:t>
       </w:r>
     </w:p>
@@ -16105,7 +16053,14 @@
         <w:rPr>
           <w:lang w:val="pt-BR"/>
         </w:rPr>
-        <w:t>O volume é ocupação, e não soma de passagens. A câmera informa quantas pessoas estão na área a cada instante, e a média dessas contagens no período é o volume. Uma pessoa que entra e sai da imagem várias vezes conta como uma em cada instante em que está presente, e nunca como várias; uma detecção intermitente reduz a média, sem inflá-la. O dado de origem é o analítico de contagem de pessoas por área que o termo de referência da plataforma já exige (2.3). A detecção de densidade serviria igualmente, se publicada como número, convertida em pessoas pela área do trecho; a contagem de passagens não serve, justamente por somar duas vezes a mesma pessoa.</w:t>
+        <w:t xml:space="preserve">O volume é ocupação, e não soma de passagens. A câmera informa quantas pessoas estão na área a cada instante, e a média dessas contagens no período é o volume. Uma pessoa que entra e sai da imagem várias vezes conta como uma em cada instante em que está presente, e nunca como várias; uma detecção intermitente reduz a média, sem inflá-la. O dado de origem é o analítico de contagem de pessoas </w:t>
+      </w:r>
+      <w:r>
+        <w:rPr>
+          <w:lang w:val="pt-BR"/>
+        </w:rPr>
+        <w:lastRenderedPageBreak/>
+        <w:t>por área que o termo de referência da plataforma já exige (2.3). A detecção de densidade serviria igualmente, se publicada como número, convertida em pessoas pela área do trecho; a contagem de passagens não serve, justamente por somar duas vezes a mesma pessoa.</w:t>
       </w:r>
     </w:p>
     <w:p>
@@ -16153,19 +16108,14 @@
         <w:rPr>
           <w:lang w:val="pt-BR"/>
         </w:rPr>
-        <w:t xml:space="preserve">As duas pontas da cadeia já são georreferenciadas. As câmeras do Smart Sampa são cadastradas com latitude, longitude, endereço, distrito e subprefeitura (SÃO PAULO, 2024). O Caderno de Encargos exige o cadastro técnico georreferenciado do parque, com posição e código cadastral de cada ponto de luz, integrado à base cartográfica do município, e é por esse cadastro que a telegestão atua sobre cada ponto (SÃO PAULO, 2015, itens 13, 13.1 e 13.3). O cadastro é público: o GeoSampa, </w:t>
-      </w:r>
-      <w:r>
-        <w:rPr>
-          <w:lang w:val="pt-BR"/>
-        </w:rPr>
-        <w:t xml:space="preserve">portal cartográfico municipal, publicava, em consulta de 27 de setembro de 2026, 662.945</w:t>
-      </w:r>
-      <w:r>
-        <w:rPr>
-          <w:lang w:val="pt-BR"/>
-        </w:rPr>
-        <w:t xml:space="preserve"> pontos de iluminação, cada um com placa e coordenadas, e 218.768 segmentos de logradouro, cada um com o código oficial do logradouro e sua geometria (SÃO PAULO, 2026c). O que falta é a regra que liga um lugar observado a um ponto de luz.</w:t>
+        <w:t xml:space="preserve">As duas pontas da cadeia já são georreferenciadas. As câmeras do Smart Sampa são cadastradas com latitude, longitude, endereço, distrito e subprefeitura (SÃO PAULO, 2024). O Caderno de Encargos exige o cadastro técnico georreferenciado do parque, com posição e código cadastral de cada ponto de luz, integrado à base cartográfica do município, e é por esse cadastro que a telegestão atua sobre cada ponto (SÃO PAULO, 2015, itens 13, 13.1 e 13.3). O cadastro é público: o GeoSampa, portal cartográfico municipal, publicava, em consulta de 27 de setembro de 2026, 662.945 pontos de iluminação, cada um com placa e coordenadas, e 218.768 segmentos de logradouro, cada um com o código oficial do logradouro e </w:t>
+      </w:r>
+      <w:r>
+        <w:rPr>
+          <w:lang w:val="pt-BR"/>
+        </w:rPr>
+        <w:lastRenderedPageBreak/>
+        <w:t>sua geometria (SÃO PAULO, 2026c). O que falta é a regra que liga um lugar observado a um ponto de luz.</w:t>
       </w:r>
     </w:p>
     <w:p>
@@ -16181,13 +16131,7 @@
         <w:rPr>
           <w:lang w:val="pt-BR"/>
         </w:rPr>
-        <w:t xml:space="preserve">Adota-se como unidade espacial o segmento de logradouro do GeoSampa, identificado pelo código do próprio cadastro. Cada ponto de luz associa-se a todo trecho cuja linha passe a até 25 m de sua posição, distância medida no sistema de coordenadas plano da base cartográfica. A relação é de muitos para muitos: um poste </w:t>
-      </w:r>
-      <w:r>
-        <w:rPr>
-          <w:lang w:val="pt-BR"/>
-        </w:rPr>
-        <w:t>de esquina ilumina mais de um trecho, e um trecho é iluminado por vários postes. A decisão de cada ponto considera todos os trechos associados a ele, pelo lado seguro — vale o maior volume entre os trechos, e há ocorrência se qualquer trecho a reportar. Cada publicação refere-se a um único trecho, e o raio e o critério da associação são gravados junto com ela, de modo que a regra seja reconstituível e ajustável por operação sobre dado. A outra ligação, entre cada câmera e os trechos que ela observa, cabe à plataforma, que conhece a posição e o campo de visão de cada câmera: é ela que publica o volume já referido ao código do trecho (Quadro 18). Este trabalho não constrói nem verifica essa associação.</w:t>
+        <w:t>Adota-se como unidade espacial o segmento de logradouro do GeoSampa, identificado pelo código do próprio cadastro. Cada ponto de luz associa-se a todo trecho cuja linha passe a até 25 m de sua posição, distância medida no sistema de coordenadas plano da base cartográfica. A relação é de muitos para muitos: um poste de esquina ilumina mais de um trecho, e um trecho é iluminado por vários postes. A decisão de cada ponto considera todos os trechos associados a ele, pelo lado seguro — vale o maior volume entre os trechos, e há ocorrência se qualquer trecho a reportar. Cada publicação refere-se a um único trecho, e o raio e o critério da associação são gravados junto com ela, de modo que a regra seja reconstituível e ajustável por operação sobre dado. A outra ligação, entre cada câmera e os trechos que ela observa, cabe à plataforma, que conhece a posição e o campo de visão de cada câmera: é ela que publica o volume já referido ao código do trecho (Quadro 18). Este trabalho não constrói nem verifica essa associação.</w:t>
       </w:r>
     </w:p>
     <w:p>
@@ -16235,13 +16179,8 @@
         <w:rPr>
           <w:lang w:val="pt-BR"/>
         </w:rPr>
-        <w:t xml:space="preserve">A arquitetura do serviço segue o que o Caderno de Encargos exige do sistema de telegestão, e não a conveniência da bancada. O Caderno exige que a lógica e os modos de atuação sejam processados no controlador de cada luminária, que funciona sem comunicação com o centro de controle; que a central envie comandos isolados ou em grupo, programações ou a atualização de uma agenda residente no controlador; e admite até 180 s para a troca de dados entre a central e a luminária </w:t>
-      </w:r>
-      <w:r>
-        <w:rPr>
-          <w:lang w:val="pt-BR"/>
-        </w:rPr>
-        <w:t>(SÃO PAULO, 2015, itens 7.1.1, 7.1.2 e 7.2.1). O que foi efetivamente implantado no parque não é conhecido e não é afirmado aqui. Seguindo essas exigências, o serviço decide quando chega volume ou ocorrência de um trecho, e só para os pontos de luz daquele trecho; publica comando apenas quando o nível-alvo muda, ou quando o anterior está a menos de 5 min de vencer e o novo vence depois dele; e uma varredura a cada minuto decide de novo os pontos cujo comando está vencendo. O nó executa a rampa e volta ao pleno no vencimento (3.4). Nos cenários de 4.2, isso reduziu os comandos a cerca de 1,3 % dos passos da rampa, sem mudar os resultados. Em escala de parque, com mais de seiscentos mil pontos e volume a cada 5 min, a ordem de grandeza passa de cerca de 120 mil comandos por segundo, se cada ponto recebesse comando a cada 5 s, para cerca de mil, cálculo e não medição.</w:t>
+        <w:lastRenderedPageBreak/>
+        <w:t>A arquitetura do serviço segue o que o Caderno de Encargos exige do sistema de telegestão, e não a conveniência da bancada. O Caderno exige que a lógica e os modos de atuação sejam processados no controlador de cada luminária, que funciona sem comunicação com o centro de controle; que a central envie comandos isolados ou em grupo, programações ou a atualização de uma agenda residente no controlador; e admite até 180 s para a troca de dados entre a central e a luminária (SÃO PAULO, 2015, itens 7.1.1, 7.1.2 e 7.2.1). O que foi efetivamente implantado no parque não é conhecido e não é afirmado aqui. Seguindo essas exigências, o serviço decide quando chega volume ou ocorrência de um trecho, e só para os pontos de luz daquele trecho; publica comando apenas quando o nível-alvo muda, ou quando o anterior está a menos de 5 min de vencer e o novo vence depois dele; e uma varredura a cada minuto decide de novo os pontos cujo comando está vencendo. O nó executa a rampa e volta ao pleno no vencimento (3.4). Nos cenários de 4.2, isso reduziu os comandos a cerca de 1,3 % dos passos da rampa, sem mudar os resultados. Em escala de parque, com mais de seiscentos mil pontos e volume a cada 5 min, a ordem de grandeza passa de cerca de 120 mil comandos por segundo, se cada ponto recebesse comando a cada 5 s, para cerca de mil, cálculo e não medição.</w:t>
       </w:r>
     </w:p>
     <w:p>
@@ -16290,7 +16229,14 @@
         <w:rPr>
           <w:lang w:val="pt-BR"/>
         </w:rPr>
-        <w:t>Adota-se, em consequência, a contagem automática de pedestres da cidade de Zurique, em valores de 15 min e sob licença aberta (STADT ZÜRICH, 2026), que mede o mesmo fenômeno que a classe P da ABNT NBR 5101 disciplina: a circulação de pedestres em via urbana. Emprega-se a janela de 2016 a 2019, anterior à pandemia; o arquivo foi baixado em 30 de setembro de 2026, e o resumo SHA-256 da cópia empregada é registrado, uma vez que o portal o atualiza. Entre as séries públicas com histórico de anos localizadas pelos autores, a de 15 min é a mais próxima do período de 5 min em que a interface especificada publica o volume (3.5.2).</w:t>
+        <w:t xml:space="preserve">Adota-se, em consequência, a contagem automática de pedestres da cidade de Zurique, em valores de 15 min e sob licença aberta (STADT ZÜRICH, 2026), que mede o mesmo fenômeno que a classe P da ABNT NBR 5101 disciplina: a circulação </w:t>
+      </w:r>
+      <w:r>
+        <w:rPr>
+          <w:lang w:val="pt-BR"/>
+        </w:rPr>
+        <w:lastRenderedPageBreak/>
+        <w:t>de pedestres em via urbana. Emprega-se a janela de 2016 a 2019, anterior à pandemia; o arquivo foi baixado em 30 de setembro de 2026, e o resumo SHA-256 da cópia empregada é registrado, uma vez que o portal o atualiza. Entre as séries públicas com histórico de anos localizadas pelos autores, a de 15 min é a mais próxima do período de 5 min em que a interface especificada publica o volume (3.5.2).</w:t>
       </w:r>
     </w:p>
     <w:p>
@@ -16338,13 +16284,14 @@
         <w:rPr>
           <w:lang w:val="pt-BR"/>
         </w:rPr>
-        <w:t xml:space="preserve">São retidos os 14 pontos com ao menos 730 dias de registro e cobertura igual ou superior a 95 % na janela, 12 deles com dados no ano de teste; o treino vai até 2018, e o teste é o ano de 2019. A preparação segue roteiro fixado antes do treino: os carimbos repetidos na mudança de horário de verão são combinados pela média; sequências de contagem nula por oito horas ou mais que incluam horário diurno são tratadas como sensor travado e descartadas; o percentil 99 de cada ponto é calculado só no treino. Os atributos do modelo são o nível de 15, 30, 45 e 60 min, de 2 h, de 24 h e de 7 dias antes; as médias da última hora, das últimas três e das últimas vinte e </w:t>
-      </w:r>
-      <w:r>
-        <w:rPr>
-          <w:lang w:val="pt-BR"/>
-        </w:rPr>
-        <w:t>quatro horas; a hora do dia, o quarto de hora, o instante do dia em forma de seno e cosseno, o dia da semana, o fim de semana e o feriado. O alvo é o nível médio dos 60 min seguintes. No treino, os feriados são os de Zurique, onde a série é medida; em operação, os nacionais brasileiros — é o atributo que muda de calendário com a cidade, e não o modelo. Sem histórico suficiente para os atributos de atraso, o serviço recorre à persistência em vez de extrapolar sobre a lacuna.</w:t>
+        <w:t xml:space="preserve">São retidos os 14 pontos com ao menos 730 dias de registro e cobertura igual ou superior a 95 % na janela, 12 deles com dados no ano de teste; o treino vai até 2018, e o teste é o ano de 2019. A preparação segue roteiro fixado antes do treino: os </w:t>
+      </w:r>
+      <w:r>
+        <w:rPr>
+          <w:lang w:val="pt-BR"/>
+        </w:rPr>
+        <w:lastRenderedPageBreak/>
+        <w:t>carimbos repetidos na mudança de horário de verão são combinados pela média; sequências de contagem nula por oito horas ou mais que incluam horário diurno são tratadas como sensor travado e descartadas; o percentil 99 de cada ponto é calculado só no treino. Os atributos do modelo são o nível de 15, 30, 45 e 60 min, de 2 h, de 24 h e de 7 dias antes; as médias da última hora, das últimas três e das últimas vinte e quatro horas; a hora do dia, o quarto de hora, o instante do dia em forma de seno e cosseno, o dia da semana, o fim de semana e o feriado. O alvo é o nível médio dos 60 min seguintes. No treino, os feriados são os de Zurique, onde a série é medida; em operação, os nacionais brasileiros — é o atributo que muda de calendário com a cidade, e não o modelo. Sem histórico suficiente para os atributos de atraso, o serviço recorre à persistência em vez de extrapolar sobre a lacuna.</w:t>
       </w:r>
     </w:p>
     <w:p>
@@ -16376,7 +16323,14 @@
         <w:rPr>
           <w:lang w:val="pt-BR"/>
         </w:rPr>
-        <w:t>A régua segue quatro requisitos do projeto: escala de 0, via vazia, a 1, o cheio típico da via; pouca influência de eventos raros; estabilidade com 28 dias de dado; e cálculo simples, trecho a trecho, no banco. A normalização pelo máximo deixaria um único evento definir a escala; a padronização pela média e pelo desvio produz valores negativos e sem limite; a escala pela mediana e pela dispersão central cresce sem controle à noite, quando a mediana é quase zero; e a transformação em postos perde a proporção entre os volumes. Em 28 dias, o percentil 99 é definido por cerca dos 27 blocos mais cheios: o bastante para a estimativa ser estável, e pouco o bastante para deixar os eventos raros acima dela, onde o nível é limitado a 1. O valor 99 é critério dos autores. Num teste de sensibilidade feito depois da escolha, trocar o 99 por 95, 99,5 ou 99,9 manteve a mesma faixa de movimentação em 95,7 % a 99,2 % dos blocos noturnos de 2019, pela régua do treino e pela de 28 dias; o percentil 95 deixa 5,5 % dos blocos no limite de 1, e a variação diária da régua ficou abaixo de 5 % em 95 % dos dias, nos quatro percentis.</w:t>
+        <w:t xml:space="preserve">A régua segue quatro requisitos do projeto: escala de 0, via vazia, a 1, o cheio típico da via; pouca influência de eventos raros; estabilidade com 28 dias de dado; e cálculo simples, trecho a trecho, no banco. A normalização pelo máximo deixaria um único evento definir a escala; a padronização pela média e pelo desvio produz valores negativos e sem limite; a escala pela mediana e pela dispersão central cresce sem controle à noite, quando a mediana é quase zero; e a transformação em postos perde a proporção entre os volumes. Em 28 dias, o percentil 99 é definido por cerca dos 27 blocos mais cheios: o bastante para a estimativa ser estável, e pouco o bastante para deixar os eventos raros acima dela, onde o nível é limitado a 1. O valor 99 é critério dos autores. Num teste de sensibilidade feito depois da escolha, trocar o 99 por 95, 99,5 ou 99,9 manteve a mesma faixa de movimentação em 95,7 % a 99,2 % dos blocos noturnos de 2019, pela régua do treino e pela de 28 dias; o percentil 95 deixa </w:t>
+      </w:r>
+      <w:r>
+        <w:rPr>
+          <w:lang w:val="pt-BR"/>
+        </w:rPr>
+        <w:lastRenderedPageBreak/>
+        <w:t>5,5 % dos blocos no limite de 1, e a variação diária da régua ficou abaixo de 5 % em 95 % dos dias, nos quatro percentis.</w:t>
       </w:r>
     </w:p>
     <w:p>
@@ -16392,13 +16346,7 @@
         <w:rPr>
           <w:lang w:val="pt-BR"/>
         </w:rPr>
-        <w:t xml:space="preserve">O erro médio não diz, por si, se a previsão melhora a decisão: as regras de 3.7 leem a movimentação prevista em três faixas, e um ganho de precisão que não mude a faixa não muda o nível. A camada é, por isso, avaliada também nos termos da </w:t>
-      </w:r>
-      <w:r>
-        <w:rPr>
-          <w:lang w:val="pt-BR"/>
-        </w:rPr>
-        <w:t>decisão. No sistema, o modelo é substituído pela média sazonal calculada apenas com o histórico do próprio ponto — a média do nível na mesma hora das até quatro semanas anteriores, sem treino —, e comparam-se a energia, a janela em transição e os minutos abaixo do nível que a situação pede (3.9). Fora do sistema, mede-se o acerto da faixa — a fração dos casos em que a faixa prevista é a faixa real da hora seguinte — e, nos casos em que o nível corrente é baixo, a precisão, a revocação e a medida F1 da previsão de que a movimentação deixará a faixa baixa, que é a situação em que a previsão retém a atenuação.</w:t>
+        <w:t>O erro médio não diz, por si, se a previsão melhora a decisão: as regras de 3.7 leem a movimentação prevista em três faixas, e um ganho de precisão que não mude a faixa não muda o nível. A camada é, por isso, avaliada também nos termos da decisão. No sistema, o modelo é substituído pela média sazonal calculada apenas com o histórico do próprio ponto — a média do nível na mesma hora das até quatro semanas anteriores, sem treino —, e comparam-se a energia, a janela em transição e os minutos abaixo do nível que a situação pede (3.9). Fora do sistema, mede-se o acerto da faixa — a fração dos casos em que a faixa prevista é a faixa real da hora seguinte — e, nos casos em que o nível corrente é baixo, a precisão, a revocação e a medida F1 da previsão de que a movimentação deixará a faixa baixa, que é a situação em que a previsão retém a atenuação.</w:t>
       </w:r>
     </w:p>
     <w:p>
@@ -16414,19 +16362,7 @@
         <w:rPr>
           <w:lang w:val="pt-BR"/>
         </w:rPr>
-        <w:t xml:space="preserve">A série de Zurique substituiu, depois de obtidos os primeiros resultados, a série horária de pedestres de Melbourne (CITY OF MELBOURNE, 2026), adotada nas versões anteriores, e a troca é declarada por ter sido decidida à vista deles. Com a série horária, o modelo superava as referências no erro, mas, no sistema, a média sazonal do próprio ponto o igualava; um experimento com protocolo fixado antes do treino, sobre a série de Zurique, mostrou que a vantagem do modelo sobre a melhor referência simples aparece na resolução de 15 min e desaparece com os mesmos dados somados por hora (4.6, </w:t>
-      </w:r>
-      <w:r>
-        <w:rPr>
-          <w:lang w:val="pt-BR"/>
-        </w:rPr>
-        <w:t xml:space="preserve">Tabela 4</w:t>
-      </w:r>
-      <w:r>
-        <w:rPr>
-          <w:lang w:val="pt-BR"/>
-        </w:rPr>
-        <w:t xml:space="preserve">). O critério de leitura daquele experimento — superar a melhor referência simples, no período noturno, em ao menos 2 pontos percentuais no acerto da faixa e em ao menos 0,02 na medida F1 — foi mantido para o modelo em operação. Os limiares são critério dos autores, e não valor de norma ou de literatura; o que lhes dá validade é terem sido fixados antes do resultado. Fica, da série de Melbourne, um achado: quando o dado de movimento só existe por hora, o modelo treinado é substituível por uma média sazonal, e a solução entrega menos do que a sua arquitetura permite.</w:t>
+        <w:t>A série de Zurique substituiu, depois de obtidos os primeiros resultados, a série horária de pedestres de Melbourne (CITY OF MELBOURNE, 2026), adotada nas versões anteriores, e a troca é declarada por ter sido decidida à vista deles. Com a série horária, o modelo superava as referências no erro, mas, no sistema, a média sazonal do próprio ponto o igualava; um experimento com protocolo fixado antes do treino, sobre a série de Zurique, mostrou que a vantagem do modelo sobre a melhor referência simples aparece na resolução de 15 min e desaparece com os mesmos dados somados por hora (4.6, Tabela 4). O critério de leitura daquele experimento — superar a melhor referência simples, no período noturno, em ao menos 2 pontos percentuais no acerto da faixa e em ao menos 0,02 na medida F1 — foi mantido para o modelo em operação. Os limiares são critério dos autores, e não valor de norma ou de literatura; o que lhes dá validade é terem sido fixados antes do resultado. Fica, da série de Melbourne, um achado: quando o dado de movimento só existe por hora, o modelo treinado é substituível por uma média sazonal, e a solução entrega menos do que a sua arquitetura permite.</w:t>
       </w:r>
     </w:p>
     <w:p>
@@ -16459,7 +16395,14 @@
         <w:rPr>
           <w:lang w:val="pt-BR"/>
         </w:rPr>
-        <w:t>A decisão é produzida por sistema de inferência nebulosa do tipo Mamdani, cuja construção compreende a definição das variáveis de entrada e de seus conjuntos linguísticos, a formulação da base de regras e o método de agregação e de defuzificação. O Quadro 7 discrimina as variáveis de entrada, entre as quais figura a estimativa produzida pela camada de previsão descrita em 3.6.</w:t>
+        <w:t xml:space="preserve">A decisão é produzida por sistema de inferência nebulosa do tipo Mamdani, cuja construção compreende a definição das variáveis de entrada e de seus conjuntos linguísticos, a formulação da base de regras e o método de agregação e de </w:t>
+      </w:r>
+      <w:r>
+        <w:rPr>
+          <w:lang w:val="pt-BR"/>
+        </w:rPr>
+        <w:lastRenderedPageBreak/>
+        <w:t>defuzificação. O Quadro 7 discrimina as variáveis de entrada, entre as quais figura a estimativa produzida pela camada de previsão descrita em 3.6.</w:t>
       </w:r>
     </w:p>
     <w:p>
@@ -17077,13 +17020,14 @@
         <w:rPr>
           <w:lang w:val="pt-BR"/>
         </w:rPr>
-        <w:t xml:space="preserve">Definidas as variáveis, restam as partições — os conjuntos linguísticos em que o universo de discurso de cada variável contínua é dividido. As variáveis de movimentação, a observada e a prevista, são particionadas em baixa, média e alta, e as fronteiras entre esses conjuntos são fixadas nos tercis da distribuição observada na série adotada, normalizada por ponto de medição. Na série adotada, as fronteiras resultam em 0,069 e 0,295 do nível normalizado, valores assimétricos que refletem a predominância de períodos de baixa circulação. Os dois valores são únicos e calculados sobre todos os blocos de 15 min do treino, de todos os pontos reunidos; no período noturno, em que o sistema decide, 56 % dos blocos do treino ficam na faixa baixa. Os valores não são arbitrados: derivam do dado e são reproduzíveis por qualquer leitor que aplique o mesmo procedimento à mesma série; a escolha dos tercis como critério é dos autores (5.3). A necessidade do critério decorre de uma </w:t>
-      </w:r>
-      <w:r>
-        <w:rPr>
-          <w:lang w:val="pt-BR"/>
-        </w:rPr>
-        <w:t>lacuna da norma: a ABNT NBR 5101 condiciona a classe ao nível de atividade de pedestres e recomenda reduzir a iluminância nos horários de baixa movimentação (subseção 6.3 da norma), mas não fixa valores numéricos que distingam movimentação baixa, média e alta. Os tercis preenchem essa lacuna, e a normalização compara cada trecho com o seu próprio histórico. O número de conjuntos tampouco é arbitrário: corresponde ao número de classes que a norma admite para um mesmo ponto de luz em iluminação adaptativa — a classe da via e até duas imediatamente inferiores (6.10.2) —, de modo que cada conjunto de movimentação se associa a uma classe normativa. Caso a norma venha a admitir mais degraus, a camada de verificação continua a impor o piso lido da tabela de classes, e a ampliação exige apenas nova versão da base de regras, com partição correspondente. É também coerente com a normalização declarada em 3.6 — aplicados sobre o nível normalizado de cada ponto, os mesmos dois valores acompanham o patamar local de circulação, e o que se transfere da série de Zurique continua sendo a estrutura da distribuição, e não o valor absoluto de contagem. As demais variáveis não demandam esse tratamento: ocorrência reportada é categórica, a faixa horária é fixada pelo relógio e a classe de iluminação é atributo do ponto de luz.</w:t>
+        <w:t xml:space="preserve">Definidas as variáveis, restam as partições — os conjuntos linguísticos em que o universo de discurso de cada variável contínua é dividido. As variáveis de movimentação, a observada e a prevista, são particionadas em baixa, média e alta, e as fronteiras entre esses conjuntos são fixadas nos tercis da distribuição observada na série adotada, normalizada por ponto de medição. Na série adotada, as fronteiras resultam em 0,069 e 0,295 do nível normalizado, valores assimétricos que refletem a predominância de períodos de baixa circulação. Os dois valores são únicos e calculados sobre todos os blocos de 15 min do treino, de todos os pontos reunidos; no período noturno, em que o sistema decide, 56 % dos blocos do treino ficam na </w:t>
+      </w:r>
+      <w:r>
+        <w:rPr>
+          <w:lang w:val="pt-BR"/>
+        </w:rPr>
+        <w:lastRenderedPageBreak/>
+        <w:t>faixa baixa. Os valores não são arbitrados: derivam do dado e são reproduzíveis por qualquer leitor que aplique o mesmo procedimento à mesma série; a escolha dos tercis como critério é dos autores (5.3). A necessidade do critério decorre de uma lacuna da norma: a ABNT NBR 5101 condiciona a classe ao nível de atividade de pedestres e recomenda reduzir a iluminância nos horários de baixa movimentação (subseção 6.3 da norma), mas não fixa valores numéricos que distingam movimentação baixa, média e alta. Os tercis preenchem essa lacuna, e a normalização compara cada trecho com o seu próprio histórico. O número de conjuntos tampouco é arbitrário: corresponde ao número de classes que a norma admite para um mesmo ponto de luz em iluminação adaptativa — a classe da via e até duas imediatamente inferiores (6.10.2) —, de modo que cada conjunto de movimentação se associa a uma classe normativa. Caso a norma venha a admitir mais degraus, a camada de verificação continua a impor o piso lido da tabela de classes, e a ampliação exige apenas nova versão da base de regras, com partição correspondente. É também coerente com a normalização declarada em 3.6 — aplicados sobre o nível normalizado de cada ponto, os mesmos dois valores acompanham o patamar local de circulação, e o que se transfere da série de Zurique continua sendo a estrutura da distribuição, e não o valor absoluto de contagem. As demais variáveis não demandam esse tratamento: ocorrência reportada é categórica, a faixa horária é fixada pelo relógio e a classe de iluminação é atributo do ponto de luz.</w:t>
       </w:r>
     </w:p>
     <w:p>
@@ -17091,12 +17035,15 @@
         <w:spacing w:after="120" w:line="360" w:lineRule="auto"/>
         <w:ind w:firstLine="709"/>
         <w:jc w:val="both"/>
-      </w:pPr>
-      <w:r>
-        <w:rPr>
-          <w:lang w:val="pt-BR"/>
-        </w:rPr>
-        <w:t xml:space="preserve">A divisão de responsabilidades entre a norma e os tercis é deliberada. A quantidade de luz que cada via pode receber — o máximo e o mínimo admitidos — é determinada pela classe da via, fixada pelo procedimento da ABNT NBR 5101 a partir do tipo de via e do volume de tráfego, e não pelo sistema. Os tercis decidem apenas em que ponto dessa faixa o nível fica a cada momento: na classe da via, uma abaixo ou na mínima. Eles também não comparam ruas entre si: cada trecho é medido contra o próprio padrão de movimento, aprendido nos últimos 28 dias, de modo que uma avenida e uma rua local com a mesma fração do seu movimento habitual recebem o mesmo degrau, cada uma dentro da sua classe. O que é comum a todas as vias é a régua relativa — a suposição de que os mesmos cortes separam bem o movimento baixo, médio e alto de qualquer trecho —, e essa suposição é declarada entre as limitações (5.3).</w:t>
+        <w:rPr>
+          <w:lang w:val="pt-BR"/>
+        </w:rPr>
+      </w:pPr>
+      <w:r>
+        <w:rPr>
+          <w:lang w:val="pt-BR"/>
+        </w:rPr>
+        <w:t>A divisão de responsabilidades entre a norma e os tercis é deliberada. A quantidade de luz que cada via pode receber — o máximo e o mínimo admitidos — é determinada pela classe da via, fixada pelo procedimento da ABNT NBR 5101 a partir do tipo de via e do volume de tráfego, e não pelo sistema. Os tercis decidem apenas em que ponto dessa faixa o nível fica a cada momento: na classe da via, uma abaixo ou na mínima. Eles também não comparam ruas entre si: cada trecho é medido contra o próprio padrão de movimento, aprendido nos últimos 28 dias, de modo que uma avenida e uma rua local com a mesma fração do seu movimento habitual recebem o mesmo degrau, cada uma dentro da sua classe. O que é comum a todas as vias é a régua relativa — a suposição de que os mesmos cortes separam bem o movimento baixo, médio e alto de qualquer trecho —, e essa suposição é declarada entre as limitações (5.3).</w:t>
       </w:r>
     </w:p>
     <w:p>
@@ -17112,6 +17059,7 @@
         <w:rPr>
           <w:lang w:val="pt-BR"/>
         </w:rPr>
+        <w:lastRenderedPageBreak/>
         <w:t>As funções de pertinência são trapezoidais. O patamar de pertinência plena cobre o interior de cada tercil e as rampas se estendem sobre a vizinhança das fronteiras, de modo que um valor próximo do limite pertença parcialmente aos dois conjuntos adjacentes — comportamento que é precisamente a razão da escolha registrada em 2.6. A meia largura das rampas é um quarto da largura da faixa mais estreita, 0,017 com os tercis adotados, regra fixada na primeira versão da base. Na versão que primeiro adotou os tercis de Zurique, a rampa ficou com valor fixo de 0,05, herdado da série anterior, e o volume de via vazia passou a cair dentro dela; a regra foi restabelecida depois de observado esse efeito, e a ordem é declarada. Com isso, o requisito de projeto ali assumido a partir de Pickering, Cohen e De Baets (2026) fica cumprido em seus três termos: número de regras inspecionável por leitor humano, forma das funções de pertinência declarada e partição do universo de discurso derivada de critério verificável.</w:t>
       </w:r>
     </w:p>
@@ -17128,13 +17076,7 @@
         <w:rPr>
           <w:lang w:val="pt-BR"/>
         </w:rPr>
-        <w:t xml:space="preserve">A saída é expressa em degraus de classe: zero corresponde à classe da via, um à classe imediatamente inferior e dois à classe mínima admitida para dimerização. </w:t>
-      </w:r>
-      <w:r>
-        <w:rPr>
-          <w:lang w:val="pt-BR"/>
-        </w:rPr>
-        <w:t>Os três conjuntos de saída são simétricos em torno de cada degrau, de modo que uma regra ativada isoladamente produz exatamente a classe correspondente, e a combinação de regras, um degrau intermediário. O degrau é convertido em fração contínua do fluxo pleno por interpolação linear entre as iluminâncias das classes, lidas da tabela de classes (RF09): para a classe P3, os degraus valem 1,0, 0,75 e 0,5 do pleno, isto é, as classes P3, P4 e P5 do Quadro 8, e nenhum desses valores reside no código. Classes com menos degraus disponíveis os repetem, e uma classe não dimerizável permanece sempre no pleno. O piso continua a ser imposto pela camada de verificação, que o lê da mesma tabela e não depende da inferência, o que torna contável, no registro, cada correção que a verificação impõe.</w:t>
+        <w:t>A saída é expressa em degraus de classe: zero corresponde à classe da via, um à classe imediatamente inferior e dois à classe mínima admitida para dimerização. Os três conjuntos de saída são simétricos em torno de cada degrau, de modo que uma regra ativada isoladamente produz exatamente a classe correspondente, e a combinação de regras, um degrau intermediário. O degrau é convertido em fração contínua do fluxo pleno por interpolação linear entre as iluminâncias das classes, lidas da tabela de classes (RF09): para a classe P3, os degraus valem 1,0, 0,75 e 0,5 do pleno, isto é, as classes P3, P4 e P5 do Quadro 8, e nenhum desses valores reside no código. Classes com menos degraus disponíveis os repetem, e uma classe não dimerizável permanece sempre no pleno. O piso continua a ser imposto pela camada de verificação, que o lê da mesma tabela e não depende da inferência, o que torna contável, no registro, cada correção que a verificação impõe.</w:t>
       </w:r>
     </w:p>
     <w:p>
@@ -17166,13 +17108,14 @@
         <w:rPr>
           <w:lang w:val="pt-BR"/>
         </w:rPr>
-        <w:t xml:space="preserve">O método é o de Mamdani na forma usual: conjunção e implicação pelo mínimo, agregação pelo máximo e defuzificação pelo centroide (MAMDANI; ASSILIAN, 1975). A base vigente tem sete regras. Três mantêm a classe da via: a ocorrência reportada, a movimentação observada alta e a movimentação prevista alta, por antecipação. Quatro descem de classe, e todas exigem ausência de ocorrência: a movimentação observada média conduz a uma classe abaixo; a observada baixa com previsão baixa, à classe mínima; a observada baixa com previsão média, a uma classe abaixo; e a observada baixa no início da noite, a uma classe abaixo, como evidência de apoio. A evidência de risco não é diluída na agregação por uma regra de redução ativa ao mesmo tempo — restrição deliberada de interpretabilidade, na linha de Pickering, Cohen e De Baets (2026). A faixa horária é medida em horas desde as 18 h e dividida em início da noite, madrugada e pré-amanhecer. Se nenhuma regra for ativada, o nível pretendido é o pleno; com a base vigente, isso ocorre apenas quando falta o volume do trecho, porque falta de informação nunca produz atenuação. Qualquer alteração da base gera nova versão, identificada pelo conteúdo do arquivo, e cada decisão registra a versão que a produziu. A base vigente sucede duas versões. A primeira, de oito regras, já decidia pelo volume, mas exprimia a saída em frações fixas do pleno, que não correspondiam a classe alguma. A segunda levava ao pleno qualquer pedestre presente e foi abandonada por ir além da norma: a classe mínima admitida </w:t>
-      </w:r>
-      <w:r>
-        <w:rPr>
-          <w:lang w:val="pt-BR"/>
-        </w:rPr>
-        <w:t>é, ela própria, classe de pedestres, com iluminância vertical mínima destinada ao reconhecimento facial (Quadro 8), de modo que uma pessoa numa via de pouco movimento está atendida nela, e exigir o pleno retirava da atenuação o seu sentido. Depois, a troca da série de treino (3.6) mudou os tercis e a largura das rampas, sem mudar as sete regras. Cada decisão grava ainda as entradas da inferência e o grau com que cada regra foi ativada, o que permite explicá-la regra a regra.</w:t>
+        <w:t xml:space="preserve">O método é o de Mamdani na forma usual: conjunção e implicação pelo mínimo, agregação pelo máximo e defuzificação pelo centroide (MAMDANI; ASSILIAN, 1975). A base vigente tem sete regras. Três mantêm a classe da via: a ocorrência reportada, a movimentação observada alta e a movimentação prevista alta, por antecipação. </w:t>
+      </w:r>
+      <w:r>
+        <w:rPr>
+          <w:lang w:val="pt-BR"/>
+        </w:rPr>
+        <w:lastRenderedPageBreak/>
+        <w:t>Quatro descem de classe, e todas exigem ausência de ocorrência: a movimentação observada média conduz a uma classe abaixo; a observada baixa com previsão baixa, à classe mínima; a observada baixa com previsão média, a uma classe abaixo; e a observada baixa no início da noite, a uma classe abaixo, como evidência de apoio. A evidência de risco não é diluída na agregação por uma regra de redução ativa ao mesmo tempo — restrição deliberada de interpretabilidade, na linha de Pickering, Cohen e De Baets (2026). A faixa horária é medida em horas desde as 18 h e dividida em início da noite, madrugada e pré-amanhecer. Se nenhuma regra for ativada, o nível pretendido é o pleno; com a base vigente, isso ocorre apenas quando falta o volume do trecho, porque falta de informação nunca produz atenuação. Qualquer alteração da base gera nova versão, identificada pelo conteúdo do arquivo, e cada decisão registra a versão que a produziu. A base vigente sucede duas versões. A primeira, de oito regras, já decidia pelo volume, mas exprimia a saída em frações fixas do pleno, que não correspondiam a classe alguma. A segunda levava ao pleno qualquer pedestre presente e foi abandonada por ir além da norma: a classe mínima admitida é, ela própria, classe de pedestres, com iluminância vertical mínima destinada ao reconhecimento facial (Quadro 8), de modo que uma pessoa numa via de pouco movimento está atendida nela, e exigir o pleno retirava da atenuação o seu sentido. Depois, a troca da série de treino (3.6) mudou os tercis e a largura das rampas, sem mudar as sete regras. Cada decisão grava ainda as entradas da inferência e o grau com que cada regra foi ativada, o que permite explicá-la regra a regra.</w:t>
       </w:r>
     </w:p>
     <w:p>
@@ -17204,7 +17147,14 @@
         <w:rPr>
           <w:lang w:val="pt-BR"/>
         </w:rPr>
-        <w:t>A composição das regras oferece também proteção contra erro de contagem da plataforma. Um volume baixo não basta para levar o nível à classe mínima: se a movimentação prevista para o trecho for alta, a regra de antecipação mantém a classe da via; se for média, o nível permanece uma classe abaixo; só com a previsão também baixa a atenuação se completa. A previsão opera, assim, como segunda evidência, independente da contagem do período, e a atenuação máxima exige que as duas concordem. A precisão da contagem produzida pela plataforma não é avaliada neste trabalho; o que a arquitetura assegura é que um erro dessa contagem resulte, no pior caso, em nível dentro da faixa admitida pela norma, alcançado sob a rampa normativa. Essa função é medida em 3.9, com a contagem falhando deliberadamente, e o Capítulo 4 reporta também o que ocorre quando a previsão vem de uma média sazonal, em lugar do modelo treinado.</w:t>
+        <w:t xml:space="preserve">A composição das regras oferece também proteção contra erro de contagem da plataforma. Um volume baixo não basta para levar o nível à classe mínima: se a movimentação prevista para o trecho for alta, a regra de antecipação mantém a classe da via; se for média, o nível permanece uma classe abaixo; só com a previsão também baixa a atenuação se completa. A previsão opera, assim, como segunda evidência, </w:t>
+      </w:r>
+      <w:r>
+        <w:rPr>
+          <w:lang w:val="pt-BR"/>
+        </w:rPr>
+        <w:lastRenderedPageBreak/>
+        <w:t>independente da contagem do período, e a atenuação máxima exige que as duas concordem. A precisão da contagem produzida pela plataforma não é avaliada neste trabalho; o que a arquitetura assegura é que um erro dessa contagem resulte, no pior caso, em nível dentro da faixa admitida pela norma, alcançado sob a rampa normativa. Essa função é medida em 3.9, com a contagem falhando deliberadamente, e o Capítulo 4 reporta também o que ocorre quando a previsão vem de uma média sazonal, em lugar do modelo treinado.</w:t>
       </w:r>
     </w:p>
     <w:p>
@@ -17220,13 +17170,7 @@
         <w:rPr>
           <w:lang w:val="pt-BR"/>
         </w:rPr>
-        <w:t xml:space="preserve">A escolha foi confrontada com a alternativa mais simples: a mesma base, com os mesmos tercis, operando como tabela em degraus, sem pertinência parcial. Na suíte de cenários, as duas empatam em segurança, aderência ao envelope e energia. A diferença aparece quando o volume oscila em torno de uma fronteira: a tabela salta entre classes em degraus inteiros, e a inferência nebulosa responde com ajustes menores e mais frequentes. O trabalho não fundamenta a escolha em economia de energia; fundamenta-a na legibilidade da base, com os números reportados no Capítulo 4. A comparação foi depois repetida em seis cenários construídos só para </w:t>
-      </w:r>
-      <w:r>
-        <w:rPr>
-          <w:lang w:val="pt-BR"/>
-        </w:rPr>
-        <w:t>essa região, com o volume sorteado em torno de cada tercil e critério fixado antes da execução: a inferência nebulosa só seria considerada não substituível se apresentasse, ao mesmo tempo, menor variação total e menos inversões de sentido que a tabela. Não apresentou: reduziu a variação total e os saltos bruscos, e inverteu o sentido mais vezes (4.6). O trabalho declara, por isso, que a pertinência parcial é a forma de expressão e de execução da base de regras, com efeito medido na suavidade da resposta, e não componente cuja retirada degrade a segurança ou o consumo. Um último confronto empregou noites reais com contagem de 15 min, contou apenas as mudanças de nível perceptíveis e incluiu uma tabela com histerese de descida; também nele a inferência nebulosa não superou as tabelas (4.6).</w:t>
+        <w:t>A escolha foi confrontada com a alternativa mais simples: a mesma base, com os mesmos tercis, operando como tabela em degraus, sem pertinência parcial. Na suíte de cenários, as duas empatam em segurança, aderência ao envelope e energia. A diferença aparece quando o volume oscila em torno de uma fronteira: a tabela salta entre classes em degraus inteiros, e a inferência nebulosa responde com ajustes menores e mais frequentes. O trabalho não fundamenta a escolha em economia de energia; fundamenta-a na legibilidade da base, com os números reportados no Capítulo 4. A comparação foi depois repetida em seis cenários construídos só para essa região, com o volume sorteado em torno de cada tercil e critério fixado antes da execução: a inferência nebulosa só seria considerada não substituível se apresentasse, ao mesmo tempo, menor variação total e menos inversões de sentido que a tabela. Não apresentou: reduziu a variação total e os saltos bruscos, e inverteu o sentido mais vezes (4.6). O trabalho declara, por isso, que a pertinência parcial é a forma de expressão e de execução da base de regras, com efeito medido na suavidade da resposta, e não componente cuja retirada degrade a segurança ou o consumo. Um último confronto empregou noites reais com contagem de 15 min, contou apenas as mudanças de nível perceptíveis e incluiu uma tabela com histerese de descida; também nele a inferência nebulosa não superou as tabelas (4.6).</w:t>
       </w:r>
     </w:p>
     <w:p>
@@ -17282,7 +17226,14 @@
         <w:rPr>
           <w:lang w:val="pt-BR"/>
         </w:rPr>
-        <w:t>Taxa de variação: a transição entre o nível corrente e o nível decidido é rampeada de modo a não exceder a taxa máxima de decréscimo estabelecida pela norma. O restabelecimento do fluxo não está sujeito a essa limitação, o que é coerente com a função de segurança da iluminação. A rampa é executada pelo nó, a partir do nível que ele de fato aplica, um passo a cada 5 s, com queda de 0,008 do fluxo pleno por passo, a taxa arredondada para baixo, o que respeita por construção o limite de um décimo por minuto. O serviço verifica o piso do nível-alvo e envia, com o comando, o piso e a taxa da classe; o nó aplica a mesma regra de cálculo, com os mesmos arredondamentos, e não desce abaixo do piso recebido, o que torna a verificação de piso dupla, no serviço e no nó.</w:t>
+        <w:t xml:space="preserve">Taxa de variação: a transição entre o nível corrente e o nível decidido é rampeada de modo a não exceder a taxa máxima de decréscimo </w:t>
+      </w:r>
+      <w:r>
+        <w:rPr>
+          <w:lang w:val="pt-BR"/>
+        </w:rPr>
+        <w:lastRenderedPageBreak/>
+        <w:t>estabelecida pela norma. O restabelecimento do fluxo não está sujeito a essa limitação, o que é coerente com a função de segurança da iluminação. A rampa é executada pelo nó, a partir do nível que ele de fato aplica, um passo a cada 5 s, com queda de 0,008 do fluxo pleno por passo, a taxa arredondada para baixo, o que respeita por construção o limite de um décimo por minuto. O serviço verifica o piso do nível-alvo e envia, com o comando, o piso e a taxa da classe; o nó aplica a mesma regra de cálculo, com os mesmos arredondamentos, e não desce abaixo do piso recebido, o que torna a verificação de piso dupla, no serviço e no nó.</w:t>
       </w:r>
     </w:p>
     <w:p>
@@ -17298,13 +17249,7 @@
         <w:rPr>
           <w:lang w:val="pt-BR"/>
         </w:rPr>
-        <w:t xml:space="preserve">O serviço verifica o piso: o nível-alvo emitido é o maior entre o pretendido e o piso, e registra-se como restrição aplicada o piso, quando houve correção, ou nenhuma. O valor taxa permanece no domínio da restrição para os registros anteriores à arquitetura de 3.5.2, em que o serviço conduzia a rampa. A taxa é aplicada pelo nó, a cada passo, pela mesma regra de cálculo (3.4). A camada é, por construção, não decrescente em relação ao nível pretendido — nunca devolve nível menor que o </w:t>
-      </w:r>
-      <w:r>
-        <w:rPr>
-          <w:lang w:val="pt-BR"/>
-        </w:rPr>
-        <w:t>pedido pela inferência —, e essa propriedade é conferida a cada decisão, e não apenas afirmada. O nível é representado com três casas decimais, do serviço ao banco, e os arredondamentos são sempre no sentido seguro: o piso para cima e a queda admitida para baixo. A taxa, prescrita pela norma de forma geral e não por classe, é gravada como atributo de cada classe, conforme o Quadro 16.</w:t>
+        <w:t>O serviço verifica o piso: o nível-alvo emitido é o maior entre o pretendido e o piso, e registra-se como restrição aplicada o piso, quando houve correção, ou nenhuma. O valor taxa permanece no domínio da restrição para os registros anteriores à arquitetura de 3.5.2, em que o serviço conduzia a rampa. A taxa é aplicada pelo nó, a cada passo, pela mesma regra de cálculo (3.4). A camada é, por construção, não decrescente em relação ao nível pretendido — nunca devolve nível menor que o pedido pela inferência —, e essa propriedade é conferida a cada decisão, e não apenas afirmada. O nível é representado com três casas decimais, do serviço ao banco, e os arredondamentos são sempre no sentido seguro: o piso para cima e a queda admitida para baixo. A taxa, prescrita pela norma de forma geral e não por classe, é gravada como atributo de cada classe, conforme o Quadro 16.</w:t>
       </w:r>
     </w:p>
     <w:p>
@@ -17336,7 +17281,14 @@
         <w:rPr>
           <w:lang w:val="pt-BR"/>
         </w:rPr>
-        <w:t>A mesma lógica é estendida ao serviço. O volume publicado vale por 15 min, três períodos de publicação; vencido sem renovação, o serviço decide o nível pleno na varredura seguinte e o publica, de modo que a ausência de dado fica registrada como decisão, e não desaparece da auditoria; o comando anterior, cuja validade acompanha a do volume, já terá levado o nó ao pleno. A ocorrência vale até que a plataforma publique o seu encerramento ou até vencer a vigência informada, o que vier primeiro; em cada trecho, prevalece a publicação mais recente de cada tipo. Falta de informação nunca produz atenuação.</w:t>
+        <w:t xml:space="preserve">A mesma lógica é estendida ao serviço. O volume publicado vale por 15 min, três períodos de publicação; vencido sem renovação, o serviço decide o nível pleno na varredura seguinte e o publica, de modo que a ausência de dado fica registrada como decisão, e não desaparece da auditoria; o comando anterior, cuja validade acompanha a do volume, já terá levado o nó ao pleno. A ocorrência vale até que a plataforma publique o seu encerramento ou até vencer a vigência informada, o que </w:t>
+      </w:r>
+      <w:r>
+        <w:rPr>
+          <w:lang w:val="pt-BR"/>
+        </w:rPr>
+        <w:lastRenderedPageBreak/>
+        <w:t>vier primeiro; em cada trecho, prevalece a publicação mais recente de cada tipo. Falta de informação nunca produz atenuação.</w:t>
       </w:r>
     </w:p>
     <w:p>
@@ -17385,13 +17337,7 @@
         <w:rPr>
           <w:lang w:val="pt-BR"/>
         </w:rPr>
-        <w:t xml:space="preserve">A verificação de conformidade exige a fixação prévia de uma classe, determinada pelo procedimento da ABNT NBR 5101 e não arbitrada. Adota-se como cenário de referência a calçada de via urbana local, para a qual os parâmetros </w:t>
-      </w:r>
-      <w:r>
-        <w:rPr>
-          <w:lang w:val="pt-BR"/>
-        </w:rPr>
-        <w:t>normativos assumem os seguintes valores: velocidade baixa, inferior a 30 km/h; volume de tráfego moderado; composição com pedestres e veículos motorizados; presença de veículos estacionados; e luminância de ambiente moderada. A soma dos fatores de ponderação conduz, pela equação normativa de seleção, à classe P3.</w:t>
+        <w:t>A verificação de conformidade exige a fixação prévia de uma classe, determinada pelo procedimento da ABNT NBR 5101 e não arbitrada. Adota-se como cenário de referência a calçada de via urbana local, para a qual os parâmetros normativos assumem os seguintes valores: velocidade baixa, inferior a 30 km/h; volume de tráfego moderado; composição com pedestres e veículos motorizados; presença de veículos estacionados; e luminância de ambiente moderada. A soma dos fatores de ponderação conduz, pela equação normativa de seleção, à classe P3.</w:t>
       </w:r>
     </w:p>
     <w:p>
@@ -17908,6 +17854,7 @@
                 <w:sz w:val="20"/>
                 <w:szCs w:val="20"/>
               </w:rPr>
+              <w:lastRenderedPageBreak/>
               <w:t>P6 (</w:t>
             </w:r>
             <w:proofErr w:type="spellStart"/>
@@ -18127,7 +18074,14 @@
         <w:rPr>
           <w:lang w:val="pt-BR"/>
         </w:rPr>
-        <w:t xml:space="preserve">Etapa 5 — Medição do percurso físico e verificação do diagnóstico. Para um conjunto de transições de nível, mede-se a latência entre a publicação do dado na interface e a estabilização da iluminância no valor correspondente, reportada como distribuição sobre repetições independentes, com o número de repetições explicitado. A latência medida vai da publicação do evento à chegada da telemetria e inclui, portanto, a leitura de confirmação do sensor, posterior à aplicação do ciclo de trabalho; é, assim, limite superior da grandeza do RNF03. Na mesma bancada verificam-se as funções de diagnóstico descritas em 3.4.5, com a falha do ponto de luz induzida deliberadamente e a divergência entre o nível comandado e o entregue apurada ao longo dos cenários. </w:t>
+        <w:t xml:space="preserve">Etapa 5 — Medição do percurso físico e verificação do diagnóstico. Para um conjunto de transições de nível, mede-se a latência entre a publicação </w:t>
+      </w:r>
+      <w:r>
+        <w:rPr>
+          <w:lang w:val="pt-BR"/>
+        </w:rPr>
+        <w:lastRenderedPageBreak/>
+        <w:t xml:space="preserve">do dado na interface e a estabilização da iluminância no valor correspondente, reportada como distribuição sobre repetições independentes, com o número de repetições explicitado. A latência medida vai da publicação do evento à chegada da telemetria e inclui, portanto, a leitura de confirmação do sensor, posterior à aplicação do ciclo de trabalho; é, assim, limite superior da grandeza do RNF03. Na mesma bancada verificam-se as funções de diagnóstico descritas em 3.4.5, com a falha do ponto de luz induzida deliberadamente e a divergência entre o nível comandado e o entregue apurada ao longo dos cenários. </w:t>
       </w:r>
       <w:proofErr w:type="spellStart"/>
       <w:r>
@@ -18220,13 +18174,7 @@
         <w:rPr>
           <w:lang w:val="pt-BR"/>
         </w:rPr>
-        <w:t xml:space="preserve">Etapa 7 — Estimativa de consumo e comparação de regimes. Integra-se a trajetória de ciclo de trabalho registrada em cada cenário, calcula-se a </w:t>
-      </w:r>
-      <w:r>
-        <w:rPr>
-          <w:lang w:val="pt-BR"/>
-        </w:rPr>
-        <w:t>energia estimada para o regime adaptativo e para as duas linhas de base e reporta-se, ao lado de cada valor, a aderência ao envelope esperado, conforme 3.11. Produz o objetivo específico i).</w:t>
+        <w:t>Etapa 7 — Estimativa de consumo e comparação de regimes. Integra-se a trajetória de ciclo de trabalho registrada em cada cenário, calcula-se a energia estimada para o regime adaptativo e para as duas linhas de base e reporta-se, ao lado de cada valor, a aderência ao envelope esperado, conforme 3.11. Produz o objetivo específico i).</w:t>
       </w:r>
     </w:p>
     <w:p>
@@ -18258,6 +18206,7 @@
         <w:rPr>
           <w:lang w:val="pt-BR"/>
         </w:rPr>
+        <w:lastRenderedPageBreak/>
         <w:t>Uma avaliação adicional pergunta o que o sistema perde sem cada componente de inteligência artificial, e se algo mais simples o substituiria. Os protocolos — cenários, sementes, métricas e regras de leitura — foram fixados e versionados no repositório antes de cada execução, e os resultados são reportados como vieram. Retirar a previsão é operar no modo reativo; retirar a inferência é voltar à programação por horário fixo; substituir o modelo treinado é empregar a média sazonal de 3.6; substituir a pertinência parcial é operar a mesma base como tabela. Os cenários são de três tipos: oito noites reais da série de Zurique, em 15 min, das 18 h às 6 h, no período de teste do modelo, de quatro pontos sorteados, dois entre os mais movimentados à noite e dois entre os menos, cada um com uma noite de dia útil e uma de sábado; dois pares sintéticos em que a contagem cai a zero por duas horas com a via ocupada, um no início da noite e outro na madrugada, comparados com o mesmo cenário sem a falha; e seis cenários com o volume sorteado em torno de cada tercil.</w:t>
       </w:r>
     </w:p>
@@ -18274,13 +18223,7 @@
         <w:rPr>
           <w:lang w:val="pt-BR"/>
         </w:rPr>
-        <w:t xml:space="preserve">Às métricas anteriores acrescentam-se quatro. A primeira é o déficit: os minutos em que o nível fica mais de 0,02 abaixo do que a situação pede — a classe da via, sob ocorrência ou volume alto, e uma classe abaixo, sob volume médio, pelo critério dos tercis de 3.7. A segunda é o acerto da contenção: dos ciclos em que a previsão </w:t>
-      </w:r>
-      <w:r>
-        <w:rPr>
-          <w:lang w:val="pt-BR"/>
-        </w:rPr>
-        <w:t>mantém o nível acima do modo reativo, a fração em que o volume real da hora seguinte saiu da faixa baixa. A terceira é a luz perdida pela falha de contagem, diferença média de nível entre o cenário sem falha e o cenário com falha. A quarta descreve a forma da resposta: variação total do nível, inversões de sentido e subidas de ao menos 0,1 em um passo. A série de Zurique é de 15 min, e nesses cenários o volume de 5 min repete o valor do bloco, limitação que 5.3 registra. A linha de base de horário fixo é avaliada no horário local do ponto de luz. O Apêndice B indica, para cada resultado, o programa, os dados e o comando que o reproduzem.</w:t>
+        <w:t>Às métricas anteriores acrescentam-se quatro. A primeira é o déficit: os minutos em que o nível fica mais de 0,02 abaixo do que a situação pede — a classe da via, sob ocorrência ou volume alto, e uma classe abaixo, sob volume médio, pelo critério dos tercis de 3.7. A segunda é o acerto da contenção: dos ciclos em que a previsão mantém o nível acima do modo reativo, a fração em que o volume real da hora seguinte saiu da faixa baixa. A terceira é a luz perdida pela falha de contagem, diferença média de nível entre o cenário sem falha e o cenário com falha. A quarta descreve a forma da resposta: variação total do nível, inversões de sentido e subidas de ao menos 0,1 em um passo. A série de Zurique é de 15 min, e nesses cenários o volume de 5 min repete o valor do bloco, limitação que 5.3 registra. A linha de base de horário fixo é avaliada no horário local do ponto de luz. O Apêndice B indica, para cada resultado, o programa, os dados e o comando que o reproduzem.</w:t>
       </w:r>
     </w:p>
     <w:p>
@@ -18296,7 +18239,14 @@
         <w:rPr>
           <w:lang w:val="pt-BR"/>
         </w:rPr>
-        <w:t>Um último confronto trata só da forma da resposta, com dado real de resolução sub-horária. São oito noites reais da série de 15 min de Zurique (3.6), do ano de teste, de quatro pontos em sorteio próprio, distinto do da avaliação anterior, e três concorrentes com a mesma previsão e as mesmas regras: a inferência nebulosa, a tabela em degraus e uma tabela com histerese de descida, que sobe de faixa no tercil, na hora, e só desce quando o volume cai 0,05 abaixo dele — a correção simples que se aplicaria à tabela. Conta-se o número de passos do ciclo em que o nível emitido varia, em relação ao anterior, ao menos um limiar de percepção. O protocolo fixou dois limiares, de 15 % e de 6 %. Conferidas as fontes depois da execução, só o de 6 % tem apoio direto na literatura: é o valor acima do qual um aumento de iluminância é percebido por observador atento (SHIKAKURA; MORIKAWA; NAKAMURA, 2003). Reporta-se também, como conferência posterior, o de 30 %, que a mesma fonte indica para observador ocupado em tarefa. O estudo foi conduzido em ambiente de escritório, com iluminâncias muito superiores às de uma via; não se localizou valor medido para via pública. O critério, fixado antes da execução, considera a inferência nebulosa não substituível se apresentar ao menos 20 % menos mudanças perceptíveis que a melhor das tabelas, nos dois limiares, sem consumir mais de 2 pontos percentuais de energia além dela e sem mais minutos abaixo do nível pedido. Nesses cenários a previsão é a do modelo em operação, e ela é a mesma para os três concorrentes.</w:t>
+        <w:t xml:space="preserve">Um último confronto trata só da forma da resposta, com dado real de resolução sub-horária. São oito noites reais da série de 15 min de Zurique (3.6), do ano de teste, de quatro pontos em sorteio próprio, distinto do da avaliação anterior, e três concorrentes com a mesma previsão e as mesmas regras: a inferência nebulosa, a tabela em degraus e uma tabela com histerese de descida, que sobe de faixa no tercil, na hora, e só desce quando o volume cai 0,05 abaixo dele — a correção simples que se aplicaria à tabela. Conta-se o número de passos do ciclo em que o nível emitido </w:t>
+      </w:r>
+      <w:r>
+        <w:rPr>
+          <w:lang w:val="pt-BR"/>
+        </w:rPr>
+        <w:lastRenderedPageBreak/>
+        <w:t>varia, em relação ao anterior, ao menos um limiar de percepção. O protocolo fixou dois limiares, de 15 % e de 6 %. Conferidas as fontes depois da execução, só o de 6 % tem apoio direto na literatura: é o valor acima do qual um aumento de iluminância é percebido por observador atento (SHIKAKURA; MORIKAWA; NAKAMURA, 2003). Reporta-se também, como conferência posterior, o de 30 %, que a mesma fonte indica para observador ocupado em tarefa. O estudo foi conduzido em ambiente de escritório, com iluminâncias muito superiores às de uma via; não se localizou valor medido para via pública. O critério, fixado antes da execução, considera a inferência nebulosa não substituível se apresentar ao menos 20 % menos mudanças perceptíveis que a melhor das tabelas, nos dois limiares, sem consumir mais de 2 pontos percentuais de energia além dela e sem mais minutos abaixo do nível pedido. Nesses cenários a previsão é a do modelo em operação, e ela é a mesma para os três concorrentes.</w:t>
       </w:r>
     </w:p>
     <w:p>
@@ -18312,13 +18262,7 @@
         <w:rPr>
           <w:lang w:val="pt-BR"/>
         </w:rPr>
-        <w:t xml:space="preserve">Cabe explicitar a natureza do envelope de decisão esperado e a limitação que dele decorre. O envelope é o intervalo de níveis considerados aceitáveis para cada cenário, definido pelos autores antes da avaliação e derivado, sempre que possível, das prescrições normativas e da literatura. Onde essa derivação não é possível, o envelope reflete julgamento dos autores, e a avaliação mede, nesses casos, a </w:t>
-      </w:r>
-      <w:r>
-        <w:rPr>
-          <w:lang w:val="pt-BR"/>
-        </w:rPr>
-        <w:t>coerência entre a base de regras e esse julgamento — não a correção da decisão em sentido absoluto. A declaração é necessária porque a alternativa, calar sobre a origem do envelope, apresentaria como validação externa aquilo que é, em parte, consistência interna.</w:t>
+        <w:t>Cabe explicitar a natureza do envelope de decisão esperado e a limitação que dele decorre. O envelope é o intervalo de níveis considerados aceitáveis para cada cenário, definido pelos autores antes da avaliação e derivado, sempre que possível, das prescrições normativas e da literatura. Onde essa derivação não é possível, o envelope reflete julgamento dos autores, e a avaliação mede, nesses casos, a coerência entre a base de regras e esse julgamento — não a correção da decisão em sentido absoluto. A declaração é necessária porque a alternativa, calar sobre a origem do envelope, apresentaria como validação externa aquilo que é, em parte, consistência interna.</w:t>
       </w:r>
     </w:p>
     <w:p>
@@ -18380,6 +18324,7 @@
         <w:rPr>
           <w:lang w:val="pt-BR"/>
         </w:rPr>
+        <w:lastRenderedPageBreak/>
         <w:t xml:space="preserve">O sistema não captura, não processa e não armazena imagem, som ou qualquer dado que permita identificar pessoa. </w:t>
       </w:r>
       <w:r>
@@ -18519,13 +18464,7 @@
         <w:rPr>
           <w:lang w:val="pt-BR"/>
         </w:rPr>
-        <w:t xml:space="preserve">Registra-se que a plataforma tomada como referência de infraestrutura opera tecnologias de reconhecimento facial e de leitura de placas, que constituem </w:t>
-      </w:r>
-      <w:r>
-        <w:rPr>
-          <w:lang w:val="pt-BR"/>
-        </w:rPr>
-        <w:t>tratamento de dado pessoal sujeito à Lei Geral de Proteção de Dados Pessoais (BRASIL, 2018). O presente trabalho não acessa, não reproduz e não depende dessas funcionalidades: a informação que o sistema consome é a descrição agregada do estado da via. Essa distinção é relevante também para a proposta de integração: o que se propõe consumir é o alerta de evento e a contagem agregada, e não o conteúdo de imagem ou a identificação de pessoas. Uma integração efetiva exigiria tratamento jurídico próprio, registrado entre as limitações.</w:t>
+        <w:t>Registra-se que a plataforma tomada como referência de infraestrutura opera tecnologias de reconhecimento facial e de leitura de placas, que constituem tratamento de dado pessoal sujeito à Lei Geral de Proteção de Dados Pessoais (BRASIL, 2018). O presente trabalho não acessa, não reproduz e não depende dessas funcionalidades: a informação que o sistema consome é a descrição agregada do estado da via. Essa distinção é relevante também para a proposta de integração: o que se propõe consumir é o alerta de evento e a contagem agregada, e não o conteúdo de imagem ou a identificação de pessoas. Uma integração efetiva exigiria tratamento jurídico próprio, registrado entre as limitações.</w:t>
       </w:r>
     </w:p>
     <w:p>
@@ -18541,19 +18480,14 @@
         <w:rPr>
           <w:lang w:val="pt-BR"/>
         </w:rPr>
-        <w:t xml:space="preserve">O risco de desvio de finalidade não é hipotético, e há caso documentado que convém registrar. Em San Diego, nos Estados Unidos, </w:t>
-      </w:r>
-      <w:r>
-        <w:rPr>
-          <w:lang w:val="pt-BR"/>
-        </w:rPr>
-        <w:t xml:space="preserve">cerca de três mil e trezentos postes receberam sensores e câmeras cuja finalidade principal declarada era coletar dados para a gestão da cidade, e não o policiamento. A partir de agosto de 2018 o departamento de polícia passou a acessar as imagens, chegando a quase quatrocentos acessos até meados de 2020, sob alegação de crimes graves, lista que incluía vandalismo e descarte irregular de resíduos; a reação pública levou a pedidos de moratória e a uma proposta de norma municipal de vigilância, ainda em discussão em meados de 2020 (PERRY, 2020).</w:t>
-      </w:r>
-      <w:r>
-        <w:rPr>
-          <w:lang w:val="pt-BR"/>
-        </w:rPr>
-        <w:t xml:space="preserve"> O episódio é a razão pela qual a fronteira entre dado agregado e dado de identificação, neste trabalho, é requisito de interface e não recomendação de uso.</w:t>
+        <w:t xml:space="preserve">O risco de desvio de finalidade não é hipotético, e há caso documentado que convém registrar. Em San Diego, nos Estados Unidos, cerca de três mil e trezentos postes receberam sensores e câmeras cuja finalidade principal declarada era coletar dados para a gestão da cidade, e não o policiamento. A partir de agosto de 2018 o departamento de polícia passou a acessar as imagens, chegando a quase quatrocentos acessos até meados de 2020, sob alegação de crimes graves, lista que incluía vandalismo e descarte irregular de resíduos; a reação pública levou a pedidos de moratória e a uma proposta de norma municipal de vigilância, ainda em discussão em meados de 2020 (PERRY, 2020). O episódio é a razão pela qual a fronteira entre </w:t>
+      </w:r>
+      <w:r>
+        <w:rPr>
+          <w:lang w:val="pt-BR"/>
+        </w:rPr>
+        <w:lastRenderedPageBreak/>
+        <w:t>dado agregado e dado de identificação, neste trabalho, é requisito de interface e não recomendação de uso.</w:t>
       </w:r>
     </w:p>
     <w:p>
@@ -18602,25 +18536,7 @@
         <w:rPr>
           <w:lang w:val="pt-BR"/>
         </w:rPr>
-        <w:t xml:space="preserve">A avaliação energética não emprega instrumentação elétrica: emprega o registro que o sistema já produz. A fita de LED adotada declara potência por unidade de comprimento, e o comprimento do segmento é fixado por medição conforme 3.4.2, </w:t>
-      </w:r>
-      <w:r>
-        <w:rPr>
-          <w:lang w:val="pt-BR"/>
-        </w:rPr>
-        <w:t xml:space="preserve">de modo que a potência a ciclo de trabalho pleno é conhecida. </w:t>
-      </w:r>
-      <w:r>
-        <w:rPr>
-          <w:lang w:val="pt-BR"/>
-        </w:rPr>
-        <w:t xml:space="preserve">O nível aplicado em cada passo da rampa é registrado pelo nó na sua saída serial, e o ciclo de trabalho correspondente decorre da tabela de calibração; a telemetria, gravada conforme o modelo de dados de 3.13.1, só ocorre quando chega um comando e não cobre os passos intermediários.</w:t>
-      </w:r>
-      <w:r>
-        <w:rPr>
-          <w:lang w:val="pt-BR"/>
-        </w:rPr>
-        <w:t xml:space="preserve"> A energia consumida em um cenário é, então, a soma dos produtos entre a potência plena, o ciclo de trabalho de cada intervalo e a duração desse intervalo.</w:t>
+        <w:t>A avaliação energética não emprega instrumentação elétrica: emprega o registro que o sistema já produz. A fita de LED adotada declara potência por unidade de comprimento, e o comprimento do segmento é fixado por medição conforme 3.4.2, de modo que a potência a ciclo de trabalho pleno é conhecida. O nível aplicado em cada passo da rampa é registrado pelo nó na sua saída serial, e o ciclo de trabalho correspondente decorre da tabela de calibração; a telemetria, gravada conforme o modelo de dados de 3.13.1, só ocorre quando chega um comando e não cobre os passos intermediários. A energia consumida em um cenário é, então, a soma dos produtos entre a potência plena, o ciclo de trabalho de cada intervalo e a duração desse intervalo.</w:t>
       </w:r>
     </w:p>
     <w:p>
@@ -18636,7 +18552,14 @@
         <w:rPr>
           <w:lang w:val="pt-BR"/>
         </w:rPr>
-        <w:t>A hipótese que sustenta o cálculo é a proporcionalidade entre o ciclo de trabalho e a potência média consumida, e ela é adequada ao arranjo adotado: a modulação por largura de pulso chaveia a corrente plena do segmento, de modo que a potência média é o produto da potência em condução pela fração de tempo em que há condução. A mesma proporcionalidade vale, aproximadamente, para o fluxo luminoso, o que oferece verificação cruzada útil — a estimativa derivada do ciclo comandado pode ser confrontada com a derivada da iluminância medida, e a divergência entre as duas é reportada junto ao resultado. A comparação entre as duas estimativas é também exibida em tempo real no painel, calculada pelo mesmo módulo que produz os resultados do Capítulo 4.</w:t>
+        <w:t xml:space="preserve">A hipótese que sustenta o cálculo é a proporcionalidade entre o ciclo de trabalho e a potência média consumida, e ela é adequada ao arranjo adotado: a modulação por largura de pulso chaveia a corrente plena do segmento, de modo que a potência média é o produto da potência em condução pela fração de tempo em que há condução. A mesma proporcionalidade vale, aproximadamente, para o fluxo luminoso, o que oferece verificação cruzada útil — a estimativa derivada do ciclo comandado pode ser confrontada com a derivada da iluminância medida, e a divergência entre as duas é reportada junto ao resultado. A comparação entre as duas </w:t>
+      </w:r>
+      <w:r>
+        <w:rPr>
+          <w:lang w:val="pt-BR"/>
+        </w:rPr>
+        <w:lastRenderedPageBreak/>
+        <w:t>estimativas é também exibida em tempo real no painel, calculada pelo mesmo módulo que produz os resultados do Capítulo 4.</w:t>
       </w:r>
     </w:p>
     <w:p>
@@ -19284,7 +19207,14 @@
         <w:rPr>
           <w:lang w:val="pt-BR"/>
         </w:rPr>
-        <w:t>Com a luminária de referência, a energia não precisa ser inferida da telemetria da bancada: decorre do próprio registro de decisões. Entre duas decisões consecutivas, o nível emitido segue trajetória linear por partes, imposta pela taxa máxima de decréscimo — a elevação é imediata, e a atenuação é rampeada à taxa máxima de um décimo do fluxo pleno por minuto até atingir o novo nível, no qual permanece. A integral dessa trajetória tem forma fechada. Sejam a e b os níveis anterior e novo, expressos como fração do fluxo pleno, P a potência nominal em watts e Δt o intervalo até a decisão seguinte, em minutos. Numa atenuação, a rampa dura d = (a − b)/0,1 minutos, e a energia consumida no intervalo, em watt-hora, é E = P × [(a + b)/2 × d + b × (Δt − d)] / 60. Numa elevação, E = P × b × Δt / 60. Quando a decisão seguinte chega antes do fim da rampa, integra-se apenas o trecho percorrido. Cada decisão registrada produz, assim, um valor de energia, e a energia de um cenário é a soma desses valores. A título de ordem de grandeza, a descida completa de P3 a P5, que a norma obriga a durar ao menos cinco minutos, consome 2,50 Wh na luminária de referência, contra 3,33 Wh no mesmo intervalo em fluxo pleno.</w:t>
+        <w:t xml:space="preserve">Com a luminária de referência, a energia não precisa ser inferida da telemetria da bancada: decorre do próprio registro de decisões. Entre duas decisões consecutivas, o nível emitido segue trajetória linear por partes, imposta pela taxa máxima de decréscimo — a elevação é imediata, e a atenuação é rampeada à taxa máxima de um décimo do fluxo pleno por minuto até atingir o novo nível, no qual permanece. A integral dessa trajetória tem forma fechada. Sejam a e b os níveis anterior e novo, expressos como fração do fluxo pleno, P a potência nominal em watts e Δt o intervalo até a decisão seguinte, em minutos. Numa atenuação, a rampa dura d = (a − b)/0,1 minutos, e a energia consumida no intervalo, em watt-hora, é E = P × </w:t>
+      </w:r>
+      <w:r>
+        <w:rPr>
+          <w:lang w:val="pt-BR"/>
+        </w:rPr>
+        <w:lastRenderedPageBreak/>
+        <w:t>[(a + b)/2 × d + b × (Δt − d)] / 60. Numa elevação, E = P × b × Δt / 60. Quando a decisão seguinte chega antes do fim da rampa, integra-se apenas o trecho percorrido. Cada decisão registrada produz, assim, um valor de energia, e a energia de um cenário é a soma desses valores. A título de ordem de grandeza, a descida completa de P3 a P5, que a norma obriga a durar ao menos cinco minutos, consome 2,50 Wh na luminária de referência, contra 3,33 Wh no mesmo intervalo em fluxo pleno.</w:t>
       </w:r>
     </w:p>
     <w:p>
@@ -19316,13 +19246,7 @@
         <w:rPr>
           <w:lang w:val="pt-BR"/>
         </w:rPr>
-        <w:t xml:space="preserve">A comparação exige referência, e adotam-se duas. A primeira é o fluxo pleno constante ao longo de todo o período de operação, e a segunda, um regime de </w:t>
-      </w:r>
-      <w:r>
-        <w:rPr>
-          <w:lang w:val="pt-BR"/>
-        </w:rPr>
-        <w:t>atenuação por horário fixo, das 0 h às 5 h, janela escolhida pelos autores, que corresponde ao que um sistema de telegestão sem acesso a dados do ambiente pode fazer — e que é, precisamente, a programação agendada prevista no Caderno de Encargos da concessão. A segunda linha de base é a exigente, e é ela que dá sentido à pergunta de pesquisa: se a decisão informada por dados urbanos não se distinguisse de uma programação horária, a informação não estaria fazendo trabalho algum.</w:t>
+        <w:t>A comparação exige referência, e adotam-se duas. A primeira é o fluxo pleno constante ao longo de todo o período de operação, e a segunda, um regime de atenuação por horário fixo, das 0 h às 5 h, janela escolhida pelos autores, que corresponde ao que um sistema de telegestão sem acesso a dados do ambiente pode fazer — e que é, precisamente, a programação agendada prevista no Caderno de Encargos da concessão. A segunda linha de base é a exigente, e é ela que dá sentido à pergunta de pesquisa: se a decisão informada por dados urbanos não se distinguisse de uma programação horária, a informação não estaria fazendo trabalho algum.</w:t>
       </w:r>
     </w:p>
     <w:p>
@@ -19354,7 +19278,14 @@
         <w:rPr>
           <w:lang w:val="pt-BR"/>
         </w:rPr>
-        <w:t>Uma advertência metodológica precede o resultado. Consumo, isoladamente, não é critério de mérito em iluminação pública: o regime de menor consumo é o de luz apagada, e qualquer comparação que premie apenas a redução premiará o regime menos seguro. A avaliação é, por isso, conjunta, e reporta dois valores para cada regime — a energia estimada e a aderência da iluminação à demanda observada, medida como a fração dos ciclos em que o nível entregue se situou dentro do envelope esperado do cenário, nos termos de 3.9. O que o trabalho busca estabelecer não é o consumo mínimo, e sim o consumo aderente à condição observada, sem que em nenhum momento os limites da norma sejam transgredidos.</w:t>
+        <w:t xml:space="preserve">Uma advertência metodológica precede o resultado. Consumo, isoladamente, não é critério de mérito em iluminação pública: o regime de menor consumo é o de luz </w:t>
+      </w:r>
+      <w:r>
+        <w:rPr>
+          <w:lang w:val="pt-BR"/>
+        </w:rPr>
+        <w:lastRenderedPageBreak/>
+        <w:t>apagada, e qualquer comparação que premie apenas a redução premiará o regime menos seguro. A avaliação é, por isso, conjunta, e reporta dois valores para cada regime — a energia estimada e a aderência da iluminação à demanda observada, medida como a fração dos ciclos em que o nível entregue se situou dentro do envelope esperado do cenário, nos termos de 3.9. O que o trabalho busca estabelecer não é o consumo mínimo, e sim o consumo aderente à condição observada, sem que em nenhum momento os limites da norma sejam transgredidos.</w:t>
       </w:r>
     </w:p>
     <w:p>
@@ -19370,13 +19301,7 @@
         <w:rPr>
           <w:lang w:val="pt-BR"/>
         </w:rPr>
-        <w:t xml:space="preserve">Delimita-se, por fim, o alcance das duas estimativas. A de bancada vale para o arranjo em que a corrente é limitada por resistores integrados ao módulo de luz. A da luminária de referência herda a hipótese de proporcionalidade, e é nela que a hipótese pesa: a eficiência do regulador de corrente de um ponto de luz viário pode variar com o nível de saída, e há ainda uma parcela fixa no próprio regulador e no controlador de telegestão, que não se reduz com a dimerização e que não é aqui quantificada, por não haver valor público para o equipamento instalado. Os dois efeitos, se presentes, atuam no mesmo sentido — a redução de consumo real é menor que a proporcional à redução de fluxo —, e a parcela fixa pesa tanto mais quanto menor a potência nominal. A estimativa é, portanto, um limite superior otimista, e assim é reportada. Não se afirma economia anual, economia em escala de parque nem valor monetário: a </w:t>
-      </w:r>
-      <w:r>
-        <w:rPr>
-          <w:lang w:val="pt-BR"/>
-        </w:rPr>
-        <w:t>suíte de cenários não constitui perfil anual de ocupação do município, e multiplicar seu resultado pelo número de pontos do parque atribuiria à suíte uma representatividade que ela não tem. A quantificação em equipamento viário, com medição elétrica rastreável, figura entre as recomendações de 6.1.</w:t>
+        <w:t>Delimita-se, por fim, o alcance das duas estimativas. A de bancada vale para o arranjo em que a corrente é limitada por resistores integrados ao módulo de luz. A da luminária de referência herda a hipótese de proporcionalidade, e é nela que a hipótese pesa: a eficiência do regulador de corrente de um ponto de luz viário pode variar com o nível de saída, e há ainda uma parcela fixa no próprio regulador e no controlador de telegestão, que não se reduz com a dimerização e que não é aqui quantificada, por não haver valor público para o equipamento instalado. Os dois efeitos, se presentes, atuam no mesmo sentido — a redução de consumo real é menor que a proporcional à redução de fluxo —, e a parcela fixa pesa tanto mais quanto menor a potência nominal. A estimativa é, portanto, um limite superior otimista, e assim é reportada. Não se afirma economia anual, economia em escala de parque nem valor monetário: a suíte de cenários não constitui perfil anual de ocupação do município, e multiplicar seu resultado pelo número de pontos do parque atribuiria à suíte uma representatividade que ela não tem. A quantificação em equipamento viário, com medição elétrica rastreável, figura entre as recomendações de 6.1.</w:t>
       </w:r>
     </w:p>
     <w:p>
@@ -19393,6 +19318,7 @@
         <w:rPr>
           <w:lang w:val="pt-BR"/>
         </w:rPr>
+        <w:lastRenderedPageBreak/>
         <w:t>3.12 Engenharia de software</w:t>
       </w:r>
       <w:bookmarkEnd w:id="43"/>
@@ -19784,6 +19710,7 @@
                 <w:sz w:val="20"/>
                 <w:szCs w:val="20"/>
               </w:rPr>
+              <w:lastRenderedPageBreak/>
               <w:t>RF03</w:t>
             </w:r>
           </w:p>
@@ -20728,16 +20655,37 @@
           </w:tcPr>
           <w:p>
             <w:proofErr w:type="spellStart"/>
+            <w:r>
+              <w:rPr>
+                <w:sz w:val="20"/>
+                <w:szCs w:val="20"/>
+              </w:rPr>
+              <w:t>Segurança</w:t>
+            </w:r>
             <w:proofErr w:type="spellEnd"/>
+            <w:r>
+              <w:rPr>
+                <w:sz w:val="20"/>
+                <w:szCs w:val="20"/>
+              </w:rPr>
+              <w:t xml:space="preserve"> </w:t>
+            </w:r>
             <w:proofErr w:type="spellStart"/>
             <w:r>
               <w:rPr>
                 <w:sz w:val="20"/>
                 <w:szCs w:val="20"/>
               </w:rPr>
-              <w:t xml:space="preserve">Segurança operacional (safety)</w:t>
+              <w:t>operacional</w:t>
             </w:r>
             <w:proofErr w:type="spellEnd"/>
+            <w:r>
+              <w:rPr>
+                <w:sz w:val="20"/>
+                <w:szCs w:val="20"/>
+              </w:rPr>
+              <w:t xml:space="preserve"> (safety)</w:t>
+            </w:r>
           </w:p>
         </w:tc>
         <w:tc>
@@ -20784,6 +20732,7 @@
                 <w:sz w:val="20"/>
                 <w:szCs w:val="20"/>
               </w:rPr>
+              <w:lastRenderedPageBreak/>
               <w:t>RNF02</w:t>
             </w:r>
           </w:p>
@@ -20826,16 +20775,37 @@
           </w:tcPr>
           <w:p>
             <w:proofErr w:type="spellStart"/>
+            <w:r>
+              <w:rPr>
+                <w:sz w:val="20"/>
+                <w:szCs w:val="20"/>
+              </w:rPr>
+              <w:t>Segurança</w:t>
+            </w:r>
             <w:proofErr w:type="spellEnd"/>
+            <w:r>
+              <w:rPr>
+                <w:sz w:val="20"/>
+                <w:szCs w:val="20"/>
+              </w:rPr>
+              <w:t xml:space="preserve"> </w:t>
+            </w:r>
             <w:proofErr w:type="spellStart"/>
             <w:r>
               <w:rPr>
                 <w:sz w:val="20"/>
                 <w:szCs w:val="20"/>
               </w:rPr>
-              <w:t xml:space="preserve">Segurança operacional (safety)</w:t>
+              <w:t>operacional</w:t>
             </w:r>
             <w:proofErr w:type="spellEnd"/>
+            <w:r>
+              <w:rPr>
+                <w:sz w:val="20"/>
+                <w:szCs w:val="20"/>
+              </w:rPr>
+              <w:t xml:space="preserve"> (safety)</w:t>
+            </w:r>
           </w:p>
         </w:tc>
         <w:tc>
@@ -21137,9 +21107,32 @@
                 <w:sz w:val="20"/>
                 <w:szCs w:val="20"/>
               </w:rPr>
-              <w:t xml:space="preserve">Manutenibilidade (modificabilidade)</w:t>
+              <w:t>Manutenibilidade</w:t>
             </w:r>
             <w:proofErr w:type="spellEnd"/>
+            <w:r>
+              <w:rPr>
+                <w:sz w:val="20"/>
+                <w:szCs w:val="20"/>
+              </w:rPr>
+              <w:t xml:space="preserve"> (</w:t>
+            </w:r>
+            <w:proofErr w:type="spellStart"/>
+            <w:r>
+              <w:rPr>
+                <w:sz w:val="20"/>
+                <w:szCs w:val="20"/>
+              </w:rPr>
+              <w:t>modificabilidade</w:t>
+            </w:r>
+            <w:proofErr w:type="spellEnd"/>
+            <w:r>
+              <w:rPr>
+                <w:sz w:val="20"/>
+                <w:szCs w:val="20"/>
+              </w:rPr>
+              <w:t>)</w:t>
+            </w:r>
           </w:p>
         </w:tc>
         <w:tc>
@@ -21345,9 +21338,32 @@
                 <w:sz w:val="20"/>
                 <w:szCs w:val="20"/>
               </w:rPr>
-              <w:t xml:space="preserve">Segurança operacional (fail safe)</w:t>
+              <w:t>Segurança</w:t>
             </w:r>
             <w:proofErr w:type="spellEnd"/>
+            <w:r>
+              <w:rPr>
+                <w:sz w:val="20"/>
+                <w:szCs w:val="20"/>
+              </w:rPr>
+              <w:t xml:space="preserve"> </w:t>
+            </w:r>
+            <w:proofErr w:type="spellStart"/>
+            <w:r>
+              <w:rPr>
+                <w:sz w:val="20"/>
+                <w:szCs w:val="20"/>
+              </w:rPr>
+              <w:t>operacional</w:t>
+            </w:r>
+            <w:proofErr w:type="spellEnd"/>
+            <w:r>
+              <w:rPr>
+                <w:sz w:val="20"/>
+                <w:szCs w:val="20"/>
+              </w:rPr>
+              <w:t xml:space="preserve"> (fail safe)</w:t>
+            </w:r>
           </w:p>
         </w:tc>
         <w:tc>
@@ -21553,9 +21569,32 @@
                 <w:sz w:val="20"/>
                 <w:szCs w:val="20"/>
               </w:rPr>
-              <w:t xml:space="preserve">Flexibilidade (escalabilidade)</w:t>
+              <w:t>Flexibilidade</w:t>
             </w:r>
             <w:proofErr w:type="spellEnd"/>
+            <w:r>
+              <w:rPr>
+                <w:sz w:val="20"/>
+                <w:szCs w:val="20"/>
+              </w:rPr>
+              <w:t xml:space="preserve"> (</w:t>
+            </w:r>
+            <w:proofErr w:type="spellStart"/>
+            <w:r>
+              <w:rPr>
+                <w:sz w:val="20"/>
+                <w:szCs w:val="20"/>
+              </w:rPr>
+              <w:t>escalabilidade</w:t>
+            </w:r>
+            <w:proofErr w:type="spellEnd"/>
+            <w:r>
+              <w:rPr>
+                <w:sz w:val="20"/>
+                <w:szCs w:val="20"/>
+              </w:rPr>
+              <w:t>)</w:t>
+            </w:r>
           </w:p>
         </w:tc>
         <w:tc>
@@ -21621,6 +21660,7 @@
         <w:rPr>
           <w:lang w:val="pt-BR"/>
         </w:rPr>
+        <w:lastRenderedPageBreak/>
         <w:t>que rege a camada de verificação: o benefício da adaptação é condicional, a garantia normativa não é.</w:t>
       </w:r>
     </w:p>
@@ -21705,6 +21745,7 @@
           <w:noProof/>
           <w:lang w:val="pt-BR"/>
         </w:rPr>
+        <w:lastRenderedPageBreak/>
         <w:drawing>
           <wp:inline distT="0" distB="0" distL="0" distR="0" wp14:anchorId="56549F5B" wp14:editId="07724E36">
             <wp:extent cx="4700000" cy="5356574"/>
@@ -21823,6 +21864,7 @@
           <w:szCs w:val="20"/>
           <w:lang w:val="pt-BR"/>
         </w:rPr>
+        <w:lastRenderedPageBreak/>
         <w:t>Quadro 12 – Decisões de arquitetura</w:t>
       </w:r>
     </w:p>
@@ -22671,6 +22713,7 @@
           <w:szCs w:val="20"/>
           <w:lang w:val="pt-BR"/>
         </w:rPr>
+        <w:lastRenderedPageBreak/>
         <w:t>Quadro 13 – Componentes, tecnologias adotadas e responsabilidades</w:t>
       </w:r>
     </w:p>
@@ -23425,15 +23468,7 @@
                 <w:szCs w:val="20"/>
                 <w:lang w:val="pt-BR"/>
               </w:rPr>
-              <w:t xml:space="preserve">Registrar a cadeia completa de </w:t>
-            </w:r>
-            <w:r>
-              <w:rPr>
-                <w:sz w:val="20"/>
-                <w:szCs w:val="20"/>
-                <w:lang w:val="pt-BR"/>
-              </w:rPr>
-              <w:t xml:space="preserve">cada decisão</w:t>
+              <w:t>Registrar a cadeia completa de cada decisão</w:t>
             </w:r>
           </w:p>
         </w:tc>
@@ -23679,6 +23714,7 @@
         <w:rPr>
           <w:lang w:val="pt-BR"/>
         </w:rPr>
+        <w:lastRenderedPageBreak/>
         <w:t xml:space="preserve">máquina virtual em nuvem; a exceção é o painel, aplicação estática publicada à parte. Ao nó cabe executar. </w:t>
       </w:r>
       <w:r>
@@ -23778,19 +23814,7 @@
         <w:rPr>
           <w:lang w:val="pt-BR"/>
         </w:rPr>
-        <w:t xml:space="preserve">Banco de dados em contêiner. Registra a cadeia completa de </w:t>
-      </w:r>
-      <w:r>
-        <w:rPr>
-          <w:lang w:val="pt-BR"/>
-        </w:rPr>
-        <w:t xml:space="preserve">cada decisão</w:t>
-      </w:r>
-      <w:r>
-        <w:rPr>
-          <w:lang w:val="pt-BR"/>
-        </w:rPr>
-        <w:t xml:space="preserve">, conforme a subseção 3.13.1.</w:t>
+        <w:t>Banco de dados em contêiner. Registra a cadeia completa de cada decisão, conforme a subseção 3.13.1.</w:t>
       </w:r>
     </w:p>
     <w:p>
@@ -23826,6 +23850,7 @@
         <w:rPr>
           <w:lang w:val="pt-BR"/>
         </w:rPr>
+        <w:lastRenderedPageBreak/>
         <w:t>Ao nó cabe assinar o tópico de comando, ajustar a modulação por largura de pulso e publicar a iluminância lida. A comunicação com o intermediário ocorre sobre canal cifrado, com credencial própria do dispositivo, de modo que a identidade de cada nó seja verificável no lado do serviço. O canal é autenticado por certificado de autoridade certificadora própria, gravado no firmware, e uma regra de acesso vinculada à credencial faz com que cada nó só assine o próprio tópico de comando e só publique a própria telemetria. O serviço de decisão alcança o intermediário pela rede interna da máquina virtual, sem porta exposta, e o banco não é publicado. Na interface REST, a publicação exige chave de acesso; as consultas permanecem abertas, porque o painel apenas lê.</w:t>
       </w:r>
     </w:p>
@@ -24081,6 +24106,7 @@
                 <w:szCs w:val="20"/>
                 <w:lang w:val="pt-BR"/>
               </w:rPr>
+              <w:lastRenderedPageBreak/>
               <w:t>origem; vigência opcional. Exige chave de acesso; campo fora do contrato ou trecho fora do cadastro recusa o item, e no pacote só ele</w:t>
             </w:r>
           </w:p>
@@ -24103,6 +24129,7 @@
                 <w:sz w:val="20"/>
                 <w:szCs w:val="20"/>
               </w:rPr>
+              <w:lastRenderedPageBreak/>
               <w:t>REST – GET /</w:t>
             </w:r>
             <w:proofErr w:type="spellStart"/>
@@ -25355,6 +25382,7 @@
         <w:rPr>
           <w:lang w:val="pt-BR"/>
         </w:rPr>
+        <w:lastRenderedPageBreak/>
         <w:t>O identificador da decisão trafega nos dois sentidos, e não por conveniência de implementação: é ele que permite ligar a telemetria à decisão que a originou sem depender de proximidade temporal entre as mensagens. Mensagens podem ser reordenadas ou reentregues, e um vínculo estabelecido por horário seria frágil justamente nos casos em que a auditoria importa. A especificação da interface REST, por sua vez, constitui resultado do trabalho na acepção registrada em 3.2: define o que uma plataforma municipal de monitoramento precisaria publicar para que um sistema de iluminação pudesse consumi-la.</w:t>
       </w:r>
     </w:p>
@@ -25418,6 +25446,7 @@
           <w:noProof/>
           <w:lang w:val="pt-BR"/>
         </w:rPr>
+        <w:lastRenderedPageBreak/>
         <w:drawing>
           <wp:inline distT="0" distB="0" distL="0" distR="0" wp14:anchorId="56549F5B" wp14:editId="07724E36">
             <wp:extent cx="5400000" cy="5349216"/>
@@ -25551,6 +25580,7 @@
         <w:rPr>
           <w:lang w:val="pt-BR"/>
         </w:rPr>
+        <w:lastRenderedPageBreak/>
         <w:t>(4) Decisão. O volume, dividido pela referência do trecho, torna-se o nível observado; a camada de previsão estima o nível da próxima hora (3.6); a inferência nebulosa combina os dois, a ocorrência e a faixa horária e produz o nível pretendido (3.7); a camada de verificação aplica o piso e produz o nível-alvo emitido.</w:t>
       </w:r>
     </w:p>
@@ -25679,7 +25709,7 @@
         <w:rPr>
           <w:lang w:val="pt-BR"/>
         </w:rPr>
-        <w:t xml:space="preserve">Um exemplo registrado na bancada, com o nó físico e a arquitetura vigente, ilustra o percurso. Na sessão de 10 de outubro de 2026, à 0 h 27 min, foi publicado, para cada um dos três trechos associados ao ponto de luz da bancada, o volume nulo — nenhuma pessoa, em média, no período de 5 min. Para o trecho 20159, da Rua Antonio Viana:</w:t>
+        <w:t>Um exemplo registrado na bancada, com o nó físico e a arquitetura vigente, ilustra o percurso. Na sessão de 10 de outubro de 2026, à 0 h 27 min, foi publicado, para cada um dos três trechos associados ao ponto de luz da bancada, o volume nulo — nenhuma pessoa, em média, no período de 5 min. Para o trecho 20159, da Rua Antonio Viana:</w:t>
       </w:r>
     </w:p>
     <w:p>
@@ -25695,7 +25725,7 @@
         <w:rPr>
           <w:lang w:val="pt-BR"/>
         </w:rPr>
-        <w:t xml:space="preserve">{"tipo": "volume", "ocorrido_em": "2026-10-10T00:27:31-03:00", "pessoas_media": 0, "periodo_s": 300, "trecho": 20159, "origem": "bancada-ct18"}</w:t>
+        <w:t>{"tipo": "volume", "ocorrido_em": "2026-10-10T00:27:31-03:00", "pessoas_media": 0, "periodo_s": 300, "trecho": 20159, "origem": "bancada-ct18"}</w:t>
       </w:r>
     </w:p>
     <w:p>
@@ -25711,7 +25741,14 @@
         <w:rPr>
           <w:lang w:val="pt-BR"/>
         </w:rPr>
-        <w:t xml:space="preserve">O ponto de luz da bancada corresponde ao poste de placa IP0412418, de classe P3, ligado aos trechos 20159, 21198 e 22661. Com volume nulo nos três, o nível observado foi 0, e a previsão para a próxima hora também. Sem ocorrência aberta, a inferência ativou com grau 1,0 apenas a regra de movimentação observada baixa e prevista baixa, o que resultou no degrau 2 e no nível pretendido de 0,500, a classe mínima (P5). O nível pretendido já respeitava o piso, e a camada de verificação não aplicou restrição: o nível emitido foi 0,500. A decisão foi gravada ligada aos três eventos e, como o alvo mudou, o comando publicado foi:</w:t>
+        <w:t xml:space="preserve">O ponto de luz da bancada corresponde ao poste de placa IP0412418, de classe P3, ligado aos trechos 20159, 21198 e 22661. Com volume nulo nos três, o </w:t>
+      </w:r>
+      <w:r>
+        <w:rPr>
+          <w:lang w:val="pt-BR"/>
+        </w:rPr>
+        <w:lastRenderedPageBreak/>
+        <w:t>nível observado foi 0, e a previsão para a próxima hora também. Sem ocorrência aberta, a inferência ativou com grau 1,0 apenas a regra de movimentação observada baixa e prevista baixa, o que resultou no degrau 2 e no nível pretendido de 0,500, a classe mínima (P5). O nível pretendido já respeitava o piso, e a camada de verificação não aplicou restrição: o nível emitido foi 0,500. A decisão foi gravada ligada aos três eventos e, como o alvo mudou, o comando publicado foi:</w:t>
       </w:r>
     </w:p>
     <w:p>
@@ -25727,7 +25764,7 @@
         <w:rPr>
           <w:lang w:val="pt-BR"/>
         </w:rPr>
-        <w:t xml:space="preserve">{"decisao_id": "92b2a978-202b-42c9-94e8-0959453e2352", "nivel": 0.5, "validade_s": 887, "piso": 0.5, "taxa_min": 0.1}</w:t>
+        <w:t>{"decisao_id": "92b2a978-202b-42c9-94e8-0959453e2352", "nivel": 0.5, "validade_s": 887, "piso": 0.5, "taxa_min": 0.1}</w:t>
       </w:r>
     </w:p>
     <w:p>
@@ -25743,7 +25780,7 @@
         <w:rPr>
           <w:lang w:val="pt-BR"/>
         </w:rPr>
-        <w:t xml:space="preserve">O nó estava no pleno e passou a descer em rampa: a cada 5 s, reduziu o nível em 0,008, o que corresponde à taxa de 0,1 do pleno por minuto, e chegou a 0,500 às 0 h 33 min 01 s, 5 min 15 s após o comando. Ao receber o comando, antes do primeiro passo, respondeu com a telemetria:</w:t>
+        <w:t>O nó estava no pleno e passou a descer em rampa: a cada 5 s, reduziu o nível em 0,008, o que corresponde à taxa de 0,1 do pleno por minuto, e chegou a 0,500 às 0 h 33 min 01 s, 5 min 15 s após o comando. Ao receber o comando, antes do primeiro passo, respondeu com a telemetria:</w:t>
       </w:r>
     </w:p>
     <w:p>
@@ -25759,7 +25796,7 @@
         <w:rPr>
           <w:lang w:val="pt-BR"/>
         </w:rPr>
-        <w:t xml:space="preserve">{"decisao_id": "92b2a978-202b-42c9-94e8-0959453e2352", "duty": 0.6562, "lux": 10.07, "nivel": 1.0}</w:t>
+        <w:t>{"decisao_id": "92b2a978-202b-42c9-94e8-0959453e2352", "duty": 0.6562, "lux": 10.07, "nivel": 1.0}</w:t>
       </w:r>
     </w:p>
     <w:p>
@@ -25775,7 +25812,7 @@
         <w:rPr>
           <w:lang w:val="pt-BR"/>
         </w:rPr>
-        <w:t xml:space="preserve">A leitura corresponde ao início da rampa, ainda no pleno: o nó só mede e publica ao receber um comando, e os passos seguintes ficam registrados na sua saída serial. Sem evento novo, o serviço não renovou o comando, que venceu 887 s depois, às 0 h 42 min 33 s, e o nó voltou ao pleno, como exige o caso de teste CT18 (3.12.9). A latência medida no nó de bancada é apresentada em 4.3.</w:t>
+        <w:t>A leitura corresponde ao início da rampa, ainda no pleno: o nó só mede e publica ao receber um comando, e os passos seguintes ficam registrados na sua saída serial. Sem evento novo, o serviço não renovou o comando, que venceu 887 s depois, às 0 h 42 min 33 s, e o nó voltou ao pleno, como exige o caso de teste CT18 (3.12.9). A latência medida no nó de bancada é apresentada em 4.3.</w:t>
       </w:r>
     </w:p>
     <w:p>
@@ -26039,6 +26076,7 @@
                 <w:szCs w:val="20"/>
                 <w:lang w:val="pt-BR"/>
               </w:rPr>
+              <w:lastRenderedPageBreak/>
               <w:t>ou sem chave de acesso</w:t>
             </w:r>
           </w:p>
@@ -26065,6 +26103,7 @@
                 <w:szCs w:val="20"/>
                 <w:lang w:val="pt-BR"/>
               </w:rPr>
+              <w:lastRenderedPageBreak/>
               <w:t>Recusa com erro de validação ou de autenticação; no pacote, só o item inválido é recusado e os demais são gravados</w:t>
             </w:r>
           </w:p>
@@ -27081,6 +27120,7 @@
                 <w:sz w:val="20"/>
                 <w:szCs w:val="20"/>
               </w:rPr>
+              <w:lastRenderedPageBreak/>
               <w:t>CT12</w:t>
             </w:r>
           </w:p>
@@ -28001,6 +28041,7 @@
           <w:highlight w:val="yellow"/>
           <w:lang w:val="pt-BR"/>
         </w:rPr>
+        <w:lastRenderedPageBreak/>
         <w:t>Os casos automatizados, CT01 a CT14, foram satisfeitos na última execução, com todos os testes aprovados. Os casos CT15 a CT20 foram executados em 10 de outubro de 2026, na caixa atual (Quadro 4), com a arquitetura de 3.5.2 e o firmware correspondente gravado no nó, ligado ao ambiente implantado e calibrado no início da sessão (3.4.4); o registro de cada caso está no repositório (Apêndice B). Os seis foram satisfeitos. No CT15, a iluminância medida ficou 0,7 % acima do valor esperado para o nível aplicado, dentro da tolerância de 3,4 %. No CT16, o alerta de falha total foi aberto após três leituras com a fonte da fita desligada e encerrado ao religá-la. No CT17, as trinta repetições ficaram abaixo de 1,5 s, contra o limite de 180 s. No CT18, o nó assumiu o nível pleno no instante em que venceu a validade do último comando, e o sensor registrou o pleno 2,3 s depois. No CT19, a conexão ao intermediário foi recusada sem credencial e com senha incorreta, e aceita com a credencial do nó, sobre canal TLS 1.3. No CT20, um segundo ponto de luz foi comandado sem alteração nem reinício do serviço de decisão, por meio do nó simulado, cuja iluminância é sintética. Uma sessão anterior, de 4 e 5 de outubro, na primeira caixa e com o failsafe de 15 s sem comando, está registrada no repositório e não compõe estes resultados; nela, o CT18 não foi satisfeito nos termos então fixados, porque o sensor registrou o pleno 17,3 s após o último comando, contra o limite de 15 s.</w:t>
       </w:r>
     </w:p>
@@ -28073,6 +28114,7 @@
         <w:rPr>
           <w:lang w:val="pt-BR"/>
         </w:rPr>
+        <w:lastRenderedPageBreak/>
         <w:t>auditoria: uma decisão que não se ligue a um ponto de luz, a uma classe e a uma versão da base de regras é registro sem sentido, e o modelo relacional o impede por construção. O volume envolvido na avaliação em bancada é pequeno, e nenhuma característica de escala justificaria abrir mão dessa garantia.</w:t>
       </w:r>
     </w:p>
@@ -28665,6 +28707,7 @@
                 <w:sz w:val="20"/>
                 <w:szCs w:val="20"/>
               </w:rPr>
+              <w:lastRenderedPageBreak/>
               <w:t>versao_base_regras</w:t>
             </w:r>
             <w:proofErr w:type="spellEnd"/>
@@ -29377,6 +29420,7 @@
         <w:rPr>
           <w:lang w:val="pt-BR"/>
         </w:rPr>
+        <w:lastRenderedPageBreak/>
         <w:t>Registre-se o que o modelo não resolve. As entidades de evento urbano e de telemetria crescem continuamente e, em escala municipal, exigiriam particionamento por tempo, política de retenção e provavelmente armazenamento orientado a série temporal. A avaliação aqui conduzida opera sobre um nó e sobre cenários de duração conhecida, condição em que o modelo relacional é adequado sem qualificação. O tratamento do crescimento em escala de parque figura entre as recomendações de 6.1.</w:t>
       </w:r>
     </w:p>
@@ -29512,6 +29556,7 @@
         <w:rPr>
           <w:lang w:val="pt-BR"/>
         </w:rPr>
+        <w:lastRenderedPageBreak/>
         <w:t>A entidade associativa que liga decisão e evento urbano resolve uma relação de muitos para muitos e não é formalidade de modelagem: uma decisão é produzida a partir de um conjunto de eventos, e o mesmo evento pode sustentar decisões sucessivas enquanto permanecer vigente. Sem ela, o registro permitiria afirmar qual foi a decisão e quando, mas não sobre qual informação ela se apoiou — e é precisamente essa a pergunta que uma auditoria faria. Com ela, a cadeia fica completa: evento, estimativa, nível pretendido, restrição aplicada, nível emitido e medição.</w:t>
       </w:r>
     </w:p>
@@ -29595,6 +29640,7 @@
           <w:szCs w:val="20"/>
           <w:lang w:val="pt-BR"/>
         </w:rPr>
+        <w:lastRenderedPageBreak/>
         <w:t>Quadro 17 – Tabelas do banco de dados: atributos, domínios, restrições e uso</w:t>
       </w:r>
     </w:p>
@@ -30223,6 +30269,7 @@
                 <w:sz w:val="20"/>
                 <w:szCs w:val="20"/>
               </w:rPr>
+              <w:lastRenderedPageBreak/>
               <w:t>versao_base_regras</w:t>
             </w:r>
             <w:proofErr w:type="spellEnd"/>
@@ -30903,6 +30950,7 @@
           <w:szCs w:val="20"/>
           <w:lang w:val="pt-BR"/>
         </w:rPr>
+        <w:lastRenderedPageBreak/>
         <w:t>Fonte: Elaborado pelos autores (2026).</w:t>
       </w:r>
     </w:p>
@@ -30946,6 +30994,7 @@
         <w:rPr>
           <w:lang w:val="pt-BR"/>
         </w:rPr>
+        <w:lastRenderedPageBreak/>
         <w:t>4 RESULTADOS</w:t>
       </w:r>
       <w:bookmarkEnd w:id="60"/>
@@ -31032,21 +31081,8 @@
           <w:highlight w:val="yellow"/>
           <w:lang w:val="pt-BR"/>
         </w:rPr>
-        <w:t xml:space="preserve">Com a série horária de Melbourne, empregada antes da troca (3.6), o modelo havia apresentado erro absoluto médio de 0,047, contra 0,057 da média sazonal, e era equivalente à floresta aleatória, com diferença de 0,5 %. O experimento que motivou a troca, com 14 pontos de Zurique, 12 deles com dados no ano de teste, está no </w:t>
-      </w:r>
-      <w:r>
-        <w:rPr>
-          <w:highlight w:val="yellow"/>
-          <w:lang w:val="pt-BR"/>
-        </w:rPr>
-        <w:t xml:space="preserve">Tabela 4</w:t>
-      </w:r>
-      <w:r>
-        <w:rPr>
-          <w:highlight w:val="yellow"/>
-          <w:lang w:val="pt-BR"/>
-        </w:rPr>
-        <w:t xml:space="preserve">, em 4.6: na resolução de 15 min, o modelo supera a melhor referência simples pelas margens fixadas; com os mesmos dados somados por hora, não.</w:t>
+        <w:lastRenderedPageBreak/>
+        <w:t>Com a série horária de Melbourne, empregada antes da troca (3.6), o modelo havia apresentado erro absoluto médio de 0,047, contra 0,057 da média sazonal, e era equivalente à floresta aleatória, com diferença de 0,5 %. O experimento que motivou a troca, com 14 pontos de Zurique, 12 deles com dados no ano de teste, está no Tabela 4, em 4.6: na resolução de 15 min, o modelo supera a melhor referência simples pelas margens fixadas; com os mesmos dados somados por hora, não.</w:t>
       </w:r>
     </w:p>
     <w:p>
@@ -31131,6 +31167,7 @@
           <w:highlight w:val="yellow"/>
           <w:lang w:val="pt-BR"/>
         </w:rPr>
+        <w:lastRenderedPageBreak/>
         <w:t>A medição exigiu duas execuções, ambas registradas. Na primeira, a ocorrência curta publicada antes das repetições para medir a diferença entre os relógios venceu pelo prazo e, sem evento que o reconhecesse, manteve o alvo no pleno; a primeira repetição não mudou o alvo nem gerou comando, e a execução foi interrompida. É a limitação declarada em 5.3 para a ocorrência encerrada por prazo, e o procedimento passou a publicar o encerramento explícito. A diferença entre os relógios, de 1,3 s, foi corrigida nos instantes publicados: o serviço desconsidera publicação com instante posterior ao do seu relógio, e a resposta imediata pressupõe relógios sincronizados entre a plataforma e o serviço.</w:t>
       </w:r>
     </w:p>
@@ -31204,6 +31241,7 @@
         <w:rPr>
           <w:lang w:val="pt-BR"/>
         </w:rPr>
+        <w:lastRenderedPageBreak/>
         <w:t>iluminação pudesse consumi-la, onde, quando e como, com a justificativa de cada requisito.</w:t>
       </w:r>
     </w:p>
@@ -32122,6 +32160,7 @@
                 <w:sz w:val="20"/>
                 <w:szCs w:val="20"/>
               </w:rPr>
+              <w:lastRenderedPageBreak/>
               <w:t>Madrugada</w:t>
             </w:r>
             <w:proofErr w:type="spellEnd"/>
@@ -32920,6 +32959,7 @@
           <w:highlight w:val="yellow"/>
           <w:lang w:val="pt-BR"/>
         </w:rPr>
+        <w:lastRenderedPageBreak/>
         <w:t>regime. Os valores decorrem do registro de decisões, pela fórmula de 3.11, e não constituem medição elétrica.</w:t>
       </w:r>
     </w:p>
@@ -33663,19 +33703,8 @@
         <w:rPr>
           <w:lang w:val="pt-BR"/>
         </w:rPr>
-        <w:t xml:space="preserve">taxa foi zero. O </w:t>
-      </w:r>
-      <w:r>
-        <w:rPr>
-          <w:lang w:val="pt-BR"/>
-        </w:rPr>
-        <w:t xml:space="preserve">Tabela 3</w:t>
-      </w:r>
-      <w:r>
-        <w:rPr>
-          <w:lang w:val="pt-BR"/>
-        </w:rPr>
-        <w:t xml:space="preserve"> reúne o que se mediu ao retirar ou substituir cada componente no sistema; onde há dois valores, o primeiro é o do componente e o segundo, o da alternativa.</w:t>
+        <w:lastRenderedPageBreak/>
+        <w:t>taxa foi zero. O Tabela 3 reúne o que se mediu ao retirar ou substituir cada componente no sistema; onde há dois valores, o primeiro é o do componente e o segundo, o da alternativa.</w:t>
       </w:r>
     </w:p>
     <w:p>
@@ -33692,15 +33721,7 @@
           <w:szCs w:val="20"/>
           <w:lang w:val="pt-BR"/>
         </w:rPr>
-        <w:t xml:space="preserve">Tabela 3</w:t>
-      </w:r>
-      <w:r>
-        <w:rPr>
-          <w:sz w:val="20"/>
-          <w:szCs w:val="20"/>
-          <w:lang w:val="pt-BR"/>
-        </w:rPr>
-        <w:t xml:space="preserve"> – Retirada e substituição dos componentes de inteligência artificial no sistema</w:t>
+        <w:t>Tabela 3 – Retirada e substituição dos componentes de inteligência artificial no sistema</w:t>
       </w:r>
     </w:p>
     <w:tbl>
@@ -34388,6 +34409,7 @@
                 <w:szCs w:val="20"/>
                 <w:lang w:val="pt-BR"/>
               </w:rPr>
+              <w:lastRenderedPageBreak/>
               <w:t>Inferência nebulosa × tabela em degraus × tabela com histerese de descida</w:t>
             </w:r>
           </w:p>
@@ -34475,19 +34497,7 @@
         <w:rPr>
           <w:lang w:val="pt-BR"/>
         </w:rPr>
-        <w:t xml:space="preserve">Pelas regras de leitura fixadas antes das execuções, três constatações decorrem do </w:t>
-      </w:r>
-      <w:r>
-        <w:rPr>
-          <w:lang w:val="pt-BR"/>
-        </w:rPr>
-        <w:t xml:space="preserve">Tabela 3</w:t>
-      </w:r>
-      <w:r>
-        <w:rPr>
-          <w:lang w:val="pt-BR"/>
-        </w:rPr>
-        <w:t xml:space="preserve">. Retirar a inferência por regras tem custo medido: a programação por horário fixo deixa a via uma classe inteira abaixo do nível que a situação pede durante centenas de minutos, inclusive sob ocorrência. Retirar a previsão tem custo pequeno quando a contagem falha no início da noite, de 0,318 contra 0,343 do pleno em luz perdida, e quase nenhum na madrugada. O modelo treinado, agora com a série de 15 min, não é substituível pela média sazonal no sistema: quando retém o nível acima do modo reativo, acerta a saída da faixa baixa em 70,7 % dos casos, contra 62,4 % da média sazonal, e consome menos energia; em contrapartida, passa mais minutos ligeiramente abaixo do nível pedido, 195 contra 150, todos a menos de 2 lux. Já a pertinência parcial é substituível: nos cenários de ruído, a inferência nebulosa inverteu o sentido mais vezes que a tabela, 140 contra 86, e, nas noites de 15 min, a tabela com histerese de descida teve menos mudanças perceptíveis que ela nos dois limiares, 9 contra 20 a 6 % e 9 contra 12 a 15 %, com a mesma ausência de minutos 2 lux abaixo. A 15 %, a inferência nebulosa teve uma mudança a menos que a tabela sem histerese, 12 contra 13; a diferença é de um evento em oito noites e não atinge a vantagem de 20 % exigida pelo critério.</w:t>
+        <w:t>Pelas regras de leitura fixadas antes das execuções, três constatações decorrem do Tabela 3. Retirar a inferência por regras tem custo medido: a programação por horário fixo deixa a via uma classe inteira abaixo do nível que a situação pede durante centenas de minutos, inclusive sob ocorrência. Retirar a previsão tem custo pequeno quando a contagem falha no início da noite, de 0,318 contra 0,343 do pleno em luz perdida, e quase nenhum na madrugada. O modelo treinado, agora com a série de 15 min, não é substituível pela média sazonal no sistema: quando retém o nível acima do modo reativo, acerta a saída da faixa baixa em 70,7 % dos casos, contra 62,4 % da média sazonal, e consome menos energia; em contrapartida, passa mais minutos ligeiramente abaixo do nível pedido, 195 contra 150, todos a menos de 2 lux. Já a pertinência parcial é substituível: nos cenários de ruído, a inferência nebulosa inverteu o sentido mais vezes que a tabela, 140 contra 86, e, nas noites de 15 min, a tabela com histerese de descida teve menos mudanças perceptíveis que ela nos dois limiares, 9 contra 20 a 6 % e 9 contra 12 a 15 %, com a mesma ausência de minutos 2 lux abaixo. A 15 %, a inferência nebulosa teve uma mudança a menos que a tabela sem histerese, 12 contra 13; a diferença é de um evento em oito noites e não atinge a vantagem de 20 % exigida pelo critério.</w:t>
       </w:r>
     </w:p>
     <w:p>
@@ -34503,19 +34513,7 @@
         <w:rPr>
           <w:lang w:val="pt-BR"/>
         </w:rPr>
-        <w:t xml:space="preserve">O </w:t>
-      </w:r>
-      <w:r>
-        <w:rPr>
-          <w:lang w:val="pt-BR"/>
-        </w:rPr>
-        <w:t xml:space="preserve">Tabela 4</w:t>
-      </w:r>
-      <w:r>
-        <w:rPr>
-          <w:lang w:val="pt-BR"/>
-        </w:rPr>
-        <w:t xml:space="preserve"> apresenta o experimento que motivou a troca da série (3.6), no período noturno do ano de teste, com protocolo e modelos próprios, anteriores ao modelo em operação. A melhor referência simples foi, nas duas resoluções, o valor do mesmo horário na semana anterior.</w:t>
+        <w:t>O Tabela 4 apresenta o experimento que motivou a troca da série (3.6), no período noturno do ano de teste, com protocolo e modelos próprios, anteriores ao modelo em operação. A melhor referência simples foi, nas duas resoluções, o valor do mesmo horário na semana anterior.</w:t>
       </w:r>
     </w:p>
     <w:p>
@@ -34532,15 +34530,7 @@
           <w:szCs w:val="20"/>
           <w:lang w:val="pt-BR"/>
         </w:rPr>
-        <w:t xml:space="preserve">Tabela 4</w:t>
-      </w:r>
-      <w:r>
-        <w:rPr>
-          <w:sz w:val="20"/>
-          <w:szCs w:val="20"/>
-          <w:lang w:val="pt-BR"/>
-        </w:rPr>
-        <w:t xml:space="preserve"> – Previsão com série de 15 min e com a mesma série somada por hora (Zurique, período noturno)</w:t>
+        <w:t>Tabela 4 – Previsão com série de 15 min e com a mesma série somada por hora (Zurique, período noturno)</w:t>
       </w:r>
     </w:p>
     <w:tbl>
@@ -34759,6 +34749,7 @@
                 <w:sz w:val="20"/>
                 <w:szCs w:val="20"/>
               </w:rPr>
+              <w:lastRenderedPageBreak/>
               <w:t>Acerto</w:t>
             </w:r>
             <w:proofErr w:type="spellEnd"/>
@@ -35130,6 +35121,7 @@
         <w:rPr>
           <w:lang w:val="pt-BR"/>
         </w:rPr>
+        <w:lastRenderedPageBreak/>
         <w:t>5 ANÁLISE DOS RESULTADOS</w:t>
       </w:r>
       <w:bookmarkEnd w:id="67"/>
@@ -35309,6 +35301,7 @@
         <w:rPr>
           <w:lang w:val="pt-BR"/>
         </w:rPr>
+        <w:lastRenderedPageBreak/>
         <w:t>O protótipo é um nó único, em escala reduzida e em baixa tensão de corrente contínua, não reproduzindo a potência, a altura de montagem nem a geometria fotométrica de uma luminária viária real. O que se transpõe é a arquitetura e o procedimento, não os valores medidos.</w:t>
       </w:r>
     </w:p>
@@ -35415,6 +35408,7 @@
         <w:rPr>
           <w:lang w:val="pt-BR"/>
         </w:rPr>
+        <w:lastRenderedPageBreak/>
         <w:t>Os sensores da bancada não têm calibração rastreável a padrão metrológico e a cadeia de medição é única, sem verificação cruzada contra instrumento de referência. O trabalho afirma repetibilidade, monotonicidade e consistência interna da escala, e não exatidão absoluta em iluminância, nos termos de 3.4.4.</w:t>
       </w:r>
     </w:p>
@@ -35521,6 +35515,7 @@
         <w:rPr>
           <w:lang w:val="pt-BR"/>
         </w:rPr>
+        <w:lastRenderedPageBreak/>
         <w:t>registrada, supõe proporcionalidade entre ciclo e potência e despreza a eficiência variável do regulador de corrente e o consumo fixo do módulo de telegestão — hipóteses que a tornam um limite superior otimista quando transposta a equipamento viário, nos termos de 3.11. A projeção para o parque adota luminária de referência derivada dos parâmetros contratuais, e não modelo comercial identificado, informação que não é divulgada. Não se afirma economia anual, em escala de parque, nem valor monetário. A quantificação com medição elétrica rastreável figura entre as recomendações de 6.1.</w:t>
       </w:r>
     </w:p>
@@ -35647,6 +35642,7 @@
         <w:rPr>
           <w:lang w:val="pt-BR"/>
         </w:rPr>
+        <w:lastRenderedPageBreak/>
         <w:t>ele; o tratamento desses casos figura na especificação de integração como requisito à plataforma, e não como resultado medido.</w:t>
       </w:r>
     </w:p>
@@ -35807,6 +35803,7 @@
         <w:rPr>
           <w:lang w:val="pt-BR"/>
         </w:rPr>
+        <w:lastRenderedPageBreak/>
         <w:t>Não houve teste de carga na escala do parque: a estimativa de cerca de 170 publicações por segundo para 50 mil câmeras é cálculo, e não medição.</w:t>
       </w:r>
     </w:p>
@@ -35907,6 +35904,7 @@
         <w:rPr>
           <w:lang w:val="pt-BR"/>
         </w:rPr>
+        <w:lastRenderedPageBreak/>
         <w:t>A avaliação dos componentes apoia-se em oito noites reais de uma série de 15 min, em que o volume de 5 min repete o valor do bloco, e em pares sintéticos de falha de contagem. O déficit em relação ao nível pedido adota o critério dos tercis, que é dos autores. Uma série de contagem por minuto, que permitiria avaliar o período de 5 min da interface, está sendo reunida a partir da publicação diária de Melbourne, e não compõe os resultados desta versão.</w:t>
       </w:r>
     </w:p>
@@ -35998,6 +35996,7 @@
         <w:rPr>
           <w:lang w:val="pt-BR"/>
         </w:rPr>
+        <w:lastRenderedPageBreak/>
         <w:t>6 CONCLUSÕES</w:t>
       </w:r>
       <w:bookmarkEnd w:id="72"/>
@@ -36229,6 +36228,7 @@
         <w:rPr>
           <w:lang w:val="pt-BR"/>
         </w:rPr>
+        <w:lastRenderedPageBreak/>
         <w:t>Treinar e operar a camada de previsão com série no período de publicação da interface, de 5 min, e avaliar o efeito no ciclo completo de decisão (3.6, 4.6 e 5.3).</w:t>
       </w:r>
     </w:p>
@@ -36307,6 +36307,7 @@
         <w:rPr>
           <w:lang w:val="pt-BR"/>
         </w:rPr>
+        <w:lastRenderedPageBreak/>
         <w:t>REFERÊNCIAS</w:t>
       </w:r>
       <w:bookmarkEnd w:id="74"/>
@@ -36536,13 +36537,7 @@
         <w:rPr>
           <w:lang w:val="pt-BR"/>
         </w:rPr>
-        <w:t xml:space="preserve">: relé fotocontrolador intercambiável e tomada para iluminação – especificação e ensaios. </w:t>
-      </w:r>
-      <w:r>
-        <w:rPr>
-          <w:lang w:val="pt-BR"/>
-        </w:rPr>
-        <w:t xml:space="preserve">Rio de Janeiro: ABNT, 2016. Versão corrigida.</w:t>
+        <w:t>: relé fotocontrolador intercambiável e tomada para iluminação – especificação e ensaios. Rio de Janeiro: ABNT, 2016. Versão corrigida.</w:t>
       </w:r>
     </w:p>
     <w:p>
@@ -36607,6 +36602,7 @@
         <w:rPr>
           <w:lang w:val="pt-BR"/>
         </w:rPr>
+        <w:lastRenderedPageBreak/>
         <w:t>https://www.planalto.gov.br/ccivil_03/_ato2015-2018/2018/lei/l13709.htm. Acesso em: 13 set. 2026.</w:t>
       </w:r>
     </w:p>
@@ -36736,10 +36732,7 @@
         </w:rPr>
       </w:pPr>
       <w:r>
-        <w:t xml:space="preserve">DIZON, Eisley;</w:t>
-      </w:r>
-      <w:r>
-        <w:t xml:space="preserve"> PRANGGONO, Bernardi. Smart streetlights in Smart City: a case study of Sheffield. </w:t>
+        <w:t xml:space="preserve">DIZON, Eisley; PRANGGONO, Bernardi. Smart streetlights in Smart City: a case study of Sheffield. </w:t>
       </w:r>
       <w:r>
         <w:rPr>
@@ -36902,12 +36895,15 @@
     <w:p>
       <w:pPr>
         <w:spacing w:after="240"/>
-      </w:pPr>
-      <w:r>
-        <w:rPr>
-          <w:lang w:val="pt-BR"/>
-        </w:rPr>
-        <w:t xml:space="preserve">INSTITUTO NACIONAL DE METROLOGIA, QUALIDADE E TECNOLOGIA. Portaria nº 20, de 15 de fevereiro de 2017: aprova o regulamento técnico da qualidade para luminárias para iluminação pública viária. Brasília: Inmetro, 2017. Revogada pela Portaria nº 62, de 2022.</w:t>
+        <w:rPr>
+          <w:lang w:val="pt-BR"/>
+        </w:rPr>
+      </w:pPr>
+      <w:r>
+        <w:rPr>
+          <w:lang w:val="pt-BR"/>
+        </w:rPr>
+        <w:t>INSTITUTO NACIONAL DE METROLOGIA, QUALIDADE E TECNOLOGIA. Portaria nº 20, de 15 de fevereiro de 2017: aprova o regulamento técnico da qualidade para luminárias para iluminação pública viária. Brasília: Inmetro, 2017. Revogada pela Portaria nº 62, de 2022.</w:t>
       </w:r>
     </w:p>
     <w:p>
@@ -36921,6 +36917,7 @@
         <w:rPr>
           <w:lang w:val="pt-BR"/>
         </w:rPr>
+        <w:lastRenderedPageBreak/>
         <w:t xml:space="preserve">INSTITUTO NACIONAL DE METROLOGIA, QUALIDADE E TECNOLOGIA. </w:t>
       </w:r>
       <w:r>
@@ -36929,7 +36926,24 @@
           <w:bCs/>
           <w:lang w:val="pt-BR"/>
         </w:rPr>
-        <w:t xml:space="preserve">Portaria nº 62, </w:t>
+        <w:t>Portaria nº 62, de 17 de fevereiro de 2022</w:t>
+      </w:r>
+      <w:r>
+        <w:rPr>
+          <w:lang w:val="pt-BR"/>
+        </w:rPr>
+        <w:t>: aprova o regulamento técnico da qualidade e os requisitos de avaliação da conformidade para luminárias para iluminação pública viária. Brasília: Inmetro, 2022a.</w:t>
+      </w:r>
+    </w:p>
+    <w:p>
+      <w:pPr>
+        <w:spacing w:after="240"/>
+      </w:pPr>
+      <w:r>
+        <w:rPr>
+          <w:lang w:val="pt-BR"/>
+        </w:rPr>
+        <w:t xml:space="preserve">INSTITUTO NACIONAL DE METROLOGIA, QUALIDADE E TECNOLOGIA. </w:t>
       </w:r>
       <w:r>
         <w:rPr>
@@ -36937,13 +36951,24 @@
           <w:bCs/>
           <w:lang w:val="pt-BR"/>
         </w:rPr>
-        <w:t xml:space="preserve">de 17 de fevereiro de 2022</w:t>
-      </w:r>
-      <w:r>
-        <w:rPr>
-          <w:lang w:val="pt-BR"/>
-        </w:rPr>
-        <w:t>: aprova o regulamento técnico da qualidade e os requisitos de avaliação da conformidade para luminárias para iluminação pública viária. Brasília: Inmetro, 2022a.</w:t>
+        <w:t>Portaria nº 221, de 23 de maio de 2022</w:t>
+      </w:r>
+      <w:r>
+        <w:rPr>
+          <w:lang w:val="pt-BR"/>
+        </w:rPr>
+        <w:t xml:space="preserve">: aprova a regulamentação técnica metrológica consolidada para sistemas de medição ou medidores de energia elétrica ativa e/ou reativa, eletrônicos, monofásicos e polifásicos, e sistemas de iluminação pública. </w:t>
+      </w:r>
+      <w:r>
+        <w:t xml:space="preserve">Brasília: </w:t>
+      </w:r>
+      <w:proofErr w:type="spellStart"/>
+      <w:r>
+        <w:t>Inmetro</w:t>
+      </w:r>
+      <w:proofErr w:type="spellEnd"/>
+      <w:r>
+        <w:t>, 2022b.</w:t>
       </w:r>
     </w:p>
     <w:p>
@@ -36951,35 +36976,41 @@
         <w:spacing w:after="240"/>
       </w:pPr>
       <w:r>
-        <w:rPr>
-          <w:lang w:val="pt-BR"/>
-        </w:rPr>
-        <w:t xml:space="preserve">INSTITUTO NACIONAL DE METROLOGIA, QUALIDADE E TECNOLOGIA. </w:t>
+        <w:t>INTERNATIONAL ORGANIZATION FOR STANDARDIZATION; INTERNATIONAL ELECTROTECHNICAL COMMISSION. ISO/IEC 25010: systems and software engineering – systems and software quality requirements and evaluation (</w:t>
+      </w:r>
+      <w:proofErr w:type="spellStart"/>
+      <w:r>
+        <w:t>SQuaRE</w:t>
+      </w:r>
+      <w:proofErr w:type="spellEnd"/>
+      <w:r>
+        <w:t xml:space="preserve">) – product quality model. 2. ed. </w:t>
+      </w:r>
+      <w:proofErr w:type="spellStart"/>
+      <w:r>
+        <w:t>Genebra</w:t>
+      </w:r>
+      <w:proofErr w:type="spellEnd"/>
+      <w:r>
+        <w:t>: ISO, 2023.</w:t>
+      </w:r>
+    </w:p>
+    <w:p>
+      <w:pPr>
+        <w:spacing w:after="240"/>
+      </w:pPr>
+      <w:r>
+        <w:t xml:space="preserve">LANA, Ibai; DEL SER, Javier; VELEZ, Manuel; VLAHOGIANNI, Eleni I. Road traffic forecasting: recent advances and new challenges. </w:t>
       </w:r>
       <w:r>
         <w:rPr>
           <w:b/>
           <w:bCs/>
-          <w:lang w:val="pt-BR"/>
-        </w:rPr>
-        <w:t>Portaria nº 221, de 23 de maio de 2022</w:t>
-      </w:r>
-      <w:r>
-        <w:rPr>
-          <w:lang w:val="pt-BR"/>
-        </w:rPr>
-        <w:t xml:space="preserve">: aprova a regulamentação técnica metrológica consolidada para sistemas de medição ou medidores de energia elétrica ativa e/ou reativa, eletrônicos, monofásicos e polifásicos, e sistemas de iluminação pública. </w:t>
-      </w:r>
-      <w:r>
-        <w:t xml:space="preserve">Brasília: </w:t>
-      </w:r>
-      <w:proofErr w:type="spellStart"/>
-      <w:r>
-        <w:t>Inmetro</w:t>
-      </w:r>
-      <w:proofErr w:type="spellEnd"/>
-      <w:r>
-        <w:t>, 2022b.</w:t>
+        </w:rPr>
+        <w:t>IEEE Intelligent Transportation Systems Magazine</w:t>
+      </w:r>
+      <w:r>
+        <w:t>, v. 10, n. 2, p. 93-109, 2018. DOI: 10.1109/MITS.2018.2806634.</w:t>
       </w:r>
     </w:p>
     <w:p>
@@ -36987,41 +37018,17 @@
         <w:spacing w:after="240"/>
       </w:pPr>
       <w:r>
-        <w:t>INTERNATIONAL ORGANIZATION FOR STANDARDIZATION; INTERNATIONAL ELECTROTECHNICAL COMMISSION. ISO/IEC 25010: systems and software engineering – systems and software quality requirements and evaluation (</w:t>
-      </w:r>
-      <w:proofErr w:type="spellStart"/>
-      <w:r>
-        <w:t>SQuaRE</w:t>
-      </w:r>
-      <w:proofErr w:type="spellEnd"/>
-      <w:r>
-        <w:t xml:space="preserve">) – product quality model. 2. ed. </w:t>
-      </w:r>
-      <w:proofErr w:type="spellStart"/>
-      <w:r>
-        <w:t>Genebra</w:t>
-      </w:r>
-      <w:proofErr w:type="spellEnd"/>
-      <w:r>
-        <w:t>: ISO, 2023.</w:t>
-      </w:r>
-    </w:p>
-    <w:p>
-      <w:pPr>
-        <w:spacing w:after="240"/>
-      </w:pPr>
-      <w:r>
-        <w:t xml:space="preserve">LANA, Ibai; DEL SER, Javier; VELEZ, Manuel; VLAHOGIANNI, Eleni I. Road traffic forecasting: recent advances and new challenges. </w:t>
+        <w:t xml:space="preserve">LIN, Jie; YU, Wei; ZHANG, Nan; YANG, Xinyu; ZHANG, Hanlin; ZHAO, Wei. A survey on Internet of Things: architecture, enabling technologies, security and privacy, and applications. </w:t>
       </w:r>
       <w:r>
         <w:rPr>
           <w:b/>
           <w:bCs/>
         </w:rPr>
-        <w:t>IEEE Intelligent Transportation Systems Magazine</w:t>
-      </w:r>
-      <w:r>
-        <w:t>, v. 10, n. 2, p. 93-109, 2018. DOI: 10.1109/MITS.2018.2806634.</w:t>
+        <w:t>IEEE Internet of Things Journal</w:t>
+      </w:r>
+      <w:r>
+        <w:t>, v. 4, n. 5, p. 1125-1142, 2017. DOI: 10.1109/JIOT.2017.2683200.</w:t>
       </w:r>
     </w:p>
     <w:p>
@@ -37029,28 +37036,25 @@
         <w:spacing w:after="240"/>
       </w:pPr>
       <w:r>
-        <w:t xml:space="preserve">LIN, Jie; YU, Wei; ZHANG, Nan; YANG, Xinyu; ZHANG, Hanlin; ZHAO, Wei. A survey on Internet of Things: architecture, enabling technologies, security and privacy, and applications. </w:t>
+        <w:t xml:space="preserve">MAMDANI, Ebrahim H.; ASSILIAN, Sedrak. An experiment in linguistic synthesis with a fuzzy logic controller. </w:t>
       </w:r>
       <w:r>
         <w:rPr>
           <w:b/>
           <w:bCs/>
         </w:rPr>
-        <w:t>IEEE Internet of Things Journal</w:t>
-      </w:r>
-      <w:r>
-        <w:t>, v. 4, n. 5, p. 1125-1142, 2017. DOI: 10.1109/JIOT.2017.2683200.</w:t>
+        <w:t>International Journal of Man-Machine Studies</w:t>
+      </w:r>
+      <w:r>
+        <w:t>, v. 7, n. 1, p. 1-13, 1975.</w:t>
       </w:r>
     </w:p>
     <w:p>
       <w:pPr>
         <w:spacing w:after="240"/>
-        <w:rPr>
-          <w:lang w:val="pt-BR"/>
-        </w:rPr>
-      </w:pPr>
-      <w:r>
-        <w:t xml:space="preserve">MAMDANI, Ebrahim H.; ASSILIAN, Sedrak. An experiment in linguistic synthesis with a fuzzy logic controller. </w:t>
+      </w:pPr>
+      <w:r>
+        <w:t xml:space="preserve">NOGUEIRA, Bruno César. </w:t>
       </w:r>
       <w:r>
         <w:rPr>
@@ -37058,54 +37062,56 @@
           <w:bCs/>
           <w:lang w:val="pt-BR"/>
         </w:rPr>
-        <w:t>International Journal of Man-Machine Studies</w:t>
-      </w:r>
-      <w:r>
-        <w:rPr>
-          <w:lang w:val="pt-BR"/>
-        </w:rPr>
-        <w:t>, v. 7, n. 1, p. 1-13, 1975.</w:t>
+        <w:t>Uma proposta de adaptação dinâmica da iluminação urbana baseada em IoT e DCOP</w:t>
+      </w:r>
+      <w:r>
+        <w:rPr>
+          <w:lang w:val="pt-BR"/>
+        </w:rPr>
+        <w:t xml:space="preserve">. 2024. Dissertação (Mestrado) – Universidade Federal Fluminense, Niterói, 2024. Disponível na Biblioteca Digital Brasileira de Teses e Dissertações em: https://bdtd.ibict.br/vufind/Record/MB_26af3fc1de96227a6a1aa0392ba78ed0. </w:t>
+      </w:r>
+      <w:proofErr w:type="spellStart"/>
+      <w:r>
+        <w:t>Acesso</w:t>
+      </w:r>
+      <w:proofErr w:type="spellEnd"/>
+      <w:r>
+        <w:t xml:space="preserve"> </w:t>
+      </w:r>
+      <w:proofErr w:type="spellStart"/>
+      <w:r>
+        <w:t>em</w:t>
+      </w:r>
+      <w:proofErr w:type="spellEnd"/>
+      <w:r>
+        <w:t>: 13 set. 2026.</w:t>
       </w:r>
     </w:p>
     <w:p>
       <w:pPr>
         <w:spacing w:after="240"/>
-      </w:pPr>
-      <w:r>
-        <w:rPr>
-          <w:lang w:val="pt-BR"/>
-        </w:rPr>
-        <w:t xml:space="preserve">NOGUEIRA, Bruno César. </w:t>
+        <w:rPr>
+          <w:lang w:val="pt-BR"/>
+        </w:rPr>
+      </w:pPr>
+      <w:r>
+        <w:t xml:space="preserve">OASIS. </w:t>
       </w:r>
       <w:r>
         <w:rPr>
           <w:b/>
           <w:bCs/>
-          <w:lang w:val="pt-BR"/>
-        </w:rPr>
-        <w:t>Uma proposta de adaptação dinâmica da iluminação urbana baseada em IoT e DCOP</w:t>
-      </w:r>
-      <w:r>
-        <w:rPr>
-          <w:lang w:val="pt-BR"/>
-        </w:rPr>
-        <w:t xml:space="preserve">. 2024. Dissertação (Mestrado) – Universidade Federal Fluminense, Niterói, 2024. Disponível na Biblioteca Digital Brasileira de Teses e Dissertações em: https://bdtd.ibict.br/vufind/Record/MB_26af3fc1de96227a6a1aa0392ba78ed0. </w:t>
-      </w:r>
-      <w:proofErr w:type="spellStart"/>
-      <w:r>
-        <w:t>Acesso</w:t>
-      </w:r>
-      <w:proofErr w:type="spellEnd"/>
-      <w:r>
-        <w:t xml:space="preserve"> </w:t>
-      </w:r>
-      <w:proofErr w:type="spellStart"/>
-      <w:r>
-        <w:t>em</w:t>
-      </w:r>
-      <w:proofErr w:type="spellEnd"/>
-      <w:r>
-        <w:t>: 13 set. 2026.</w:t>
+        </w:rPr>
+        <w:t>MQTT Version 5.0</w:t>
+      </w:r>
+      <w:r>
+        <w:t xml:space="preserve">: OASIS Standard. Burlington: OASIS Open, 2019. </w:t>
+      </w:r>
+      <w:r>
+        <w:rPr>
+          <w:lang w:val="pt-BR"/>
+        </w:rPr>
+        <w:t>Disponível em: https://docs.oasis-open.org/mqtt/mqtt/v5.0/mqtt-v5.0.html. Acesso em: 12 set. 2026.</w:t>
       </w:r>
     </w:p>
     <w:p>
@@ -37116,23 +37122,24 @@
         </w:rPr>
       </w:pPr>
       <w:r>
-        <w:t xml:space="preserve">OASIS. </w:t>
+        <w:rPr>
+          <w:lang w:val="pt-BR"/>
+        </w:rPr>
+        <w:t xml:space="preserve">OLIVEIRA, Cyntia Barbosa; FAGUNDES, Mari Cristina de Freitas; SPOLLE, Marcus Vinicius. Racismo digital e gestão populacional: uma análise sobre câmeras com reconhecimento facial. </w:t>
       </w:r>
       <w:r>
         <w:rPr>
           <w:b/>
           <w:bCs/>
-        </w:rPr>
-        <w:t>MQTT Version 5.0</w:t>
-      </w:r>
-      <w:r>
-        <w:t xml:space="preserve">: OASIS Standard. Burlington: OASIS Open, 2019. </w:t>
-      </w:r>
-      <w:r>
-        <w:rPr>
-          <w:lang w:val="pt-BR"/>
-        </w:rPr>
-        <w:t>Disponível em: https://docs.oasis-open.org/mqtt/mqtt/v5.0/mqtt-v5.0.html. Acesso em: 12 set. 2026.</w:t>
+          <w:lang w:val="pt-BR"/>
+        </w:rPr>
+        <w:t>Mosaico</w:t>
+      </w:r>
+      <w:r>
+        <w:rPr>
+          <w:lang w:val="pt-BR"/>
+        </w:rPr>
+        <w:t>, v. 17, n. 27, e1727202546, 2025. DOI: 10.12660/rm.v17n27.2025.92355.</w:t>
       </w:r>
     </w:p>
     <w:p>
@@ -37143,25 +37150,49 @@
         <w:rPr>
           <w:lang w:val="pt-BR"/>
         </w:rPr>
-        <w:t xml:space="preserve">OLIVEIRA, Cyntia Barbosa; FAGUNDES, Mari Cristina de Freitas; SPOLLE, Marcus Vinicius. Racismo digital e gestão populacional: uma análise sobre câmeras com reconhecimento facial. </w:t>
+        <w:t xml:space="preserve">PASOLINI, Gianni et al. </w:t>
+      </w:r>
+      <w:r>
+        <w:t>Comprehensive assessment of context-adaptive street lighting: technical aspects, economic insights, and measurements from large-scale, long-term implementations. Sensors, v. 24, n. 18, art. 5942, 2024. DOI: 10.3390/s24185942.</w:t>
+      </w:r>
+    </w:p>
+    <w:p>
+      <w:pPr>
+        <w:spacing w:after="240"/>
+      </w:pPr>
+      <w:r>
+        <w:lastRenderedPageBreak/>
+        <w:t xml:space="preserve">PERRY, Tekla S. Cops tap smart streetlights, sparking controversy and legislation. </w:t>
       </w:r>
       <w:r>
         <w:rPr>
           <w:b/>
           <w:bCs/>
-        </w:rPr>
-        <w:t>Mosaico</w:t>
-      </w:r>
-      <w:r>
-        <w:t>, v. 17, n. 27, e1727202546, 2025. DOI: 10.12660/</w:t>
-      </w:r>
-      <w:proofErr w:type="gramStart"/>
-      <w:r>
-        <w:t>rm.v</w:t>
-      </w:r>
-      <w:proofErr w:type="gramEnd"/>
-      <w:r>
-        <w:t>17n27.2025.92355.</w:t>
+          <w:lang w:val="pt-BR"/>
+        </w:rPr>
+        <w:t>IEEE Spectrum</w:t>
+      </w:r>
+      <w:r>
+        <w:rPr>
+          <w:lang w:val="pt-BR"/>
+        </w:rPr>
+        <w:t xml:space="preserve">, 8 ago. 2020. Disponível em: https://spectrum.ieee.org/cops-smart-street-lights. </w:t>
+      </w:r>
+      <w:proofErr w:type="spellStart"/>
+      <w:r>
+        <w:t>Acesso</w:t>
+      </w:r>
+      <w:proofErr w:type="spellEnd"/>
+      <w:r>
+        <w:t xml:space="preserve"> </w:t>
+      </w:r>
+      <w:proofErr w:type="spellStart"/>
+      <w:r>
+        <w:t>em</w:t>
+      </w:r>
+      <w:proofErr w:type="spellEnd"/>
+      <w:r>
+        <w:t>: 13 set. 2026.</w:t>
       </w:r>
     </w:p>
     <w:p>
@@ -37169,45 +37200,17 @@
         <w:spacing w:after="240"/>
       </w:pPr>
       <w:r>
-        <w:t xml:space="preserve">PASOLINI, Gianni et al. Comprehensive assessment of context-adaptive street lighting: technical aspects, economic insights, and measurements from large-scale, long-term implementations. Sensors, v. 24, n. 18, art. 5942, 2024. DOI: 10.3390/s24185942.</w:t>
-      </w:r>
-    </w:p>
-    <w:p>
-      <w:pPr>
-        <w:spacing w:after="240"/>
-      </w:pPr>
-      <w:r>
-        <w:t xml:space="preserve">PERRY, Tekla S. Cops tap smart streetlights, sparking controversy and legislation. </w:t>
+        <w:t xml:space="preserve">PICKERING, Lynn; COHEN, Kelly; DE BAETS, Bernard. A narrative review on the interpretability of fuzzy rule-based models from a modern interpretable machine learning perspective. </w:t>
       </w:r>
       <w:r>
         <w:rPr>
           <w:b/>
           <w:bCs/>
-          <w:lang w:val="pt-BR"/>
-        </w:rPr>
-        <w:t>IEEE Spectrum</w:t>
-      </w:r>
-      <w:r>
-        <w:rPr>
-          <w:lang w:val="pt-BR"/>
-        </w:rPr>
-        <w:t xml:space="preserve">, 8 ago. 2020. Disponível em: https://spectrum.ieee.org/cops-smart-street-lights. </w:t>
-      </w:r>
-      <w:proofErr w:type="spellStart"/>
-      <w:r>
-        <w:t>Acesso</w:t>
-      </w:r>
-      <w:proofErr w:type="spellEnd"/>
-      <w:r>
-        <w:t xml:space="preserve"> </w:t>
-      </w:r>
-      <w:proofErr w:type="spellStart"/>
-      <w:r>
-        <w:t>em</w:t>
-      </w:r>
-      <w:proofErr w:type="spellEnd"/>
-      <w:r>
-        <w:t>: 13 set. 2026.</w:t>
+        </w:rPr>
+        <w:t>International Journal of Fuzzy Systems</w:t>
+      </w:r>
+      <w:r>
+        <w:t>, v. 28, n. 4, p. 1313-1332, 2026. DOI: 10.1007/s40815-025-02022-z.</w:t>
       </w:r>
     </w:p>
     <w:p>
@@ -37215,31 +37218,59 @@
         <w:spacing w:after="240"/>
       </w:pPr>
       <w:r>
-        <w:t xml:space="preserve">PICKERING, Lynn; COHEN, Kelly; DE BAETS, Bernard. A narrative review on the interpretability of fuzzy rule-based models from a modern interpretable machine </w:t>
-      </w:r>
-      <w:r>
-        <w:t xml:space="preserve">learning perspective. </w:t>
+        <w:rPr>
+          <w:lang w:val="pt-BR"/>
+        </w:rPr>
+        <w:t xml:space="preserve">RIBEIRO, Maria Carolina Hernandez. </w:t>
       </w:r>
       <w:r>
         <w:rPr>
           <w:b/>
           <w:bCs/>
-        </w:rPr>
-        <w:t>International Journal of Fuzzy Systems</w:t>
-      </w:r>
-      <w:r>
-        <w:t>, v. 28, n. 4, p. 1313-1332, 2026. DOI: 10.1007/s40815-025-02022-z.</w:t>
+          <w:lang w:val="pt-BR"/>
+        </w:rPr>
+        <w:t>Projeto de iluminação pública da Unicamp prevê redução de custos e de consumo energético</w:t>
+      </w:r>
+      <w:r>
+        <w:rPr>
+          <w:lang w:val="pt-BR"/>
+        </w:rPr>
+        <w:t xml:space="preserve">. Campinas: Portal Unicamp, 28 jan. 2026. Disponível em: https://www.unicamp.br/noticias/2026/01/28/projeto-de-iluminacao-publica-da-unicamp-preve-reducao-de-custos-e-de-consumo-energetico/. </w:t>
+      </w:r>
+      <w:proofErr w:type="spellStart"/>
+      <w:r>
+        <w:t>Acesso</w:t>
+      </w:r>
+      <w:proofErr w:type="spellEnd"/>
+      <w:r>
+        <w:t xml:space="preserve"> </w:t>
+      </w:r>
+      <w:proofErr w:type="spellStart"/>
+      <w:r>
+        <w:t>em</w:t>
+      </w:r>
+      <w:proofErr w:type="spellEnd"/>
+      <w:r>
+        <w:t>: 12 set. 2026.</w:t>
       </w:r>
     </w:p>
     <w:p>
       <w:pPr>
         <w:spacing w:after="240"/>
-      </w:pPr>
-      <w:r>
-        <w:rPr>
-          <w:lang w:val="pt-BR"/>
-        </w:rPr>
-        <w:t xml:space="preserve">RIBEIRO, Maria Carolina Hernandez. </w:t>
+        <w:rPr>
+          <w:lang w:val="pt-BR"/>
+        </w:rPr>
+      </w:pPr>
+      <w:r>
+        <w:t xml:space="preserve">RUDIN, Cynthia. Stop explaining black box machine learning models for </w:t>
+      </w:r>
+      <w:proofErr w:type="gramStart"/>
+      <w:r>
+        <w:t>high stakes</w:t>
+      </w:r>
+      <w:proofErr w:type="gramEnd"/>
+      <w:r>
+        <w:t xml:space="preserve"> decisions and use interpretable models instead. </w:t>
       </w:r>
       <w:r>
         <w:rPr>
@@ -37247,29 +37278,13 @@
           <w:bCs/>
           <w:lang w:val="pt-BR"/>
         </w:rPr>
-        <w:t>Projeto de iluminação pública da Unicamp prevê redução de custos e de consumo energético</w:t>
-      </w:r>
-      <w:r>
-        <w:rPr>
-          <w:lang w:val="pt-BR"/>
-        </w:rPr>
-        <w:t xml:space="preserve">. Campinas: Portal Unicamp, 28 jan. 2026. Disponível em: https://www.unicamp.br/noticias/2026/01/28/projeto-de-iluminacao-publica-da-unicamp-preve-reducao-de-custos-e-de-consumo-energetico/. </w:t>
-      </w:r>
-      <w:proofErr w:type="spellStart"/>
-      <w:r>
-        <w:t>Acesso</w:t>
-      </w:r>
-      <w:proofErr w:type="spellEnd"/>
-      <w:r>
-        <w:t xml:space="preserve"> </w:t>
-      </w:r>
-      <w:proofErr w:type="spellStart"/>
-      <w:r>
-        <w:t>em</w:t>
-      </w:r>
-      <w:proofErr w:type="spellEnd"/>
-      <w:r>
-        <w:t>: 12 set. 2026.</w:t>
+        <w:t>Nature Machine Intelligence</w:t>
+      </w:r>
+      <w:r>
+        <w:rPr>
+          <w:lang w:val="pt-BR"/>
+        </w:rPr>
+        <w:t>, v. 1, n. 5, p. 206-215, 2019. DOI: 10.1038/s42256-019-0048-x.</w:t>
       </w:r>
     </w:p>
     <w:p>
@@ -37280,15 +37295,10 @@
         </w:rPr>
       </w:pPr>
       <w:r>
-        <w:t xml:space="preserve">RUDIN, Cynthia. Stop explaining black box machine learning models for </w:t>
-      </w:r>
-      <w:proofErr w:type="gramStart"/>
-      <w:r>
-        <w:t>high stakes</w:t>
-      </w:r>
-      <w:proofErr w:type="gramEnd"/>
-      <w:r>
-        <w:t xml:space="preserve"> decisions and use interpretable models instead. </w:t>
+        <w:rPr>
+          <w:lang w:val="pt-BR"/>
+        </w:rPr>
+        <w:t xml:space="preserve">SÃO PAULO (Município). Secretaria Municipal de Serviços. </w:t>
       </w:r>
       <w:r>
         <w:rPr>
@@ -37296,13 +37306,13 @@
           <w:bCs/>
           <w:lang w:val="pt-BR"/>
         </w:rPr>
-        <w:t>Nature Machine Intelligence</w:t>
-      </w:r>
-      <w:r>
-        <w:rPr>
-          <w:lang w:val="pt-BR"/>
-        </w:rPr>
-        <w:t>, v. 1, n. 5, p. 206-215, 2019. DOI: 10.1038/s42256-019-0048-x.</w:t>
+        <w:t>Anexo III do Contrato – Caderno de Encargos da Concessionária; Anexo V do Contrato – Sistema de Mensuração de Disponibilidade e Desempenho.</w:t>
+      </w:r>
+      <w:r>
+        <w:rPr>
+          <w:lang w:val="pt-BR"/>
+        </w:rPr>
+        <w:t xml:space="preserve"> Concorrência Internacional nº 01/SES/2015. São Paulo: Secretaria Municipal de Serviços, 2015. Edital republicado e seus anexos disponíveis em: https://prefeitura.sp.gov.br/web/spregula/w/iluminacao_publica/noticias/206645. Acesso em: 13 set. 2026.</w:t>
       </w:r>
     </w:p>
     <w:p>
@@ -37316,7 +37326,7 @@
         <w:rPr>
           <w:lang w:val="pt-BR"/>
         </w:rPr>
-        <w:t xml:space="preserve">SÃO PAULO (Município). Secretaria Municipal de Serviços. </w:t>
+        <w:t xml:space="preserve">SÃO PAULO (Município). Secretaria Municipal de Serviços e Obras. </w:t>
       </w:r>
       <w:r>
         <w:rPr>
@@ -37324,13 +37334,13 @@
           <w:bCs/>
           <w:lang w:val="pt-BR"/>
         </w:rPr>
-        <w:t>Anexo III do Contrato – Caderno de Encargos da Concessionária; Anexo V do Contrato – Sistema de Mensuração de Disponibilidade e Desempenho.</w:t>
-      </w:r>
-      <w:r>
-        <w:rPr>
-          <w:lang w:val="pt-BR"/>
-        </w:rPr>
-        <w:t xml:space="preserve"> Concorrência Internacional nº 01/SES/2015. São Paulo: Secretaria Municipal de Serviços, 2015. Edital republicado e seus anexos disponíveis em: https://prefeitura.sp.gov.br/web/spregula/w/iluminacao_publica/noticias/206645. Acesso em: 13 set. 2026.</w:t>
+        <w:t>Contrato de Concessão nº 003/SMSO/2018</w:t>
+      </w:r>
+      <w:r>
+        <w:rPr>
+          <w:lang w:val="pt-BR"/>
+        </w:rPr>
+        <w:t>: parceria público-privada na modalidade de concessão administrativa para modernização, otimização, expansão, operação, manutenção e controle remoto e em tempo real da infraestrutura da rede de iluminação pública do Município de São Paulo. São Paulo: Prefeitura do Município de São Paulo, 2018a. Originado da Concorrência Internacional nº 01/SES/2015. Contrato e termos aditivos disponíveis em: https://prefeitura.sp.gov.br/web/spregula/iluminacao_publica/contratos/. Acesso em: 13 set. 2026.</w:t>
       </w:r>
     </w:p>
     <w:p>
@@ -37344,7 +37354,7 @@
         <w:rPr>
           <w:lang w:val="pt-BR"/>
         </w:rPr>
-        <w:t xml:space="preserve">SÃO PAULO (Município). Secretaria Municipal de Serviços e Obras. </w:t>
+        <w:t xml:space="preserve">SÃO PAULO (Município). Secretaria Especial de Comunicação. </w:t>
       </w:r>
       <w:r>
         <w:rPr>
@@ -37352,13 +37362,13 @@
           <w:bCs/>
           <w:lang w:val="pt-BR"/>
         </w:rPr>
-        <w:t>Contrato de Concessão nº 003/SMSO/2018</w:t>
-      </w:r>
-      <w:r>
-        <w:rPr>
-          <w:lang w:val="pt-BR"/>
-        </w:rPr>
-        <w:t>: parceria público-privada na modalidade de concessão administrativa para modernização, otimização, expansão, operação, manutenção e controle remoto e em tempo real da infraestrutura da rede de iluminação pública do Município de São Paulo. São Paulo: Prefeitura do Município de São Paulo, 2018a. Originado da Concorrência Internacional nº 01/SES/2015. Contrato e termos aditivos disponíveis em: https://prefeitura.sp.gov.br/web/spregula/iluminacao_publica/contratos/. Acesso em: 13 set. 2026.</w:t>
+        <w:t>Prefeitura assina contrato com consórcio responsável pela modernização da iluminação pública</w:t>
+      </w:r>
+      <w:r>
+        <w:rPr>
+          <w:lang w:val="pt-BR"/>
+        </w:rPr>
+        <w:t>. São Paulo: Prefeitura do Município de São Paulo, 2018b. Disponível em: https://prefeitura.sp.gov.br/w/noticia/prefeitura-assina-contrato-com-consorcio-responsavel-pela-modernizacao-da-iluminacao-publica. Acesso em: 12 set. 2026.</w:t>
       </w:r>
     </w:p>
     <w:p>
@@ -37372,7 +37382,7 @@
         <w:rPr>
           <w:lang w:val="pt-BR"/>
         </w:rPr>
-        <w:t xml:space="preserve">SÃO PAULO (Município). Secretaria Especial de Comunicação. </w:t>
+        <w:t xml:space="preserve">SÃO PAULO (Município). </w:t>
       </w:r>
       <w:r>
         <w:rPr>
@@ -37380,13 +37390,13 @@
           <w:bCs/>
           <w:lang w:val="pt-BR"/>
         </w:rPr>
-        <w:t>Prefeitura assina contrato com consórcio responsável pela modernização da iluminação pública</w:t>
-      </w:r>
-      <w:r>
-        <w:rPr>
-          <w:lang w:val="pt-BR"/>
-        </w:rPr>
-        <w:t>. São Paulo: Prefeitura do Município de São Paulo, 2018b. Disponível em: https://prefeitura.sp.gov.br/w/noticia/prefeitura-assina-contrato-com-consorcio-responsavel-pela-modernizacao-da-iluminacao-publica. Acesso em: 12 set. 2026.</w:t>
+        <w:t>Termos de aditamento ao Contrato de Concessão nº 003/SMSO/2018</w:t>
+      </w:r>
+      <w:r>
+        <w:rPr>
+          <w:lang w:val="pt-BR"/>
+        </w:rPr>
+        <w:t>. São Paulo: SP Regula – Agência Reguladora de Serviços Públicos do Município de São Paulo, 2019-2022. Disponível em: https://prefeitura.sp.gov.br/web/spregula/iluminacao_publica/contratos/. Acesso em: 13 set. 2026.</w:t>
       </w:r>
     </w:p>
     <w:p>
@@ -37400,7 +37410,7 @@
         <w:rPr>
           <w:lang w:val="pt-BR"/>
         </w:rPr>
-        <w:t xml:space="preserve">SÃO PAULO (Município). </w:t>
+        <w:t xml:space="preserve">SÃO PAULO (Município). Secretaria Especial de Comunicação. </w:t>
       </w:r>
       <w:r>
         <w:rPr>
@@ -37408,13 +37418,20 @@
           <w:bCs/>
           <w:lang w:val="pt-BR"/>
         </w:rPr>
-        <w:t>Termos de aditamento ao Contrato de Concessão nº 003/SMSO/2018</w:t>
-      </w:r>
-      <w:r>
-        <w:rPr>
-          <w:lang w:val="pt-BR"/>
-        </w:rPr>
-        <w:t>. São Paulo: SP Regula – Agência Reguladora de Serviços Públicos do Município de São Paulo, 2019-2022. Disponível em: https://prefeitura.sp.gov.br/web/spregula/iluminacao_publica/contratos/. Acesso em: 13 set. 2026.</w:t>
+        <w:t>Prefeitura avança na modernização com LED da rede de iluminação pública de São Paulo</w:t>
+      </w:r>
+      <w:r>
+        <w:rPr>
+          <w:lang w:val="pt-BR"/>
+        </w:rPr>
+        <w:t xml:space="preserve">. São </w:t>
+      </w:r>
+      <w:r>
+        <w:rPr>
+          <w:lang w:val="pt-BR"/>
+        </w:rPr>
+        <w:lastRenderedPageBreak/>
+        <w:t>Paulo: Prefeitura do Município de São Paulo, 8 out. 2021. Disponível em: https://prefeitura.sp.gov.br/w/noticia/prefeitura-avanca-na-modernizacao-com-led-da-rede-de-iluminacao-publica-de-sao-paulo. Acesso em: 13 set. 2026.</w:t>
       </w:r>
     </w:p>
     <w:p>
@@ -37428,7 +37445,7 @@
         <w:rPr>
           <w:lang w:val="pt-BR"/>
         </w:rPr>
-        <w:t xml:space="preserve">SÃO PAULO (Município). Secretaria Especial de Comunicação. </w:t>
+        <w:t xml:space="preserve">SÃO PAULO (Município). Secretaria Municipal de Segurança Urbana. </w:t>
       </w:r>
       <w:r>
         <w:rPr>
@@ -37436,13 +37453,13 @@
           <w:bCs/>
           <w:lang w:val="pt-BR"/>
         </w:rPr>
-        <w:t>Prefeitura avança na modernização com LED da rede de iluminação pública de São Paulo</w:t>
-      </w:r>
-      <w:r>
-        <w:rPr>
-          <w:lang w:val="pt-BR"/>
-        </w:rPr>
-        <w:t>. São Paulo: Prefeitura do Município de São Paulo, 8 out. 2021. Disponível em: https://prefeitura.sp.gov.br/w/noticia/prefeitura-avanca-na-modernizacao-com-led-da-rede-de-iluminacao-publica-de-sao-paulo. Acesso em: 13 set. 2026.</w:t>
+        <w:t>Termo de Referência – Plataforma Smart Sampa (Anexo A)</w:t>
+      </w:r>
+      <w:r>
+        <w:rPr>
+          <w:lang w:val="pt-BR"/>
+        </w:rPr>
+        <w:t>. São Paulo: Secretaria Municipal de Segurança Urbana, 2022. Versão submetida a consulta pública virtual entre 12 e 31 de agosto de 2022, na plataforma Participe+. Anexos II, IV, V, VIII e XI. Disponível em: https://participemais.prefeitura.sp.gov.br/legislation/processes/209/topics. Acesso em: 13 set. 2026.</w:t>
       </w:r>
     </w:p>
     <w:p>
@@ -37464,19 +37481,27 @@
           <w:bCs/>
           <w:lang w:val="pt-BR"/>
         </w:rPr>
-        <w:t>Termo de Referência – Plataforma Smart Sampa (Anexo A)</w:t>
-      </w:r>
-      <w:r>
-        <w:rPr>
-          <w:lang w:val="pt-BR"/>
-        </w:rPr>
-        <w:t xml:space="preserve">. São Paulo: Secretaria Municipal de Segurança Urbana, 2022. Versão submetida a consulta pública virtual entre 12 e 31 de agosto de 2022, na plataforma </w:t>
-      </w:r>
-      <w:r>
-        <w:rPr>
-          <w:lang w:val="pt-BR"/>
-        </w:rPr>
-        <w:t>Participe+. Anexos II, IV, V, VIII e XI. Disponível em: https://participemais.prefeitura.sp.gov.br/legislation/processes/209/topics. Acesso em: 13 set. 2026.</w:t>
+        <w:t>Termo de Contrato nº 032/SMSU/2023</w:t>
+      </w:r>
+      <w:r>
+        <w:rPr>
+          <w:lang w:val="pt-BR"/>
+        </w:rPr>
+        <w:t>: Programa Smart Sampa. Contratada: Consórcio Smart City SP. São Paulo: Secretaria Municipal de Segurança Urbana, 7 ago. 2023. Originado do Pregão Eletrônico nº 079/SMSU/2022, processo 6029.2021/0015253-1. Disponível em: https://prefeitura.sp.gov.br/web/seguranca_urbana/w/menu/366662. Acesso em: 13 set. 2026.</w:t>
+      </w:r>
+    </w:p>
+    <w:p>
+      <w:pPr>
+        <w:spacing w:after="240"/>
+        <w:rPr>
+          <w:lang w:val="pt-BR"/>
+        </w:rPr>
+      </w:pPr>
+      <w:r>
+        <w:rPr>
+          <w:lang w:val="pt-BR"/>
+        </w:rPr>
+        <w:t>SÃO PAULO (Município). Secretaria Municipal de Segurança Urbana. Edital de Chamamento Público nº 01/SMSU-GAB/2024: Programa Smart Sampa. São Paulo: Secretaria Municipal de Segurança Urbana, 2024. Publicado no Diário Oficial da Cidade de São Paulo em 5 jul. 2024. Disponível em: https://prefeitura.sp.gov.br/documents/d/seguranca_urbana/edital-de-chamamento-publicodocsp-diario-oficial-cidade-de-sao-paulo_05_07_2024-pdf. Acesso em: 27 set. 2026.</w:t>
       </w:r>
     </w:p>
     <w:p>
@@ -37498,13 +37523,13 @@
           <w:bCs/>
           <w:lang w:val="pt-BR"/>
         </w:rPr>
-        <w:t>Termo de Contrato nº 032/SMSU/2023</w:t>
-      </w:r>
-      <w:r>
-        <w:rPr>
-          <w:lang w:val="pt-BR"/>
-        </w:rPr>
-        <w:t>: Programa Smart Sampa. Contratada: Consórcio Smart City SP. São Paulo: Secretaria Municipal de Segurança Urbana, 7 ago. 2023. Originado do Pregão Eletrônico nº 079/SMSU/2022, processo 6029.2021/0015253-1. Disponível em: https://prefeitura.sp.gov.br/web/seguranca_urbana/w/menu/366662. Acesso em: 13 set. 2026.</w:t>
+        <w:t>Programa Smart Sampa atinge meta para 2025 e já soma 40 mil câmeras integradas</w:t>
+      </w:r>
+      <w:r>
+        <w:rPr>
+          <w:lang w:val="pt-BR"/>
+        </w:rPr>
+        <w:t>. São Paulo: Secretaria Municipal de Segurança Urbana, 19 set. 2025. Disponível em: https://prefeitura.sp.gov.br/web/seguranca_urbana/w/programa-smart-sampa-atinge-meta-para-2025-e-já-soma-40-mil-câmeras-integradas-ao-maior-sistema-de-monitoramento-da-américa-latina. Acesso em: 13 set. 2026.</w:t>
       </w:r>
     </w:p>
     <w:p>
@@ -37518,27 +37543,7 @@
         <w:rPr>
           <w:lang w:val="pt-BR"/>
         </w:rPr>
-        <w:t xml:space="preserve">SÃO PAULO (Município). Secretaria Municipal de Segurança Urbana. </w:t>
-      </w:r>
-      <w:r>
-        <w:rPr>
-          <w:lang w:val="pt-BR"/>
-        </w:rPr>
-        <w:t xml:space="preserve">Edital de Chamamento Público nº 01/SMSU-GAB/2024: Programa Smart Sampa. São Paulo: Secretaria Municipal de Segurança Urbana, 2024. Publicado no Diário Oficial da Cidade de São Paulo em 5 jul. 2024. Disponível em: https://prefeitura.sp.gov.br/documents/d/seguranca_urbana/edital-de-chamamento-publicodocsp-diario-oficial-cidade-de-sao-paulo_05_07_2024-pdf. Acesso em: 27 set. 2026.</w:t>
-      </w:r>
-    </w:p>
-    <w:p>
-      <w:pPr>
-        <w:spacing w:after="240"/>
-        <w:rPr>
-          <w:lang w:val="pt-BR"/>
-        </w:rPr>
-      </w:pPr>
-      <w:r>
-        <w:rPr>
-          <w:lang w:val="pt-BR"/>
-        </w:rPr>
-        <w:t xml:space="preserve">SÃO PAULO (Município). Secretaria Municipal de Segurança Urbana. </w:t>
+        <w:t xml:space="preserve">SÃO PAULO (Município). </w:t>
       </w:r>
       <w:r>
         <w:rPr>
@@ -37546,13 +37551,19 @@
           <w:bCs/>
           <w:lang w:val="pt-BR"/>
         </w:rPr>
-        <w:t>Programa Smart Sampa atinge meta para 2025 e já soma 40 mil câmeras integradas</w:t>
-      </w:r>
-      <w:r>
-        <w:rPr>
-          <w:lang w:val="pt-BR"/>
-        </w:rPr>
-        <w:t>. São Paulo: Secretaria Municipal de Segurança Urbana, 19 set. 2025. Disponível em: https://prefeitura.sp.gov.br/web/seguranca_urbana/w/programa-smart-sampa-atinge-meta-para-2025-e-já-soma-40-mil-câmeras-integradas-ao-maior-sistema-de-monitoramento-da-américa-latina. Acesso em: 13 set. 2026.</w:t>
+        <w:t>Portal de dados abertos da cidade de São Paulo</w:t>
+      </w:r>
+      <w:r>
+        <w:rPr>
+          <w:lang w:val="pt-BR"/>
+        </w:rPr>
+        <w:t xml:space="preserve">. São Paulo: Prefeitura do Município de São Paulo, 2026a. Disponível em: https://dados.prefeitura.sp.gov.br/. </w:t>
+      </w:r>
+      <w:r>
+        <w:rPr>
+          <w:lang w:val="pt-BR"/>
+        </w:rPr>
+        <w:t>Acesso em: 12 set. 2026.</w:t>
       </w:r>
     </w:p>
     <w:p>
@@ -37566,47 +37577,34 @@
         <w:rPr>
           <w:lang w:val="pt-BR"/>
         </w:rPr>
-        <w:t xml:space="preserve">SÃO PAULO (Município). </w:t>
-      </w:r>
-      <w:r>
-        <w:rPr>
-          <w:b/>
-          <w:bCs/>
-          <w:lang w:val="pt-BR"/>
-        </w:rPr>
-        <w:t>Portal de dados abertos da cidade de São Paulo</w:t>
-      </w:r>
-      <w:r>
-        <w:rPr>
-          <w:lang w:val="pt-BR"/>
-        </w:rPr>
-        <w:t xml:space="preserve">. São Paulo: Prefeitura do Município de São Paulo, 2026a. Disponível em: https://dados.prefeitura.sp.gov.br/. </w:t>
-      </w:r>
-      <w:r>
-        <w:rPr>
-          <w:lang w:val="pt-BR"/>
-        </w:rPr>
-        <w:t>Acesso em: 12 set. 2026.</w:t>
+        <w:t>SÃO PAULO (Município). Secretaria Municipal de Segurança Urbana. Smart Sampa chega a 50 mil câmeras e já supera em 25% o previsto no Programa de Metas. São Paulo: Secretaria Municipal de Segurança Urbana, 1 abr. 2026b. Disponível em: https://prefeitura.sp.gov.br/web/seguranca_urbana/w/smart-sampa-chega-a-50-mil-câmeras-e-já-supera-em-25-o-previsto-no-programa-de-metas. Acesso em: 27 set. 2026.</w:t>
       </w:r>
     </w:p>
     <w:p>
       <w:pPr>
         <w:spacing w:after="240"/>
-        <w:rPr>
-          <w:lang w:val="pt-BR"/>
-        </w:rPr>
-      </w:pPr>
-      <w:r>
-        <w:rPr>
-          <w:lang w:val="pt-BR"/>
-        </w:rPr>
-        <w:t xml:space="preserve">SÃO PAULO (Município). Secretaria Municipal de Segurança Urbana. </w:t>
-      </w:r>
-      <w:r>
-        <w:rPr>
-          <w:lang w:val="pt-BR"/>
-        </w:rPr>
-        <w:t xml:space="preserve">Smart Sampa chega a 50 mil câmeras e já supera em 25% o previsto no Programa de Metas. São Paulo: Secretaria Municipal de Segurança Urbana, 1 abr. 2026b. Disponível em: https://prefeitura.sp.gov.br/web/seguranca_urbana/w/smart-sampa-chega-a-50-mil-câmeras-e-já-supera-em-25-o-previsto-no-programa-de-metas. Acesso em: 27 set. 2026.</w:t>
+      </w:pPr>
+      <w:r>
+        <w:rPr>
+          <w:lang w:val="pt-BR"/>
+        </w:rPr>
+        <w:t xml:space="preserve">SÃO PAULO (Município). GeoSampa: camadas de iluminação pública e de segmentos de logradouro, serviço de feições geográficas (WFS). São Paulo: Prefeitura do Município de São Paulo, 2026c. Disponível em: https://wfs.geosampa.prefeitura.sp.gov.br/geoserver/geoportal/wfs. </w:t>
+      </w:r>
+      <w:proofErr w:type="spellStart"/>
+      <w:r>
+        <w:t>Acesso</w:t>
+      </w:r>
+      <w:proofErr w:type="spellEnd"/>
+      <w:r>
+        <w:t xml:space="preserve"> </w:t>
+      </w:r>
+      <w:proofErr w:type="spellStart"/>
+      <w:r>
+        <w:t>em</w:t>
+      </w:r>
+      <w:proofErr w:type="spellEnd"/>
+      <w:r>
+        <w:t>: 27 set. 2026.</w:t>
       </w:r>
     </w:p>
     <w:p>
@@ -37614,13 +37612,65 @@
         <w:spacing w:after="240"/>
       </w:pPr>
       <w:r>
-        <w:rPr>
-          <w:lang w:val="pt-BR"/>
-        </w:rPr>
-        <w:t xml:space="preserve">SÃO PAULO (Município). GeoSampa: camadas de iluminação pública e de segmentos de logradouro, serviço de feições geográficas (WFS). São Paulo: Prefeitura do Município de São Paulo, 2026c. Disponível em: https://wfs.geosampa.prefeitura.sp.gov.br/geoserver/geoportal/wfs. </w:t>
+        <w:lastRenderedPageBreak/>
+        <w:t>SHIKAKURA, Tomoaki; MORIKAWA, Hiroyuki; NAKAMURA, Yoshiki. Perception of lighting fluctuation in office lighting environment. Journal of Light &amp; Visual Environment, v. 27, n. 2, p. 75-82, 2003. DOI: 10.2150/jlve.27.75.</w:t>
+      </w:r>
+    </w:p>
+    <w:p>
+      <w:pPr>
+        <w:spacing w:after="240"/>
+      </w:pPr>
+      <w:r>
+        <w:t xml:space="preserve">STADT ZÜRICH. </w:t>
       </w:r>
       <w:proofErr w:type="spellStart"/>
       <w:r>
+        <w:t>Daten</w:t>
+      </w:r>
+      <w:proofErr w:type="spellEnd"/>
+      <w:r>
+        <w:t xml:space="preserve"> der </w:t>
+      </w:r>
+      <w:proofErr w:type="spellStart"/>
+      <w:r>
+        <w:t>automatischen</w:t>
+      </w:r>
+      <w:proofErr w:type="spellEnd"/>
+      <w:r>
+        <w:t xml:space="preserve"> </w:t>
+      </w:r>
+      <w:proofErr w:type="spellStart"/>
+      <w:r>
+        <w:t>Fussgänger</w:t>
+      </w:r>
+      <w:proofErr w:type="spellEnd"/>
+      <w:r>
+        <w:t xml:space="preserve">- und </w:t>
+      </w:r>
+      <w:proofErr w:type="spellStart"/>
+      <w:r>
+        <w:t>Velozählung</w:t>
+      </w:r>
+      <w:proofErr w:type="spellEnd"/>
+      <w:r>
+        <w:t xml:space="preserve">: </w:t>
+      </w:r>
+      <w:proofErr w:type="spellStart"/>
+      <w:r>
+        <w:t>Viertelstundenwerte</w:t>
+      </w:r>
+      <w:proofErr w:type="spellEnd"/>
+      <w:r>
+        <w:t xml:space="preserve">. </w:t>
+      </w:r>
+      <w:r>
+        <w:rPr>
+          <w:lang w:val="pt-BR"/>
+        </w:rPr>
+        <w:t xml:space="preserve">Zürich: Open Data Zürich, 2026. Conjunto de dados. Disponível em: https://data.stadt-zuerich.ch/dataset/ted_taz_verkehrszaehlungen_werte_fussgaenger_velo. </w:t>
+      </w:r>
+      <w:proofErr w:type="spellStart"/>
+      <w:r>
         <w:t>Acesso</w:t>
       </w:r>
       <w:proofErr w:type="spellEnd"/>
@@ -37633,15 +37683,30 @@
       </w:r>
       <w:proofErr w:type="spellEnd"/>
       <w:r>
-        <w:t>: 27 set. 2026.</w:t>
+        <w:t>: 30 set. 2026.</w:t>
       </w:r>
     </w:p>
     <w:p>
       <w:pPr>
         <w:spacing w:after="240"/>
-      </w:pPr>
-      <w:r>
-        <w:t>SHIKAKURA, Tomoaki; MORIKAWA, Hiroyuki; NAKAMURA, Yoshiki. Perception of lighting fluctuation in office lighting environment. Journal of Light &amp; Visual Environment, v. 27, n. 2, p. 75-82, 2003. DOI: 10.2150/jlve.27.75.</w:t>
+        <w:rPr>
+          <w:lang w:val="pt-BR"/>
+        </w:rPr>
+      </w:pPr>
+      <w:r>
+        <w:t xml:space="preserve">TALQ CONSORTIUM. TALQ Smart City Protocol: specification version 2.7.1. </w:t>
+      </w:r>
+      <w:r>
+        <w:rPr>
+          <w:lang w:val="pt-BR"/>
+        </w:rPr>
+        <w:t xml:space="preserve">[S. l.]: TALQ Consortium, 16 abr. 2026. Disponível em: https://github.com/TALQ-consortium/TALQ_specification. </w:t>
+      </w:r>
+      <w:r>
+        <w:rPr>
+          <w:lang w:val="pt-BR"/>
+        </w:rPr>
+        <w:t>Acesso em: 27 set. 2026.</w:t>
       </w:r>
     </w:p>
     <w:p>
@@ -37649,107 +37714,26 @@
         <w:spacing w:after="240"/>
       </w:pPr>
       <w:r>
-        <w:t xml:space="preserve">STADT ZÜRICH. </w:t>
+        <w:rPr>
+          <w:lang w:val="pt-BR"/>
+        </w:rPr>
+        <w:t xml:space="preserve">UNIVERSIDADE ESTADUAL DE CAMPINAS. Núcleo Interdisciplinar de Planejamento Energético. CePIL participa de cerimônia de entrega de dispositivos de telegestão para projeto de iluminação na Unicamp. Campinas: NIPE/Unicamp, 27 jan. 2026. Disponível em: https://www.nipe.unicamp.br/2026/01/27/cepil-participa-de-cerimonia-de-entrega-dos-dispositivos-de-telegestao/. </w:t>
       </w:r>
       <w:proofErr w:type="spellStart"/>
       <w:r>
-        <w:t>Daten</w:t>
+        <w:t>Acesso</w:t>
       </w:r>
       <w:proofErr w:type="spellEnd"/>
       <w:r>
-        <w:t xml:space="preserve"> der </w:t>
+        <w:t xml:space="preserve"> </w:t>
       </w:r>
       <w:proofErr w:type="spellStart"/>
       <w:r>
-        <w:t>automatischen</w:t>
+        <w:t>em</w:t>
       </w:r>
       <w:proofErr w:type="spellEnd"/>
       <w:r>
-        <w:t xml:space="preserve"> </w:t>
-      </w:r>
-      <w:proofErr w:type="spellStart"/>
-      <w:r>
-        <w:t>Fussgänger</w:t>
-      </w:r>
-      <w:proofErr w:type="spellEnd"/>
-      <w:r>
-        <w:t xml:space="preserve">- und </w:t>
-      </w:r>
-      <w:proofErr w:type="spellStart"/>
-      <w:r>
-        <w:t>Velozählung</w:t>
-      </w:r>
-      <w:proofErr w:type="spellEnd"/>
-      <w:r>
-        <w:t xml:space="preserve">: </w:t>
-      </w:r>
-      <w:proofErr w:type="spellStart"/>
-      <w:r>
-        <w:t>Viertelstundenwerte</w:t>
-      </w:r>
-      <w:proofErr w:type="spellEnd"/>
-      <w:r>
-        <w:t xml:space="preserve">. </w:t>
-      </w:r>
-      <w:r>
-        <w:rPr>
-          <w:lang w:val="pt-BR"/>
-        </w:rPr>
-        <w:t xml:space="preserve">Zürich: Open Data Zürich, 2026. Conjunto de dados. Disponível em: https://data.stadt-zuerich.ch/dataset/ted_taz_verkehrszaehlungen_werte_fussgaenger_velo. </w:t>
-      </w:r>
-      <w:proofErr w:type="spellStart"/>
-      <w:r>
-        <w:t>Acesso</w:t>
-      </w:r>
-      <w:proofErr w:type="spellEnd"/>
-      <w:r>
-        <w:t xml:space="preserve"> </w:t>
-      </w:r>
-      <w:proofErr w:type="spellStart"/>
-      <w:r>
-        <w:t>em</w:t>
-      </w:r>
-      <w:proofErr w:type="spellEnd"/>
-      <w:r>
-        <w:t>: 30 set. 2026.</w:t>
-      </w:r>
-    </w:p>
-    <w:p>
-      <w:pPr>
-        <w:spacing w:after="240"/>
-      </w:pPr>
-      <w:r>
-        <w:t xml:space="preserve">TALQ CONSORTIUM. TALQ Smart City Protocol: specification version 2.7.1. </w:t>
-      </w:r>
-      <w:r>
-        <w:rPr>
-          <w:lang w:val="pt-BR"/>
-        </w:rPr>
-        <w:t xml:space="preserve">[S. l.]: TALQ Consortium, 16 abr. 2026. Disponível em: https://github.com/TALQ-consortium/TALQ_specification. </w:t>
-      </w:r>
-      <w:proofErr w:type="spellStart"/>
-      <w:r>
-        <w:t>Acesso</w:t>
-      </w:r>
-      <w:proofErr w:type="spellEnd"/>
-      <w:r>
-        <w:t xml:space="preserve"> </w:t>
-      </w:r>
-      <w:proofErr w:type="spellStart"/>
-      <w:r>
-        <w:t>em</w:t>
-      </w:r>
-      <w:proofErr w:type="spellEnd"/>
-      <w:r>
-        <w:t>: 27 set. 2026.</w:t>
-      </w:r>
-    </w:p>
-    <w:p>
-      <w:pPr>
-        <w:spacing w:after="240"/>
-      </w:pPr>
-      <w:r>
-        <w:t xml:space="preserve">UNIVERSIDADE ESTADUAL DE CAMPINAS. Núcleo Interdisciplinar de Planejamento Energético. CePIL participa de cerimônia de entrega de dispositivos de telegestão para projeto de iluminação na Unicamp. Campinas: NIPE/Unicamp, 27 jan. 2026. Disponível em: https://www.nipe.unicamp.br/2026/01/27/cepil-participa-de-cerimonia-de-entrega-dos-dispositivos-de-telegestao/. Acesso em: 12 set. 2026.</w:t>
+        <w:t>: 12 set. 2026.</w:t>
       </w:r>
     </w:p>
     <w:p>
@@ -37785,6 +37769,7 @@
         <w:rPr>
           <w:lang w:val="pt-BR"/>
         </w:rPr>
+        <w:lastRenderedPageBreak/>
         <w:t>APÊNDICE A — DECLARAÇÃO DE USO DE FERRAMENTAS DE INTELIGÊNCIA ARTIFICIAL GENERATIVA</w:t>
       </w:r>
       <w:bookmarkEnd w:id="75"/>
@@ -37959,31 +37944,22 @@
         <w:rPr>
           <w:lang w:val="pt-BR"/>
         </w:rPr>
-        <w:t xml:space="preserve">(  X  ) Houve utilização de ferramentas de Inteligência Artificial Generativa, detalhada no </w:t>
-      </w:r>
-      <w:r>
-        <w:rPr>
-          <w:lang w:val="pt-BR"/>
-        </w:rPr>
-        <w:t xml:space="preserve">Quadro 19</w:t>
-      </w:r>
-      <w:r>
-        <w:rPr>
-          <w:lang w:val="pt-BR"/>
-        </w:rPr>
-        <w:t xml:space="preserve">.</w:t>
+        <w:t>(  X  ) Houve utilização de ferramentas de Inteligência Artificial Generativa, detalhada no Quadro 19.</w:t>
       </w:r>
     </w:p>
     <w:p>
       <w:pPr>
         <w:spacing w:after="120" w:line="360" w:lineRule="auto"/>
         <w:jc w:val="both"/>
-      </w:pPr>
-      <w:r>
-        <w:rPr>
-          <w:lang w:val="pt-BR"/>
-        </w:rPr>
-        <w:t xml:space="preserve">O emprego das ferramentas seguiu o modelo de programação em par (pair programming), com papéis fixos: a ferramenta atuou como executora — redigindo código, scripts, protocolos e versões de texto —, e os autores atuaram como navegadores, definindo o problema, os requisitos e a arquitetura, aprovando cada critério antes de sua execução, conferindo cada saída contra o protótipo, os dados e as fontes, e rejeitando ou corrigindo o que não se sustentava. Nenhuma saída foi incorporada ao trabalho sem leitura e decisão dos autores, e as decisões de projeto, a interpretação dos resultados e as conclusões são dos autores.</w:t>
+        <w:rPr>
+          <w:lang w:val="pt-BR"/>
+        </w:rPr>
+      </w:pPr>
+      <w:r>
+        <w:rPr>
+          <w:lang w:val="pt-BR"/>
+        </w:rPr>
+        <w:t>O emprego das ferramentas seguiu o modelo de programação em par (pair programming), com papéis fixos: a ferramenta atuou como executora — redigindo código, scripts, protocolos e versões de texto —, e os autores atuaram como navegadores, definindo o problema, os requisitos e a arquitetura, aprovando cada critério antes de sua execução, conferindo cada saída contra o protótipo, os dados e as fontes, e rejeitando ou corrigindo o que não se sustentava. Nenhuma saída foi incorporada ao trabalho sem leitura e decisão dos autores, e as decisões de projeto, a interpretação dos resultados e as conclusões são dos autores.</w:t>
       </w:r>
     </w:p>
     <w:p>
@@ -38000,15 +37976,8 @@
           <w:szCs w:val="20"/>
           <w:lang w:val="pt-BR"/>
         </w:rPr>
-        <w:t xml:space="preserve">Quadro 19</w:t>
-      </w:r>
-      <w:r>
-        <w:rPr>
-          <w:sz w:val="20"/>
-          <w:szCs w:val="20"/>
-          <w:lang w:val="pt-BR"/>
-        </w:rPr>
-        <w:t xml:space="preserve"> – Matriz de emprego técnico de inteligência artificial</w:t>
+        <w:lastRenderedPageBreak/>
+        <w:t>Quadro 19 – Matriz de emprego técnico de inteligência artificial</w:t>
       </w:r>
     </w:p>
     <w:tbl>
@@ -38380,12 +38349,17 @@
             </w:tcMar>
           </w:tcPr>
           <w:p>
-            <w:r>
-              <w:rPr>
-                <w:sz w:val="20"/>
-                <w:szCs w:val="20"/>
-              </w:rPr>
-              <w:t xml:space="preserve">10</w:t>
+            <w:pPr>
+              <w:rPr>
+                <w:lang w:val="pt-BR"/>
+              </w:rPr>
+            </w:pPr>
+            <w:r>
+              <w:rPr>
+                <w:sz w:val="20"/>
+                <w:szCs w:val="20"/>
+              </w:rPr>
+              <w:t>30</w:t>
             </w:r>
           </w:p>
         </w:tc>
@@ -38433,15 +38407,7 @@
                 <w:szCs w:val="20"/>
                 <w:lang w:val="pt-BR"/>
               </w:rPr>
-              <w:t xml:space="preserve">claude-opus-5 e claude-opus-5-5, </w:t>
-            </w:r>
-            <w:r>
-              <w:rPr>
-                <w:sz w:val="20"/>
-                <w:szCs w:val="20"/>
-                <w:lang w:val="pt-BR"/>
-              </w:rPr>
-              <w:t>modo de esforço estendido</w:t>
+              <w:t>claude-opus-5 e claude-opus-5-5, modo de esforço estendido</w:t>
             </w:r>
           </w:p>
         </w:tc>
@@ -38496,15 +38462,7 @@
                 <w:szCs w:val="20"/>
                 <w:lang w:val="pt-BR"/>
               </w:rPr>
-              <w:t xml:space="preserve">Geração dos diagramas de arquitetura, de sequência e de entidade-relacionamento </w:t>
-            </w:r>
-            <w:r>
-              <w:rPr>
-                <w:sz w:val="20"/>
-                <w:szCs w:val="20"/>
-                <w:lang w:val="pt-BR"/>
-              </w:rPr>
-              <w:t>por script Python, a partir da especificação definida pelos autores</w:t>
+              <w:t>Geração dos diagramas de arquitetura, de sequência e de entidade-relacionamento por script Python, a partir da especificação definida pelos autores</w:t>
             </w:r>
           </w:p>
         </w:tc>
@@ -38524,7 +38482,7 @@
                 <w:sz w:val="20"/>
                 <w:szCs w:val="20"/>
               </w:rPr>
-              <w:t xml:space="preserve">20</w:t>
+              <w:t>20</w:t>
             </w:r>
           </w:p>
         </w:tc>
@@ -38647,7 +38605,7 @@
                 <w:sz w:val="20"/>
                 <w:szCs w:val="20"/>
               </w:rPr>
-              <w:t xml:space="preserve">40</w:t>
+              <w:t>40</w:t>
             </w:r>
           </w:p>
         </w:tc>
@@ -38761,7 +38719,7 @@
                 <w:sz w:val="20"/>
                 <w:szCs w:val="20"/>
               </w:rPr>
-              <w:t xml:space="preserve">30</w:t>
+              <w:t>50</w:t>
             </w:r>
           </w:p>
         </w:tc>
@@ -38884,7 +38842,7 @@
                 <w:sz w:val="20"/>
                 <w:szCs w:val="20"/>
               </w:rPr>
-              <w:t xml:space="preserve">50</w:t>
+              <w:t>70</w:t>
             </w:r>
           </w:p>
         </w:tc>
@@ -39004,7 +38962,7 @@
                 <w:sz w:val="20"/>
                 <w:szCs w:val="20"/>
               </w:rPr>
-              <w:t xml:space="preserve">30</w:t>
+              <w:t>40</w:t>
             </w:r>
           </w:p>
         </w:tc>
@@ -39114,7 +39072,16 @@
                 <w:szCs w:val="20"/>
                 <w:lang w:val="pt-BR"/>
               </w:rPr>
-              <w:t>Elaboração dos protocolos e dos programas de avaliação, execução dos experimentos e tabulação dos resultados, com os critérios discutidos e aprovados pelos autores antes de cada execução; busca e conferência de qualidade dos conjuntos de dados públicos</w:t>
+              <w:t xml:space="preserve">Elaboração dos protocolos e dos programas de avaliação, execução dos experimentos e tabulação dos resultados, com os critérios discutidos e </w:t>
+            </w:r>
+            <w:r>
+              <w:rPr>
+                <w:sz w:val="20"/>
+                <w:szCs w:val="20"/>
+                <w:lang w:val="pt-BR"/>
+              </w:rPr>
+              <w:lastRenderedPageBreak/>
+              <w:t>aprovados pelos autores antes de cada execução; busca e conferência de qualidade dos conjuntos de dados públicos</w:t>
             </w:r>
           </w:p>
         </w:tc>
@@ -39134,7 +39101,8 @@
                 <w:sz w:val="20"/>
                 <w:szCs w:val="20"/>
               </w:rPr>
-              <w:t xml:space="preserve">40</w:t>
+              <w:lastRenderedPageBreak/>
+              <w:t>40</w:t>
             </w:r>
           </w:p>
         </w:tc>
@@ -39168,25 +39136,7 @@
         <w:rPr>
           <w:lang w:val="pt-BR"/>
         </w:rPr>
-        <w:t xml:space="preserve">Ambiente de acesso e janela temporal de interação. As requisições aos modelos Claude Opus 5 e Claude Opus 5.5 foram executadas pela interface do aplicativo Claude, com execução de código em ambiente isolado fornecido pela própria </w:t>
-      </w:r>
-      <w:r>
-        <w:rPr>
-          <w:lang w:val="pt-BR"/>
-        </w:rPr>
-        <w:t xml:space="preserve">ferramenta, e pela ferramenta Claude Code, com execução de código no computador dos autores, </w:t>
-      </w:r>
-      <w:r>
-        <w:rPr>
-          <w:lang w:val="pt-BR"/>
-        </w:rPr>
-        <w:t xml:space="preserve">no período de 21/09/2026</w:t>
-      </w:r>
-      <w:r>
-        <w:rPr>
-          <w:lang w:val="pt-BR"/>
-        </w:rPr>
-        <w:t xml:space="preserve"> a ___/___/2026. </w:t>
+        <w:t xml:space="preserve">Ambiente de acesso e janela temporal de interação. As requisições aos modelos Claude Opus 5 e Claude Opus 5.5 foram executadas pela interface do aplicativo Claude, com execução de código em ambiente isolado fornecido pela própria ferramenta, e pela ferramenta Claude Code, com execução de código no computador dos autores, no período de 21/09/2026 a ___/___/2026. </w:t>
       </w:r>
     </w:p>
     <w:p>
@@ -39299,6 +39249,7 @@
         <w:rPr>
           <w:lang w:val="pt-BR"/>
         </w:rPr>
+        <w:lastRenderedPageBreak/>
         <w:t>2. O corpo teórico, a análise crítica, a inferência empírica e as conclusões apresentadas representam o esforço intelectual dos autores humanos, a quem cabe a decisão sobre cada afirmação sustentada no texto.</w:t>
       </w:r>
     </w:p>
@@ -39512,6 +39463,7 @@
         <w:rPr>
           <w:lang w:val="pt-BR"/>
         </w:rPr>
+        <w:lastRenderedPageBreak/>
         <w:t>APÊNDICE B — REPRODUTIBILIDADE DOS RESULTADOS</w:t>
       </w:r>
       <w:bookmarkEnd w:id="76"/>
@@ -39545,19 +39497,7 @@
         <w:rPr>
           <w:lang w:val="pt-BR"/>
         </w:rPr>
-        <w:t xml:space="preserve">Três cuidados sustentam a verificação por terceiros. Cada protocolo de avaliação foi registrado no repositório antes da execução correspondente, e o histórico de versões atesta essa ordem pelos identificadores do </w:t>
-      </w:r>
-      <w:r>
-        <w:rPr>
-          <w:lang w:val="pt-BR"/>
-        </w:rPr>
-        <w:t xml:space="preserve">Quadro 20</w:t>
-      </w:r>
-      <w:r>
-        <w:rPr>
-          <w:lang w:val="pt-BR"/>
-        </w:rPr>
-        <w:t xml:space="preserve">. Os sorteios de cenários e o treino dos modelos usam sementes fixas, de modo que a repetição produz os mesmos valores. Os arquivos de dados públicos não são versionados, pelo tamanho; de cada um registram-se a fonte, a data de extração e o resumo SHA-256 da cópia empregada, nos arquivos extracao.json e zurique_extracao.json da pasta modelo/dados.</w:t>
+        <w:t>Três cuidados sustentam a verificação por terceiros. Cada protocolo de avaliação foi registrado no repositório antes da execução correspondente, e o histórico de versões atesta essa ordem pelos identificadores do Quadro 20. Os sorteios de cenários e o treino dos modelos usam sementes fixas, de modo que a repetição produz os mesmos valores. Os arquivos de dados públicos não são versionados, pelo tamanho; de cada um registram-se a fonte, a data de extração e o resumo SHA-256 da cópia empregada, nos arquivos extracao.json e zurique_extracao.json da pasta modelo/dados.</w:t>
       </w:r>
     </w:p>
     <w:p>
@@ -39573,19 +39513,7 @@
         <w:rPr>
           <w:lang w:val="pt-BR"/>
         </w:rPr>
-        <w:t xml:space="preserve">Os comandos do </w:t>
-      </w:r>
-      <w:r>
-        <w:rPr>
-          <w:lang w:val="pt-BR"/>
-        </w:rPr>
-        <w:t xml:space="preserve">Quadro 20</w:t>
-      </w:r>
-      <w:r>
-        <w:rPr>
-          <w:lang w:val="pt-BR"/>
-        </w:rPr>
-        <w:t xml:space="preserve"> são executados a partir da pasta Codigo, com o banco de dados e o broker iniciados pelo docker compose do repositório e as dependências declaradas em pyproject.toml instaladas. O registro das decisões de projeto e das divergências entre o código e o texto, com data, está no arquivo DIVERGENCIAS_TCC.txt, itens 57 a 61 para o desenho da avaliação de 4.6, itens 65 e 66 para a sessão de bancada, itens 69 e 70 para a troca da série e da base de regras, item 71 para a arquitetura de implantação, item 72 para o teste de sensibilidade da régua e item 73 para a caixa atual e a sessão de bancada de 10 de outubro. Os resultados da bancada dependem do nó físico e do ambiente implantado: o que se reproduz sem eles é o cálculo sobre os registros guardados, e não a medição.</w:t>
+        <w:t>Os comandos do Quadro 20 são executados a partir da pasta Codigo, com o banco de dados e o broker iniciados pelo docker compose do repositório e as dependências declaradas em pyproject.toml instaladas. O registro das decisões de projeto e das divergências entre o código e o texto, com data, está no arquivo DIVERGENCIAS_TCC.txt, itens 57 a 61 para o desenho da avaliação de 4.6, itens 65 e 66 para a sessão de bancada, itens 69 e 70 para a troca da série e da base de regras, item 71 para a arquitetura de implantação, item 72 para o teste de sensibilidade da régua e item 73 para a caixa atual e a sessão de bancada de 10 de outubro. Os resultados da bancada dependem do nó físico e do ambiente implantado: o que se reproduz sem eles é o cálculo sobre os registros guardados, e não a medição.</w:t>
       </w:r>
     </w:p>
     <w:p>
@@ -39602,15 +39530,7 @@
           <w:szCs w:val="20"/>
           <w:lang w:val="pt-BR"/>
         </w:rPr>
-        <w:t xml:space="preserve">Quadro 20</w:t>
-      </w:r>
-      <w:r>
-        <w:rPr>
-          <w:sz w:val="20"/>
-          <w:szCs w:val="20"/>
-          <w:lang w:val="pt-BR"/>
-        </w:rPr>
-        <w:t xml:space="preserve"> – Programas, dados e versões que reproduzem os resultados</w:t>
+        <w:t>Quadro 20 – Programas, dados e versões que reproduzem os resultados</w:t>
       </w:r>
     </w:p>
     <w:tbl>
@@ -39798,31 +39718,7 @@
                 <w:szCs w:val="20"/>
                 <w:lang w:val="pt-BR"/>
               </w:rPr>
-              <w:t xml:space="preserve">python -m modelo.treinar_zurique. Resultado em modelo/resultados/metricas_zurique.json, com a regressão linear e a floresta aleatória. Protocolo </w:t>
-            </w:r>
-            <w:r>
-              <w:rPr>
-                <w:sz w:val="20"/>
-                <w:szCs w:val="20"/>
-                <w:lang w:val="pt-BR"/>
-              </w:rPr>
-              <w:t xml:space="preserve">840800d</w:t>
-            </w:r>
-            <w:r>
-              <w:rPr>
-                <w:sz w:val="20"/>
-                <w:szCs w:val="20"/>
-                <w:lang w:val="pt-BR"/>
-              </w:rPr>
-              <w:t xml:space="preserve">; resultado </w:t>
-            </w:r>
-            <w:r>
-              <w:rPr>
-                <w:sz w:val="20"/>
-                <w:szCs w:val="20"/>
-                <w:lang w:val="pt-BR"/>
-              </w:rPr>
-              <w:t xml:space="preserve">45d1e3c</w:t>
+              <w:t>python -m modelo.treinar_zurique. Resultado em modelo/resultados/metricas_zurique.json, com a regressão linear e a floresta aleatória. Protocolo 840800d; resultado 45d1e3c</w:t>
             </w:r>
           </w:p>
         </w:tc>
@@ -39902,31 +39798,7 @@
                 <w:szCs w:val="20"/>
                 <w:lang w:val="pt-BR"/>
               </w:rPr>
-              <w:t xml:space="preserve">python -m modelo.comparar_modelos. Resultado em modelo/resultados/comparacao_modelos.json. Protocolo </w:t>
-            </w:r>
-            <w:r>
-              <w:rPr>
-                <w:sz w:val="20"/>
-                <w:szCs w:val="20"/>
-                <w:lang w:val="pt-BR"/>
-              </w:rPr>
-              <w:t xml:space="preserve">f6d306c</w:t>
-            </w:r>
-            <w:r>
-              <w:rPr>
-                <w:sz w:val="20"/>
-                <w:szCs w:val="20"/>
-                <w:lang w:val="pt-BR"/>
-              </w:rPr>
-              <w:t xml:space="preserve">; resultado </w:t>
-            </w:r>
-            <w:r>
-              <w:rPr>
-                <w:sz w:val="20"/>
-                <w:szCs w:val="20"/>
-                <w:lang w:val="pt-BR"/>
-              </w:rPr>
-              <w:t xml:space="preserve">7ad1b3c</w:t>
+              <w:t>python -m modelo.comparar_modelos. Resultado em modelo/resultados/comparacao_modelos.json. Protocolo f6d306c; resultado 7ad1b3c</w:t>
             </w:r>
           </w:p>
         </w:tc>
@@ -39954,6 +39826,7 @@
                 <w:szCs w:val="20"/>
                 <w:lang w:val="pt-BR"/>
               </w:rPr>
+              <w:lastRenderedPageBreak/>
               <w:t>3.6 — sensibilidade da régua ao percentil</w:t>
             </w:r>
           </w:p>
@@ -40006,31 +39879,7 @@
                 <w:szCs w:val="20"/>
                 <w:lang w:val="pt-BR"/>
               </w:rPr>
-              <w:t xml:space="preserve">python -m modelo.sensibilidade_percentil. Resultado em modelo/resultados/sensibilidade_percentil.json. Protocolo </w:t>
-            </w:r>
-            <w:r>
-              <w:rPr>
-                <w:sz w:val="20"/>
-                <w:szCs w:val="20"/>
-                <w:lang w:val="pt-BR"/>
-              </w:rPr>
-              <w:t xml:space="preserve">785b245</w:t>
-            </w:r>
-            <w:r>
-              <w:rPr>
-                <w:sz w:val="20"/>
-                <w:szCs w:val="20"/>
-                <w:lang w:val="pt-BR"/>
-              </w:rPr>
-              <w:t xml:space="preserve">; resultado </w:t>
-            </w:r>
-            <w:r>
-              <w:rPr>
-                <w:sz w:val="20"/>
-                <w:szCs w:val="20"/>
-                <w:lang w:val="pt-BR"/>
-              </w:rPr>
-              <w:t xml:space="preserve">0d3928e</w:t>
+              <w:t>python -m modelo.sensibilidade_percentil. Resultado em modelo/resultados/sensibilidade_percentil.json. Protocolo 785b245; resultado 0d3928e</w:t>
             </w:r>
           </w:p>
         </w:tc>
@@ -40105,31 +39954,7 @@
                 <w:szCs w:val="20"/>
                 <w:lang w:val="pt-BR"/>
               </w:rPr>
-              <w:t xml:space="preserve">python -m cenarios.executar --serie, repetido com --reativo e com --degraus; python -m cenarios.aderencia_regimes. Protocolo da arquitetura </w:t>
-            </w:r>
-            <w:r>
-              <w:rPr>
-                <w:sz w:val="20"/>
-                <w:szCs w:val="20"/>
-                <w:lang w:val="pt-BR"/>
-              </w:rPr>
-              <w:t xml:space="preserve">a96f3a8</w:t>
-            </w:r>
-            <w:r>
-              <w:rPr>
-                <w:sz w:val="20"/>
-                <w:szCs w:val="20"/>
-                <w:lang w:val="pt-BR"/>
-              </w:rPr>
-              <w:t xml:space="preserve">; resultado </w:t>
-            </w:r>
-            <w:r>
-              <w:rPr>
-                <w:sz w:val="20"/>
-                <w:szCs w:val="20"/>
-                <w:lang w:val="pt-BR"/>
-              </w:rPr>
-              <w:t xml:space="preserve">afb87b3</w:t>
+              <w:t>python -m cenarios.executar --serie, repetido com --reativo e com --degraus; python -m cenarios.aderencia_regimes. Protocolo da arquitetura a96f3a8; resultado afb87b3</w:t>
             </w:r>
           </w:p>
         </w:tc>
@@ -40157,7 +39982,7 @@
                 <w:szCs w:val="20"/>
                 <w:lang w:val="pt-BR"/>
               </w:rPr>
-              <w:t xml:space="preserve">Tabela 3</w:t>
+              <w:t>Tabela 3</w:t>
             </w:r>
             <w:r>
               <w:rPr>
@@ -40217,63 +40042,7 @@
                 <w:szCs w:val="20"/>
                 <w:lang w:val="pt-BR"/>
               </w:rPr>
-              <w:t xml:space="preserve">python -m cenarios.executar --pasta avaliacao_ia/zurique --serie (e avaliacao_ia/camera), nos modos do protocolo; python -m cenarios.avaliacao_ia.analisar. Protocolo </w:t>
-            </w:r>
-            <w:r>
-              <w:rPr>
-                <w:sz w:val="20"/>
-                <w:szCs w:val="20"/>
-                <w:lang w:val="pt-BR"/>
-              </w:rPr>
-              <w:t xml:space="preserve">f9f3573</w:t>
-            </w:r>
-            <w:r>
-              <w:rPr>
-                <w:sz w:val="20"/>
-                <w:szCs w:val="20"/>
-                <w:lang w:val="pt-BR"/>
-              </w:rPr>
-              <w:t xml:space="preserve">; resultados </w:t>
-            </w:r>
-            <w:r>
-              <w:rPr>
-                <w:sz w:val="20"/>
-                <w:szCs w:val="20"/>
-                <w:lang w:val="pt-BR"/>
-              </w:rPr>
-              <w:t xml:space="preserve">0dcdf09</w:t>
-            </w:r>
-            <w:r>
-              <w:rPr>
-                <w:sz w:val="20"/>
-                <w:szCs w:val="20"/>
-                <w:lang w:val="pt-BR"/>
-              </w:rPr>
-              <w:t xml:space="preserve"> e </w:t>
-            </w:r>
-            <w:r>
-              <w:rPr>
-                <w:sz w:val="20"/>
-                <w:szCs w:val="20"/>
-                <w:lang w:val="pt-BR"/>
-              </w:rPr>
-              <w:t xml:space="preserve">1793bc7</w:t>
-            </w:r>
-            <w:r>
-              <w:rPr>
-                <w:sz w:val="20"/>
-                <w:szCs w:val="20"/>
-                <w:lang w:val="pt-BR"/>
-              </w:rPr>
-              <w:t xml:space="preserve">; resultados vigentes em </w:t>
-            </w:r>
-            <w:r>
-              <w:rPr>
-                <w:sz w:val="20"/>
-                <w:szCs w:val="20"/>
-                <w:lang w:val="pt-BR"/>
-              </w:rPr>
-              <w:t xml:space="preserve">afb87b3</w:t>
+              <w:t>python -m cenarios.executar --pasta avaliacao_ia/zurique --serie (e avaliacao_ia/camera), nos modos do protocolo; python -m cenarios.avaliacao_ia.analisar. Protocolo f9f3573; resultados 0dcdf09 e 1793bc7; resultados vigentes em afb87b3</w:t>
             </w:r>
           </w:p>
         </w:tc>
@@ -40301,7 +40070,7 @@
                 <w:szCs w:val="20"/>
                 <w:lang w:val="pt-BR"/>
               </w:rPr>
-              <w:t xml:space="preserve">Tabela 3</w:t>
+              <w:t>Tabela 3</w:t>
             </w:r>
             <w:r>
               <w:rPr>
@@ -40361,31 +40130,7 @@
                 <w:szCs w:val="20"/>
                 <w:lang w:val="pt-BR"/>
               </w:rPr>
-              <w:t xml:space="preserve">python -m cenarios.avaliacao_ia.deficit. Versão </w:t>
-            </w:r>
-            <w:r>
-              <w:rPr>
-                <w:sz w:val="20"/>
-                <w:szCs w:val="20"/>
-                <w:lang w:val="pt-BR"/>
-              </w:rPr>
-              <w:t xml:space="preserve">1793bc7</w:t>
-            </w:r>
-            <w:r>
-              <w:rPr>
-                <w:sz w:val="20"/>
-                <w:szCs w:val="20"/>
-                <w:lang w:val="pt-BR"/>
-              </w:rPr>
-              <w:t xml:space="preserve">; resultados vigentes em </w:t>
-            </w:r>
-            <w:r>
-              <w:rPr>
-                <w:sz w:val="20"/>
-                <w:szCs w:val="20"/>
-                <w:lang w:val="pt-BR"/>
-              </w:rPr>
-              <w:t xml:space="preserve">afb87b3</w:t>
+              <w:t>python -m cenarios.avaliacao_ia.deficit. Versão 1793bc7; resultados vigentes em afb87b3</w:t>
             </w:r>
           </w:p>
         </w:tc>
@@ -40413,7 +40158,7 @@
                 <w:szCs w:val="20"/>
                 <w:lang w:val="pt-BR"/>
               </w:rPr>
-              <w:t xml:space="preserve">Tabela 3</w:t>
+              <w:t>Tabela 3</w:t>
             </w:r>
             <w:r>
               <w:rPr>
@@ -40468,47 +40213,7 @@
                 <w:szCs w:val="20"/>
                 <w:lang w:val="pt-BR"/>
               </w:rPr>
-              <w:t xml:space="preserve">python -m cenarios.executar --pasta avaliacao_ia/zurique --serie --previsao media-sazonal (e avaliacao_ia/camera); --pasta avaliacao_ia/ruido --serie, com e sem --degraus; python -m cenarios.avaliacao_ia.analisar_substitutos. Protocolo </w:t>
-            </w:r>
-            <w:r>
-              <w:rPr>
-                <w:sz w:val="20"/>
-                <w:szCs w:val="20"/>
-                <w:lang w:val="pt-BR"/>
-              </w:rPr>
-              <w:t xml:space="preserve">b69d78e</w:t>
-            </w:r>
-            <w:r>
-              <w:rPr>
-                <w:sz w:val="20"/>
-                <w:szCs w:val="20"/>
-                <w:lang w:val="pt-BR"/>
-              </w:rPr>
-              <w:t xml:space="preserve">; resultado </w:t>
-            </w:r>
-            <w:r>
-              <w:rPr>
-                <w:sz w:val="20"/>
-                <w:szCs w:val="20"/>
-                <w:lang w:val="pt-BR"/>
-              </w:rPr>
-              <w:t xml:space="preserve">2360a2e</w:t>
-            </w:r>
-            <w:r>
-              <w:rPr>
-                <w:sz w:val="20"/>
-                <w:szCs w:val="20"/>
-                <w:lang w:val="pt-BR"/>
-              </w:rPr>
-              <w:t xml:space="preserve">; resultados vigentes em </w:t>
-            </w:r>
-            <w:r>
-              <w:rPr>
-                <w:sz w:val="20"/>
-                <w:szCs w:val="20"/>
-                <w:lang w:val="pt-BR"/>
-              </w:rPr>
-              <w:t xml:space="preserve">afb87b3</w:t>
+              <w:t>python -m cenarios.executar --pasta avaliacao_ia/zurique --serie --previsao media-sazonal (e avaliacao_ia/camera); --pasta avaliacao_ia/ruido --serie, com e sem --degraus; python -m cenarios.avaliacao_ia.analisar_substitutos. Protocolo b69d78e; resultado 2360a2e; resultados vigentes em afb87b3</w:t>
             </w:r>
           </w:p>
         </w:tc>
@@ -40525,26 +40230,28 @@
             </w:tcMar>
           </w:tcPr>
           <w:p>
-            <w:r>
-              <w:rPr>
-                <w:sz w:val="20"/>
-                <w:szCs w:val="20"/>
-              </w:rPr>
-              <w:t xml:space="preserve">Tabela 4</w:t>
-            </w:r>
-            <w:r>
-              <w:rPr>
-                <w:sz w:val="20"/>
-                <w:szCs w:val="20"/>
-              </w:rPr>
-              <w:t xml:space="preserve"> e </w:t>
-            </w:r>
             <w:proofErr w:type="spellStart"/>
             <w:r>
               <w:rPr>
                 <w:sz w:val="20"/>
                 <w:szCs w:val="20"/>
               </w:rPr>
+              <w:t>Tabela</w:t>
+            </w:r>
+            <w:proofErr w:type="spellEnd"/>
+            <w:r>
+              <w:rPr>
+                <w:sz w:val="20"/>
+                <w:szCs w:val="20"/>
+              </w:rPr>
+              <w:t xml:space="preserve"> 4 e </w:t>
+            </w:r>
+            <w:proofErr w:type="spellStart"/>
+            <w:r>
+              <w:rPr>
+                <w:sz w:val="20"/>
+                <w:szCs w:val="20"/>
+              </w:rPr>
               <w:t>conferências</w:t>
             </w:r>
             <w:proofErr w:type="spellEnd"/>
@@ -40600,47 +40307,7 @@
                 <w:szCs w:val="20"/>
                 <w:lang w:val="pt-BR"/>
               </w:rPr>
-              <w:t xml:space="preserve">python -m modelo.experimento_zurique; python -m modelo.conferencia_zurique. Protocolo </w:t>
-            </w:r>
-            <w:r>
-              <w:rPr>
-                <w:sz w:val="20"/>
-                <w:szCs w:val="20"/>
-                <w:lang w:val="pt-BR"/>
-              </w:rPr>
-              <w:t xml:space="preserve">25a1ef5</w:t>
-            </w:r>
-            <w:r>
-              <w:rPr>
-                <w:sz w:val="20"/>
-                <w:szCs w:val="20"/>
-                <w:lang w:val="pt-BR"/>
-              </w:rPr>
-              <w:t xml:space="preserve">; resultados </w:t>
-            </w:r>
-            <w:r>
-              <w:rPr>
-                <w:sz w:val="20"/>
-                <w:szCs w:val="20"/>
-                <w:lang w:val="pt-BR"/>
-              </w:rPr>
-              <w:t xml:space="preserve">c2a31de</w:t>
-            </w:r>
-            <w:r>
-              <w:rPr>
-                <w:sz w:val="20"/>
-                <w:szCs w:val="20"/>
-                <w:lang w:val="pt-BR"/>
-              </w:rPr>
-              <w:t xml:space="preserve"> e </w:t>
-            </w:r>
-            <w:r>
-              <w:rPr>
-                <w:sz w:val="20"/>
-                <w:szCs w:val="20"/>
-                <w:lang w:val="pt-BR"/>
-              </w:rPr>
-              <w:t xml:space="preserve">e84046f</w:t>
+              <w:t>python -m modelo.experimento_zurique; python -m modelo.conferencia_zurique. Protocolo 25a1ef5; resultados c2a31de e e84046f</w:t>
             </w:r>
           </w:p>
         </w:tc>
@@ -40668,7 +40335,7 @@
                 <w:szCs w:val="20"/>
                 <w:lang w:val="pt-BR"/>
               </w:rPr>
-              <w:t xml:space="preserve">Tabela 3</w:t>
+              <w:t>Tabela 3</w:t>
             </w:r>
             <w:r>
               <w:rPr>
@@ -40723,47 +40390,7 @@
                 <w:szCs w:val="20"/>
                 <w:lang w:val="pt-BR"/>
               </w:rPr>
-              <w:t xml:space="preserve">python -m cenarios.executar --pasta avaliacao_ia/suavidade --serie, repetido com --degraus e com --degraus --histerese 0.05; python -m cenarios.avaliacao_ia.analisar_suavidade. Protocolo </w:t>
-            </w:r>
-            <w:r>
-              <w:rPr>
-                <w:sz w:val="20"/>
-                <w:szCs w:val="20"/>
-                <w:lang w:val="pt-BR"/>
-              </w:rPr>
-              <w:t xml:space="preserve">32debde</w:t>
-            </w:r>
-            <w:r>
-              <w:rPr>
-                <w:sz w:val="20"/>
-                <w:szCs w:val="20"/>
-                <w:lang w:val="pt-BR"/>
-              </w:rPr>
-              <w:t xml:space="preserve">; resultado </w:t>
-            </w:r>
-            <w:r>
-              <w:rPr>
-                <w:sz w:val="20"/>
-                <w:szCs w:val="20"/>
-                <w:lang w:val="pt-BR"/>
-              </w:rPr>
-              <w:t xml:space="preserve">e61c315</w:t>
-            </w:r>
-            <w:r>
-              <w:rPr>
-                <w:sz w:val="20"/>
-                <w:szCs w:val="20"/>
-                <w:lang w:val="pt-BR"/>
-              </w:rPr>
-              <w:t xml:space="preserve">; resultados vigentes em </w:t>
-            </w:r>
-            <w:r>
-              <w:rPr>
-                <w:sz w:val="20"/>
-                <w:szCs w:val="20"/>
-                <w:lang w:val="pt-BR"/>
-              </w:rPr>
-              <w:t xml:space="preserve">afb87b3</w:t>
+              <w:t>python -m cenarios.executar --pasta avaliacao_ia/suavidade --serie, repetido com --degraus e com --degraus --histerese 0.05; python -m cenarios.avaliacao_ia.analisar_suavidade. Protocolo 32debde; resultado e61c315; resultados vigentes em afb87b3</w:t>
             </w:r>
           </w:p>
         </w:tc>
@@ -40838,15 +40465,7 @@
                 <w:szCs w:val="20"/>
                 <w:lang w:val="pt-BR"/>
               </w:rPr>
-              <w:t xml:space="preserve">python -m bancada.calibrar teto; python -m bancada.calibrar completa --vm --comprimento-cm 6. Registro em bancada/resultados/sessao_113.json. Versão </w:t>
-            </w:r>
-            <w:r>
-              <w:rPr>
-                <w:sz w:val="20"/>
-                <w:szCs w:val="20"/>
-                <w:lang w:val="pt-BR"/>
-              </w:rPr>
-              <w:t xml:space="preserve">a63a7ce</w:t>
+              <w:t>python -m bancada.calibrar teto; python -m bancada.calibrar completa --vm --comprimento-cm 6. Registro em bancada/resultados/sessao_113.json. Versão a63a7ce</w:t>
             </w:r>
           </w:p>
         </w:tc>
@@ -40921,31 +40540,7 @@
                 <w:szCs w:val="20"/>
                 <w:lang w:val="pt-BR"/>
               </w:rPr>
-              <w:t xml:space="preserve">python -m bancada.sessao_ct latencia, piso e credencial; CT16 com comandos provocados e python -m bancada.sessao_ct alertas; CT18 com o registro da porta serial. Registros em bancada/resultados/ct*_20261010*. Versões </w:t>
-            </w:r>
-            <w:r>
-              <w:rPr>
-                <w:sz w:val="20"/>
-                <w:szCs w:val="20"/>
-                <w:lang w:val="pt-BR"/>
-              </w:rPr>
-              <w:t xml:space="preserve">1d7b3f7</w:t>
-            </w:r>
-            <w:r>
-              <w:rPr>
-                <w:sz w:val="20"/>
-                <w:szCs w:val="20"/>
-                <w:lang w:val="pt-BR"/>
-              </w:rPr>
-              <w:t xml:space="preserve"> e </w:t>
-            </w:r>
-            <w:r>
-              <w:rPr>
-                <w:sz w:val="20"/>
-                <w:szCs w:val="20"/>
-                <w:lang w:val="pt-BR"/>
-              </w:rPr>
-              <w:t xml:space="preserve">396076b</w:t>
+              <w:t>python -m bancada.sessao_ct latencia, piso e credencial; CT16 com comandos provocados e python -m bancada.sessao_ct alertas; CT18 com o registro da porta serial. Registros em bancada/resultados/ct*_20261010*. Versões 1d7b3f7 e 396076b</w:t>
             </w:r>
           </w:p>
         </w:tc>
@@ -41025,15 +40620,7 @@
                 <w:szCs w:val="20"/>
                 <w:lang w:val="pt-BR"/>
               </w:rPr>
-              <w:t xml:space="preserve">Resultado em bancada/resultados/energia_bancada_rampa_20261010.json. Versão </w:t>
-            </w:r>
-            <w:r>
-              <w:rPr>
-                <w:sz w:val="20"/>
-                <w:szCs w:val="20"/>
-                <w:lang w:val="pt-BR"/>
-              </w:rPr>
-              <w:t xml:space="preserve">1d7b3f7</w:t>
+              <w:t>Resultado em bancada/resultados/energia_bancada_rampa_20261010.json. Versão 1d7b3f7</w:t>
             </w:r>
           </w:p>
         </w:tc>

</xml_diff>